<commit_message>
Add moat ranking; update spec audit to the 15:27 prd-1.md
strategy/moat-ranking.md and .docx rank the six moat sources by how
much each matters and whether it can be built in the next year, and
name brand as the gap. The spec audit now reflects prd-1.md with the
OUT OF SCOPE list back to template text, which reopens the
dependency gaps.

Co-Authored-By: Claude Opus 5.5 <noreply@anthropic.com>
</commit_message>
<xml_diff>
--- a/07_DietGroceryApp/strategy/spec-audit-UPDATED.docx
+++ b/07_DietGroceryApp/strategy/spec-audit-UPDATED.docx
@@ -18,7 +18,7 @@
         <w:t xml:space="preserve">Prepared:</w:t>
       </w:r>
       <w:r>
-        <w:t xml:space="preserve"> October 16, 2026 (written against the 13:10 version of prd-1.md)</w:t>
+        <w:t xml:space="preserve"> October 16, 2026 (written against the 15:27 version of prd-1.md)</w:t>
       </w:r>
     </w:p>
     <w:p>
@@ -38,13 +38,13 @@
         <w:t xml:space="preserve">prd-1.md</w:t>
       </w:r>
       <w:r>
-        <w:t xml:space="preserve"> (its header still reads </w:t>
+        <w:t xml:space="preserve"> (its header now reads </w:t>
       </w:r>
       <w:r>
         <w:rPr>
           <w:rFonts w:ascii="Consolas" w:hAnsi="Consolas"/>
         </w:rPr>
-        <w:t xml:space="preserve">FILE: prd.md</w:t>
+        <w:t xml:space="preserve">FILE: prd-1.md</w:t>
       </w:r>
       <w:r>
         <w:t xml:space="preserve">) and </w:t>
@@ -312,7 +312,7 @@
     </w:p>
     <w:p>
       <w:r>
-        <w:t xml:space="preserve">The PRD has no separate "done means" line for each feature. Each feature is one sentence, and below, that sentence is treated as its "done means." All six features end at a confirmation the user sees. Feature 4 points back to story items (10) through (20) for its content. Several outside providers these features rely on are now listed in OUT OF SCOPE; section 6 covers what that means for each feature.</w:t>
+        <w:t xml:space="preserve">The PRD has no separate "done means" line for each feature. Each feature is one sentence, and below, that sentence is treated as its "done means." All six features end at a confirmation the user sees. Feature 4 points back to story items (10) through (20) for its content.</w:t>
       </w:r>
     </w:p>
     <w:p>
@@ -2644,7 +2644,7 @@
     </w:p>
     <w:p>
       <w:r>
-        <w:t xml:space="preserve">The PRD describes grocery stores and AI agents as "agnostic." It names one outside company, CheapFoodMap, "a third-party app." The list below is what the PRD's features need in order to work. "Could a competitor buy it?" draws on competitors.md wherever it has evidence. Most rows are now covered by an OUT OF SCOPE item: AI agents and grocery stores; the AI model; recipe, nutrition, restaurant, calories-burned and promotion data; the CheapFoodMap agreement; the doctor; workout content and quotes; and platforms (see section 6).</w:t>
+        <w:t xml:space="preserve">The PRD describes grocery stores and AI agents as "agnostic." It names one outside company, CheapFoodMap, "a third-party app." The list below is what the PRD's features need in order to work. "Could a competitor buy it?" draws on competitors.md wherever it has evidence.</w:t>
       </w:r>
     </w:p>
     <w:tbl>
@@ -3957,90 +3957,24 @@
         </w:pBdr>
       </w:pPr>
       <w:r>
-        <w:t xml:space="preserve">• AI agents and grocery stores</w:t>
-      </w:r>
-    </w:p>
-    <w:p>
-      <w:pPr>
-        <w:ind w:left="360"/>
-        <w:pBdr>
-          <w:left w:val="single" w:sz="18" w:space="8" w:color="9AA0A6"/>
-        </w:pBdr>
-      </w:pPr>
-      <w:r>
-        <w:t xml:space="preserve">• AI model is used for recipes and menus</w:t>
-      </w:r>
-    </w:p>
-    <w:p>
-      <w:pPr>
-        <w:ind w:left="360"/>
-        <w:pBdr>
-          <w:left w:val="single" w:sz="18" w:space="8" w:color="9AA0A6"/>
-        </w:pBdr>
-      </w:pPr>
-      <w:r>
-        <w:t xml:space="preserve">• Recipe, nutrition, restaurant, calories-burned and promotion data come from</w:t>
-      </w:r>
-    </w:p>
-    <w:p>
-      <w:pPr>
-        <w:ind w:left="360"/>
-        <w:pBdr>
-          <w:left w:val="single" w:sz="18" w:space="8" w:color="9AA0A6"/>
-        </w:pBdr>
-      </w:pPr>
-      <w:r>
-        <w:t xml:space="preserve">• CheapFoodMap agreement</w:t>
-      </w:r>
-    </w:p>
-    <w:p>
-      <w:pPr>
-        <w:ind w:left="360"/>
-        <w:pBdr>
-          <w:left w:val="single" w:sz="18" w:space="8" w:color="9AA0A6"/>
-        </w:pBdr>
-      </w:pPr>
-      <w:r>
-        <w:t xml:space="preserve">• Doctor</w:t>
-      </w:r>
-    </w:p>
-    <w:p>
-      <w:pPr>
-        <w:ind w:left="360"/>
-        <w:pBdr>
-          <w:left w:val="single" w:sz="18" w:space="8" w:color="9AA0A6"/>
-        </w:pBdr>
-      </w:pPr>
-      <w:r>
-        <w:t xml:space="preserve">• Workout content and quotes come from</w:t>
-      </w:r>
-    </w:p>
-    <w:p>
-      <w:pPr>
-        <w:ind w:left="360"/>
-        <w:pBdr>
-          <w:left w:val="single" w:sz="18" w:space="8" w:color="9AA0A6"/>
-        </w:pBdr>
-      </w:pPr>
-      <w:r>
-        <w:t xml:space="preserve">• Platforms</w:t>
-      </w:r>
-    </w:p>
-    <w:p>
-      <w:pPr>
-        <w:ind w:left="360"/>
-        <w:pBdr>
-          <w:left w:val="single" w:sz="18" w:space="8" w:color="9AA0A6"/>
-        </w:pBdr>
-      </w:pPr>
-      <w:r>
-        <w:t xml:space="preserve">• \*The items in this OUT OF SCOPE list are parked until further notice.</w:t>
-      </w:r>
-    </w:p>
-    <w:p>
-      <w:r>
-        <w:t xml:space="preserve">The list has seven items, plus a note: "The items in this OUT OF SCOPE list are parked until further notice." Each item names an outside provider or source that sections 2 and 5 rely on. The list doesn't say whether an item parks only the choice of provider, or the capability itself. Below, for each item, is what the product can't do while it stays parked, read as parking the capability. Every entry in that column is </w:t>
-      </w:r>
+        <w:t xml:space="preserve">[Everything else you are tempted by. Write it down so you can stop thinking about it.]</w:t>
+      </w:r>
+    </w:p>
+    <w:p>
+      <w:r>
+        <w:t xml:space="preserve">The section holds the template's placeholder text again. The seven parked items in the 13:00–13:10 versions have been removed. </w:t>
+      </w:r>
+      <w:r>
+        <w:rPr>
+          <w:b/>
+        </w:rPr>
+        <w:t xml:space="preserve">Nothing has been ruled out.</w:t>
+      </w:r>
+      <w:r>
+        <w:t xml:space="preserve"> There are no items, so there is nothing the product is barred from doing because of this list.</w:t>
+      </w:r>
+    </w:p>
+    <w:p>
       <w:r>
         <w:rPr>
           <w:b/>
@@ -4048,455 +3982,8 @@
         <w:t xml:space="preserve">[INFERRED]</w:t>
       </w:r>
       <w:r>
-        <w:t xml:space="preserve">.</w:t>
-      </w:r>
-    </w:p>
-    <w:tbl>
-      <w:tblPr>
-        <w:tblW w:w="10080" w:type="dxa"/>
-        <w:tblBorders>
-          <w:top w:val="single" w:sz="4" w:space="0" w:color="C9CCD1"/>
-          <w:left w:val="single" w:sz="4" w:space="0" w:color="C9CCD1"/>
-          <w:bottom w:val="single" w:sz="4" w:space="0" w:color="C9CCD1"/>
-          <w:right w:val="single" w:sz="4" w:space="0" w:color="C9CCD1"/>
-          <w:insideH w:val="single" w:sz="4" w:space="0" w:color="C9CCD1"/>
-          <w:insideV w:val="single" w:sz="4" w:space="0" w:color="C9CCD1"/>
-        </w:tblBorders>
-        <w:tblLayout w:type="fixed"/>
-      </w:tblPr>
-      <w:tblGrid>
-        <w:gridCol w:w="3360"/>
-        <w:gridCol w:w="3360"/>
-        <w:gridCol w:w="3360"/>
-      </w:tblGrid>
-      <w:tr>
-        <w:trPr>
-          <w:tblHeader/>
-        </w:trPr>
-        <w:tc>
-          <w:tcPr>
-            <w:tcW w:w="3360" w:type="dxa"/>
-            <w:shd w:val="clear" w:color="auto" w:fill="EFF1F3"/>
-          </w:tcPr>
-          <w:p>
-            <w:pPr>
-              <w:spacing w:before="40" w:after="40"/>
-            </w:pPr>
-            <w:r>
-              <w:rPr>
-                <w:b/>
-                <w:sz w:val="18"/>
-              </w:rPr>
-              <w:t xml:space="preserve">Parked item</w:t>
-            </w:r>
-          </w:p>
-        </w:tc>
-        <w:tc>
-          <w:tcPr>
-            <w:tcW w:w="3360" w:type="dxa"/>
-            <w:shd w:val="clear" w:color="auto" w:fill="EFF1F3"/>
-          </w:tcPr>
-          <w:p>
-            <w:pPr>
-              <w:spacing w:before="40" w:after="40"/>
-            </w:pPr>
-            <w:r>
-              <w:rPr>
-                <w:b/>
-                <w:sz w:val="18"/>
-              </w:rPr>
-              <w:t xml:space="preserve">What the product can't do while it stays parked </w:t>
-            </w:r>
-            <w:r>
-              <w:rPr>
-                <w:b/>
-                <w:sz w:val="18"/>
-              </w:rPr>
-              <w:t xml:space="preserve">[INFERRED]</w:t>
-            </w:r>
-          </w:p>
-        </w:tc>
-        <w:tc>
-          <w:tcPr>
-            <w:tcW w:w="3360" w:type="dxa"/>
-            <w:shd w:val="clear" w:color="auto" w:fill="EFF1F3"/>
-          </w:tcPr>
-          <w:p>
-            <w:pPr>
-              <w:spacing w:before="40" w:after="40"/>
-            </w:pPr>
-            <w:r>
-              <w:rPr>
-                <w:b/>
-                <w:sz w:val="18"/>
-              </w:rPr>
-              <w:t xml:space="preserve">Where the PRD still describes it as in scope</w:t>
-            </w:r>
-          </w:p>
-        </w:tc>
-      </w:tr>
-      <w:tr>
-        <w:tc>
-          <w:tcPr>
-            <w:tcW w:w="3360" w:type="dxa"/>
-          </w:tcPr>
-          <w:p>
-            <w:pPr>
-              <w:spacing w:before="40" w:after="40"/>
-            </w:pPr>
-            <w:r>
-              <w:rPr>
-                <w:b/>
-                <w:sz w:val="18"/>
-              </w:rPr>
-              <w:t xml:space="preserve">AI agents and grocery stores</w:t>
-            </w:r>
-          </w:p>
-        </w:tc>
-        <w:tc>
-          <w:tcPr>
-            <w:tcW w:w="3360" w:type="dxa"/>
-          </w:tcPr>
-          <w:p>
-            <w:pPr>
-              <w:spacing w:before="40" w:after="40"/>
-            </w:pPr>
-            <w:r>
-              <w:rPr>
-                <w:sz w:val="18"/>
-              </w:rPr>
-              <w:t xml:space="preserve">Fill a grocery cart, order for home delivery or curbside pickup, take payment and address data, or read CheapFoodMap. These are the AI agent's three jobs: "(1) puts together a grocery cart, (2) will take payments, and (3) read CheapFoodMap." Option (1), "purchase the groceries themselves," still leaves the user with "a grocery list and recipe list on the app."</w:t>
-            </w:r>
-          </w:p>
-        </w:tc>
-        <w:tc>
-          <w:tcPr>
-            <w:tcW w:w="3360" w:type="dxa"/>
-          </w:tcPr>
-          <w:p>
-            <w:pPr>
-              <w:spacing w:before="40" w:after="40"/>
-            </w:pPr>
-            <w:r>
-              <w:rPr>
-                <w:sz w:val="18"/>
-              </w:rPr>
-              <w:t xml:space="preserve">USER line ("an AI agent fills the users grocery cart"); story (8), (9); Feature 3 options (2) and (3); DATA WE STORE ("Payment and address data will be taken by the AI agent")</w:t>
-            </w:r>
-          </w:p>
-        </w:tc>
-      </w:tr>
-      <w:tr>
-        <w:tc>
-          <w:tcPr>
-            <w:tcW w:w="3360" w:type="dxa"/>
-          </w:tcPr>
-          <w:p>
-            <w:pPr>
-              <w:spacing w:before="40" w:after="40"/>
-            </w:pPr>
-            <w:r>
-              <w:rPr>
-                <w:b/>
-                <w:sz w:val="18"/>
-              </w:rPr>
-              <w:t xml:space="preserve">AI model is used for recipes and menus</w:t>
-            </w:r>
-          </w:p>
-        </w:tc>
-        <w:tc>
-          <w:tcPr>
-            <w:tcW w:w="3360" w:type="dxa"/>
-          </w:tcPr>
-          <w:p>
-            <w:pPr>
-              <w:spacing w:before="40" w:after="40"/>
-            </w:pPr>
-            <w:r>
-              <w:rPr>
-                <w:sz w:val="18"/>
-              </w:rPr>
-              <w:t xml:space="preserve">Read a menu "online or from a photo" and pick dishes (story 10, 11), and curate recipes, if those depend on an AI model. The PRD itself doesn't say either one needs a model.</w:t>
-            </w:r>
-          </w:p>
-        </w:tc>
-        <w:tc>
-          <w:tcPr>
-            <w:tcW w:w="3360" w:type="dxa"/>
-          </w:tcPr>
-          <w:p>
-            <w:pPr>
-              <w:spacing w:before="40" w:after="40"/>
-            </w:pPr>
-            <w:r>
-              <w:rPr>
-                <w:sz w:val="18"/>
-              </w:rPr>
-              <w:t xml:space="preserve">Story (7), (10), (11); Feature 2; Feature 3 ("The app then curates")</w:t>
-            </w:r>
-          </w:p>
-        </w:tc>
-      </w:tr>
-      <w:tr>
-        <w:tc>
-          <w:tcPr>
-            <w:tcW w:w="3360" w:type="dxa"/>
-          </w:tcPr>
-          <w:p>
-            <w:pPr>
-              <w:spacing w:before="40" w:after="40"/>
-            </w:pPr>
-            <w:r>
-              <w:rPr>
-                <w:b/>
-                <w:sz w:val="18"/>
-              </w:rPr>
-              <w:t xml:space="preserve">Recipe, nutrition, restaurant, calories-burned and promotion data come from</w:t>
-            </w:r>
-          </w:p>
-        </w:tc>
-        <w:tc>
-          <w:tcPr>
-            <w:tcW w:w="3360" w:type="dxa"/>
-          </w:tcPr>
-          <w:p>
-            <w:pPr>
-              <w:spacing w:before="40" w:after="40"/>
-            </w:pPr>
-            <w:r>
-              <w:rPr>
-                <w:sz w:val="18"/>
-              </w:rPr>
-              <w:t xml:space="preserve">Offer recipes (Feature 2), output "daily nutritional requirements" (story 3), pick restaurant dishes "to meet the user's nutrition targets" (story 10, 11), recommend "meals under $10" (story 13), work out "calories burned" (workout plan), or recommend "grocery sales, discounts and promos" (story 12). Each needs a data source.</w:t>
-            </w:r>
-          </w:p>
-        </w:tc>
-        <w:tc>
-          <w:tcPr>
-            <w:tcW w:w="3360" w:type="dxa"/>
-          </w:tcPr>
-          <w:p>
-            <w:pPr>
-              <w:spacing w:before="40" w:after="40"/>
-            </w:pPr>
-            <w:r>
-              <w:rPr>
-                <w:sz w:val="18"/>
-              </w:rPr>
-              <w:t xml:space="preserve">Features 2, 4 and 6; story (3), (7), (10)–(13), (15)</w:t>
-            </w:r>
-          </w:p>
-        </w:tc>
-      </w:tr>
-      <w:tr>
-        <w:tc>
-          <w:tcPr>
-            <w:tcW w:w="3360" w:type="dxa"/>
-          </w:tcPr>
-          <w:p>
-            <w:pPr>
-              <w:spacing w:before="40" w:after="40"/>
-            </w:pPr>
-            <w:r>
-              <w:rPr>
-                <w:b/>
-                <w:sz w:val="18"/>
-              </w:rPr>
-              <w:t xml:space="preserve">CheapFoodMap agreement</w:t>
-            </w:r>
-          </w:p>
-        </w:tc>
-        <w:tc>
-          <w:tcPr>
-            <w:tcW w:w="3360" w:type="dxa"/>
-          </w:tcPr>
-          <w:p>
-            <w:pPr>
-              <w:spacing w:before="40" w:after="40"/>
-            </w:pPr>
-            <w:r>
-              <w:rPr>
-                <w:sz w:val="18"/>
-              </w:rPr>
-              <w:t xml:space="preserve">Recommend food under $10 "via CheapFoodMap app" (story 13), if reading CheapFoodMap needs an agreement. The PRD doesn't say whether it does.</w:t>
-            </w:r>
-          </w:p>
-        </w:tc>
-        <w:tc>
-          <w:tcPr>
-            <w:tcW w:w="3360" w:type="dxa"/>
-          </w:tcPr>
-          <w:p>
-            <w:pPr>
-              <w:spacing w:before="40" w:after="40"/>
-            </w:pPr>
-            <w:r>
-              <w:rPr>
-                <w:sz w:val="18"/>
-              </w:rPr>
-              <w:t xml:space="preserve">Story (13); "the AI agent will read that CheapFoodMap recommendation of food under $10"</w:t>
-            </w:r>
-          </w:p>
-        </w:tc>
-      </w:tr>
-      <w:tr>
-        <w:tc>
-          <w:tcPr>
-            <w:tcW w:w="3360" w:type="dxa"/>
-          </w:tcPr>
-          <w:p>
-            <w:pPr>
-              <w:spacing w:before="40" w:after="40"/>
-            </w:pPr>
-            <w:r>
-              <w:rPr>
-                <w:b/>
-                <w:sz w:val="18"/>
-              </w:rPr>
-              <w:t xml:space="preserve">Doctor</w:t>
-            </w:r>
-          </w:p>
-        </w:tc>
-        <w:tc>
-          <w:tcPr>
-            <w:tcW w:w="3360" w:type="dxa"/>
-          </w:tcPr>
-          <w:p>
-            <w:pPr>
-              <w:spacing w:before="40" w:after="40"/>
-            </w:pPr>
-            <w:r>
-              <w:rPr>
-                <w:sz w:val="18"/>
-              </w:rPr>
-              <w:t xml:space="preserve">List a longevity doctor's contact information, so story (19) has no doctor to connect the user to. The User Health Report (Feature 6) can still be exported and printed or emailed.</w:t>
-            </w:r>
-          </w:p>
-        </w:tc>
-        <w:tc>
-          <w:tcPr>
-            <w:tcW w:w="3360" w:type="dxa"/>
-          </w:tcPr>
-          <w:p>
-            <w:pPr>
-              <w:spacing w:before="40" w:after="40"/>
-            </w:pPr>
-            <w:r>
-              <w:rPr>
-                <w:sz w:val="18"/>
-              </w:rPr>
-              <w:t xml:space="preserve">Story (19), (22); Feature 4 ("access a longevity doctor"); the doctor paragraph (booking hours, "will pay that doctor separately"); DATA WE STORE ("in connection with their longevity doctor")</w:t>
-            </w:r>
-          </w:p>
-        </w:tc>
-      </w:tr>
-      <w:tr>
-        <w:tc>
-          <w:tcPr>
-            <w:tcW w:w="3360" w:type="dxa"/>
-          </w:tcPr>
-          <w:p>
-            <w:pPr>
-              <w:spacing w:before="40" w:after="40"/>
-            </w:pPr>
-            <w:r>
-              <w:rPr>
-                <w:b/>
-                <w:sz w:val="18"/>
-              </w:rPr>
-              <w:t xml:space="preserve">Workout content and quotes come from</w:t>
-            </w:r>
-          </w:p>
-        </w:tc>
-        <w:tc>
-          <w:tcPr>
-            <w:tcW w:w="3360" w:type="dxa"/>
-          </w:tcPr>
-          <w:p>
-            <w:pPr>
-              <w:spacing w:before="40" w:after="40"/>
-            </w:pPr>
-            <w:r>
-              <w:rPr>
-                <w:sz w:val="18"/>
-              </w:rPr>
-              <w:t xml:space="preserve">Educate the user "on how to work out" (story 14) or show "positive quotes" (story 18).</w:t>
-            </w:r>
-          </w:p>
-        </w:tc>
-        <w:tc>
-          <w:tcPr>
-            <w:tcW w:w="3360" w:type="dxa"/>
-          </w:tcPr>
-          <w:p>
-            <w:pPr>
-              <w:spacing w:before="40" w:after="40"/>
-            </w:pPr>
-            <w:r>
-              <w:rPr>
-                <w:sz w:val="18"/>
-              </w:rPr>
-              <w:t xml:space="preserve">Story (14), (18); Feature 4 ("receive motivation")</w:t>
-            </w:r>
-          </w:p>
-        </w:tc>
-      </w:tr>
-      <w:tr>
-        <w:tc>
-          <w:tcPr>
-            <w:tcW w:w="3360" w:type="dxa"/>
-          </w:tcPr>
-          <w:p>
-            <w:pPr>
-              <w:spacing w:before="40" w:after="40"/>
-            </w:pPr>
-            <w:r>
-              <w:rPr>
-                <w:b/>
-                <w:sz w:val="18"/>
-              </w:rPr>
-              <w:t xml:space="preserve">Platforms</w:t>
-            </w:r>
-          </w:p>
-        </w:tc>
-        <w:tc>
-          <w:tcPr>
-            <w:tcW w:w="3360" w:type="dxa"/>
-          </w:tcPr>
-          <w:p>
-            <w:pPr>
-              <w:spacing w:before="40" w:after="40"/>
-            </w:pPr>
-            <w:r>
-              <w:rPr>
-                <w:sz w:val="18"/>
-              </w:rPr>
-              <w:t xml:space="preserve">Name the devices the app runs on. No platform is committed. Feature 6's printing and email depend on the device.</w:t>
-            </w:r>
-          </w:p>
-        </w:tc>
-        <w:tc>
-          <w:tcPr>
-            <w:tcW w:w="3360" w:type="dxa"/>
-          </w:tcPr>
-          <w:p>
-            <w:pPr>
-              <w:spacing w:before="40" w:after="40"/>
-            </w:pPr>
-            <w:r>
-              <w:rPr>
-                <w:sz w:val="18"/>
-              </w:rPr>
-              <w:t xml:space="preserve">"the app" throughout; Feature 6 ("print it to their local printer or emailing")</w:t>
-            </w:r>
-          </w:p>
-        </w:tc>
-      </w:tr>
-    </w:tbl>
-    <w:p>
-      <w:pPr>
-        <w:spacing w:after="0"/>
-      </w:pPr>
+        <w:t xml:space="preserve"> Features 1–3 cover story (1) through (9). Feature 1 also collects the workout plan (16). Feature 4 names "(#10 to #20)," Feature 5 repeats story (21), and Feature 6 matches story (22). As written, every story item is in scope.</w:t>
+      </w:r>
     </w:p>
     <w:p>
       <w:r>
@@ -4506,7 +3993,7 @@
         <w:t xml:space="preserve">[INFERRED]</w:t>
       </w:r>
       <w:r>
-        <w:t xml:space="preserve"> Every feature line is unchanged from the previous version. Features 2–6 still describe the capabilities these seven items cover.</w:t>
+        <w:t xml:space="preserve"> One item is put off in the PRD text, not in the list: the doctor's contact information ("will be provided later"). Until it's provided, story (19) has no doctor to contact.</w:t>
       </w:r>
     </w:p>
     <w:p>
@@ -4632,15 +4119,7 @@
         </w:numPr>
       </w:pPr>
       <w:r>
-        <w:t xml:space="preserve">None beyond the seven items now listed in OUT OF SCOPE. Which AI agents, stores, models, data sources, CheapFoodMap terms, doctor, workout and quote sources, and platforms are all parked there rather than answered.</w:t>
-      </w:r>
-    </w:p>
-    <w:p>
-      <w:r>
-        <w:rPr>
-          <w:b/>
-        </w:rPr>
-        <w:t xml:space="preserve">What we ruled out (6)</w:t>
+        <w:t xml:space="preserve">Which AI agents, and which grocery stores they reach.</w:t>
       </w:r>
     </w:p>
     <w:p>
@@ -4651,7 +4130,7 @@
         </w:numPr>
       </w:pPr>
       <w:r>
-        <w:t xml:space="preserve">Whether each OUT OF SCOPE item parks only the choice of provider, or the capability itself.</w:t>
+        <w:t xml:space="preserve">Whether the app uses an AI model for recipe curation and menu reading, and which one.</w:t>
       </w:r>
     </w:p>
     <w:p>
@@ -4662,7 +4141,7 @@
         </w:numPr>
       </w:pPr>
       <w:r>
-        <w:t xml:space="preserve">What Features 2–6 do while those items stay parked. The feature lines still describe AI-agent ordering, menu reading, recipes and nutrition outputs, CheapFoodMap recommendations, doctor access, workout education, quotes and printing or email.</w:t>
+        <w:t xml:space="preserve">Where recipes, nutrition reference data, restaurant nutrition data and calories-burned data come from.</w:t>
       </w:r>
     </w:p>
     <w:p>
@@ -4673,7 +4152,70 @@
         </w:numPr>
       </w:pPr>
       <w:r>
-        <w:t xml:space="preserve">When the parked items come back. The list says only "until further notice."</w:t>
+        <w:t xml:space="preserve">Where grocery sales, discount and promo data comes from.</w:t>
+      </w:r>
+    </w:p>
+    <w:p>
+      <w:pPr>
+        <w:numPr>
+          <w:ilvl w:val="0"/>
+          <w:numId w:val="1"/>
+        </w:numPr>
+      </w:pPr>
+      <w:r>
+        <w:t xml:space="preserve">Whether HushPlate has an agreement or data feed with CheapFoodMap.</w:t>
+      </w:r>
+    </w:p>
+    <w:p>
+      <w:pPr>
+        <w:numPr>
+          <w:ilvl w:val="0"/>
+          <w:numId w:val="1"/>
+        </w:numPr>
+      </w:pPr>
+      <w:r>
+        <w:t xml:space="preserve">Which longevity doctor. The contact information "will be provided later."</w:t>
+      </w:r>
+    </w:p>
+    <w:p>
+      <w:pPr>
+        <w:numPr>
+          <w:ilvl w:val="0"/>
+          <w:numId w:val="1"/>
+        </w:numPr>
+      </w:pPr>
+      <w:r>
+        <w:t xml:space="preserve">Where workout content and motivational quotes come from.</w:t>
+      </w:r>
+    </w:p>
+    <w:p>
+      <w:pPr>
+        <w:numPr>
+          <w:ilvl w:val="0"/>
+          <w:numId w:val="1"/>
+        </w:numPr>
+      </w:pPr>
+      <w:r>
+        <w:t xml:space="preserve">Which platforms the app ships on.</w:t>
+      </w:r>
+    </w:p>
+    <w:p>
+      <w:r>
+        <w:rPr>
+          <w:b/>
+        </w:rPr>
+        <w:t xml:space="preserve">What we ruled out (6)</w:t>
+      </w:r>
+    </w:p>
+    <w:p>
+      <w:pPr>
+        <w:numPr>
+          <w:ilvl w:val="0"/>
+          <w:numId w:val="1"/>
+        </w:numPr>
+      </w:pPr>
+      <w:r>
+        <w:t xml:space="preserve">The entire out-of-scope list. It is template text again.</w:t>
       </w:r>
     </w:p>
     <w:sectPr>

</xml_diff>

<commit_message>
Add prd-2.md and its spec audit (Markdown and Word)
strategy/spec-audit-UPDATED.md audits prd-2.md: new "When to eat" item,
Family and Friends groups, the Daily Health Score and Feature 7, and the
permanent "Inventory" out-of-scope item. spec-audit-UPDATED.docx now
holds this audit instead of the prd-1.md one (still in spec-audit-1.md).

Co-Authored-By: Claude Opus 5.5 <noreply@anthropic.com>
</commit_message>
<xml_diff>
--- a/07_DietGroceryApp/strategy/spec-audit-UPDATED.docx
+++ b/07_DietGroceryApp/strategy/spec-audit-UPDATED.docx
@@ -7,7 +7,7 @@
         <w:pStyle w:val="Title"/>
       </w:pPr>
       <w:r>
-        <w:t xml:space="preserve">Spec Audit: What prd-1.md Commits HushPlate To</w:t>
+        <w:t xml:space="preserve">Spec Audit: What prd-2.md Commits HushPlate To</w:t>
       </w:r>
     </w:p>
     <w:p>
@@ -18,7 +18,7 @@
         <w:t xml:space="preserve">Prepared:</w:t>
       </w:r>
       <w:r>
-        <w:t xml:space="preserve"> October 16, 2026 (written against the 15:27 version of prd-1.md)</w:t>
+        <w:t xml:space="preserve"> October 20, 2026 (written against the 15:39 version of prd-2.md)</w:t>
       </w:r>
     </w:p>
     <w:p>
@@ -35,19 +35,10 @@
         <w:rPr>
           <w:rFonts w:ascii="Consolas" w:hAnsi="Consolas"/>
         </w:rPr>
-        <w:t xml:space="preserve">prd-1.md</w:t>
-      </w:r>
-      <w:r>
-        <w:t xml:space="preserve"> (its header now reads </w:t>
-      </w:r>
-      <w:r>
-        <w:rPr>
-          <w:rFonts w:ascii="Consolas" w:hAnsi="Consolas"/>
-        </w:rPr>
-        <w:t xml:space="preserve">FILE: prd-1.md</w:t>
-      </w:r>
-      <w:r>
-        <w:t xml:space="preserve">) and </w:t>
+        <w:t xml:space="preserve">prd-2.md</w:t>
+      </w:r>
+      <w:r>
+        <w:t xml:space="preserve"> and </w:t>
       </w:r>
       <w:hyperlink r:id="rHl1">
         <w:r>
@@ -69,7 +60,7 @@
         <w:t xml:space="preserve">Method:</w:t>
       </w:r>
       <w:r>
-        <w:t xml:space="preserve"> This is a description, not a recommendation. Quotes are from prd-1.md unless marked otherwise. Anything worked out rather than read is marked </w:t>
+        <w:t xml:space="preserve"> This is a description, not a recommendation. Quotes are from prd-2.md unless marked otherwise. Anything worked out rather than read is marked </w:t>
       </w:r>
       <w:r>
         <w:rPr>
@@ -78,7 +69,75 @@
         <w:t xml:space="preserve">[INFERRED]</w:t>
       </w:r>
       <w:r>
-        <w:t xml:space="preserve">. The core user story's numbered items are cited as "story (n)," using this version's numbering of (1) to (22).</w:t>
+        <w:t xml:space="preserve">. The core user story's numbered items are cited as "story (n)," using this version's numbering of (1) to (24).</w:t>
+      </w:r>
+    </w:p>
+    <w:p>
+      <w:r>
+        <w:rPr>
+          <w:b/>
+        </w:rPr>
+        <w:t xml:space="preserve">What changed since prd-1.md:</w:t>
+      </w:r>
+    </w:p>
+    <w:p>
+      <w:pPr>
+        <w:numPr>
+          <w:ilvl w:val="0"/>
+          <w:numId w:val="1"/>
+        </w:numPr>
+      </w:pPr>
+      <w:r>
+        <w:t xml:space="preserve">New story item (10), "When to eat."</w:t>
+      </w:r>
+    </w:p>
+    <w:p>
+      <w:pPr>
+        <w:numPr>
+          <w:ilvl w:val="0"/>
+          <w:numId w:val="1"/>
+        </w:numPr>
+      </w:pPr>
+      <w:r>
+        <w:t xml:space="preserve">New story item (24), "Family and Friends."</w:t>
+      </w:r>
+    </w:p>
+    <w:p>
+      <w:pPr>
+        <w:numPr>
+          <w:ilvl w:val="0"/>
+          <w:numId w:val="1"/>
+        </w:numPr>
+      </w:pPr>
+      <w:r>
+        <w:t xml:space="preserve">A new Daily Health Score.</w:t>
+      </w:r>
+    </w:p>
+    <w:p>
+      <w:pPr>
+        <w:numPr>
+          <w:ilvl w:val="0"/>
+          <w:numId w:val="1"/>
+        </w:numPr>
+      </w:pPr>
+      <w:r>
+        <w:t xml:space="preserve">A new Feature 7.</w:t>
+      </w:r>
+    </w:p>
+    <w:p>
+      <w:pPr>
+        <w:numPr>
+          <w:ilvl w:val="0"/>
+          <w:numId w:val="1"/>
+        </w:numPr>
+      </w:pPr>
+      <w:r>
+        <w:t xml:space="preserve">An out-of-scope list with one permanent item, "Inventory."</w:t>
+      </w:r>
+    </w:p>
+    <w:p>
+      <w:r>
+        <w:t xml:space="preserve">Story items from (10) onward have moved down one number, and the feature lines and DATA WE STORE use the new numbers.</w:t>
       </w:r>
     </w:p>
     <w:p>
@@ -101,7 +160,7 @@
         <w:rPr>
           <w:b/>
         </w:rPr>
-        <w:t xml:space="preserve">What prd-1.md says:</w:t>
+        <w:t xml:space="preserve">What prd-2.md says:</w:t>
       </w:r>
     </w:p>
     <w:p>
@@ -123,7 +182,7 @@
         <w:t xml:space="preserve">One group or a broad category?</w:t>
       </w:r>
       <w:r>
-        <w:t xml:space="preserve"> A broad category. The USER line now sets two limits, "above the age of 18" and "located in the United States." Inside those limits it covers four different goals ("lose weight, maintain weight, gain muscle, and/or prolong their life") and names several groups by their own labels. Going only by the PRD, it includes:</w:t>
+        <w:t xml:space="preserve"> A broad category. The USER line sets two limits, "above the age of 18" and "located in the United States." Inside those limits it covers four different goals ("lose weight, maintain weight, gain muscle, and/or prolong their life") and names several groups by their own labels. Going only by the PRD, it includes:</w:t>
       </w:r>
     </w:p>
     <w:p>
@@ -191,7 +250,7 @@
         <w:t xml:space="preserve">Muscle gainers:</w:t>
       </w:r>
       <w:r>
-        <w:t xml:space="preserve"> people who want to "gain muscle." Story (14), (15) and (16) add workout education, tracking and a workout plan, including "free weights."</w:t>
+        <w:t xml:space="preserve"> people who want to "gain muscle." Story (15), (16) and (17) add workout education, tracking and a workout plan, including "free weights."</w:t>
       </w:r>
     </w:p>
     <w:p>
@@ -208,7 +267,7 @@
         <w:t xml:space="preserve">Longevity seekers:</w:t>
       </w:r>
       <w:r>
-        <w:t xml:space="preserve"> people who want to "prolong their life," with "Longevity" as a diet choice, story (19) "Access to a longevity doctor," and story (22) a "User Health Report" for that doctor.</w:t>
+        <w:t xml:space="preserve"> people who want to "prolong their life," with "Longevity" as a diet choice, story (20) "Access to a longevity doctor," and story (23) a "User Health Report" for that doctor.</w:t>
       </w:r>
     </w:p>
     <w:p>
@@ -242,7 +301,7 @@
         <w:t xml:space="preserve">Restaurant and fast-food eaters:</w:t>
       </w:r>
       <w:r>
-        <w:t xml:space="preserve"> the USER line now includes them: "the user can choose a healthy food choice from a restaurant on the days the user does not want to cook food." Also story (10), (11), (13) and Feature 4 ("eat out at restaurants (or fast food)").</w:t>
+        <w:t xml:space="preserve"> the USER line covers "a healthy food choice from a restaurant on the days the user does not want to cook food." Also story (11), (12), (14) and Feature 4 ("eat out at restaurants (or fast food)").</w:t>
       </w:r>
     </w:p>
     <w:p>
@@ -259,7 +318,7 @@
         <w:t xml:space="preserve">Budget eaters:</w:t>
       </w:r>
       <w:r>
-        <w:t xml:space="preserve"> story (13) recommends "meals under $10," and story (12) recommends "grocery sales, discounts and promos."</w:t>
+        <w:t xml:space="preserve"> story (14) recommends "meals under $10," and story (13) recommends "grocery sales, discounts and promos."</w:t>
       </w:r>
     </w:p>
     <w:p>
@@ -280,8 +339,25 @@
       </w:r>
     </w:p>
     <w:p>
-      <w:r>
-        <w:t xml:space="preserve">The USER line describes a cart filled "with food for those recipes, which the user will approve the final purchase of," with restaurant meals on days the user "does not want to cook." Feature 3 also serves users who don't order through the app (option 1), so online grocery ordering isn't required.</w:t>
+      <w:pPr>
+        <w:numPr>
+          <w:ilvl w:val="0"/>
+          <w:numId w:val="1"/>
+        </w:numPr>
+      </w:pPr>
+      <w:r>
+        <w:rPr>
+          <w:b/>
+        </w:rPr>
+        <w:t xml:space="preserve">People who want accountability with family or friends:</w:t>
+      </w:r>
+      <w:r>
+        <w:t xml:space="preserve"> story (24) lets the user "create a family group and/or friend group for accountability."</w:t>
+      </w:r>
+    </w:p>
+    <w:p>
+      <w:r>
+        <w:t xml:space="preserve">The USER line describes a cart filled "with food for those recipes, which the user will approve the final purchase of." Feature 3 also serves users who don't order through the app (option 1), so online grocery ordering isn't required.</w:t>
       </w:r>
     </w:p>
     <w:p>
@@ -292,7 +368,7 @@
         <w:t xml:space="preserve">[INFERRED]</w:t>
       </w:r>
       <w:r>
-        <w:t xml:space="preserve"> competitors.md shows these groups being served as separate customers by separate companies: "Mass-market calorie counters" (MyFitnessPal), "Serious lifters, macro-literate users" (MacroFactor), "Busy families who want dinner solved" (eMeals), "Spanish-speaking + US budget-conscious trackers" (Fitia), "Gym-goers who batch-cook" (MealPrepPro), "Macro-target dieters who don't want to log" (Eat This Much). Each would fit inside "a longevity and lifestyle eater." competitors.md puts GLP-1 users alone at "31M US adults."</w:t>
+        <w:t xml:space="preserve"> competitors.md shows these groups being served as separate customers by separate companies: "Mass-market calorie counters" (MyFitnessPal), "Serious lifters, macro-literate users" (MacroFactor), "Busy families who want dinner solved" (eMeals), "Spanish-speaking + US budget-conscious trackers" (Fitia), "Gym-goers who batch-cook" (MealPrepPro), "Macro-target dieters who don't want to log" (Eat This Much). Each would fit inside "a longevity eater." competitors.md puts GLP-1 users alone at "31M US adults."</w:t>
       </w:r>
     </w:p>
     <w:p>
@@ -312,7 +388,7 @@
     </w:p>
     <w:p>
       <w:r>
-        <w:t xml:space="preserve">The PRD has no separate "done means" line for each feature. Each feature is one sentence, and below, that sentence is treated as its "done means." All six features end at a confirmation the user sees. Feature 4 points back to story items (10) through (20) for its content.</w:t>
+        <w:t xml:space="preserve">The PRD has no separate "done means" line for each feature. Each feature is one sentence, and below, that sentence is treated as its "done means." All seven features end at a confirmation the user sees. Feature 4 points back to story items (10) through (21) for its content.</w:t>
       </w:r>
     </w:p>
     <w:p>
@@ -520,7 +596,7 @@
               <w:rPr>
                 <w:sz w:val="18"/>
               </w:rPr>
-              <w:t xml:space="preserve">Picks a diet goal from story (1) and a diet choice from the 16 in story (2). Feature 5 adds recommendations the user "can use ... to make choices in #1 to #18."</w:t>
+              <w:t xml:space="preserve">Picks a diet goal from story (1) and a diet choice from the 16 in story (2). Feature 5 adds recommendations the user "can use ... to make choices in #1 to #19."</w:t>
             </w:r>
           </w:p>
         </w:tc>
@@ -617,7 +693,7 @@
               <w:rPr>
                 <w:sz w:val="18"/>
               </w:rPr>
-              <w:t xml:space="preserve">Enters a workout plan. Story (16): "input their daily workouts that they plan to do each day, when inputting their health statistics." The user sets "the number of time they plan to spend on that activity as part of the initial survey," and the app "will ask the length of time for the cardiovascular work, and the free weight work."</w:t>
+              <w:t xml:space="preserve">Enters a workout plan. Story (17): "input their daily workouts that they plan to do each day, when inputting their health statistics." The user sets "the number of time they plan to spend on that activity as part of the initial survey," and the app "will ask the length of time for the cardiovascular work, and the free weight work."</w:t>
             </w:r>
           </w:p>
         </w:tc>
@@ -805,7 +881,7 @@
               <w:rPr>
                 <w:sz w:val="18"/>
               </w:rPr>
-              <w:t xml:space="preserve"> Cooks the meals. Story (20) confirms afterward that the user "cooked and ate their food," but the cooking itself is the user's.</w:t>
+              <w:t xml:space="preserve"> Cooks the meals. Story (21) confirms afterward that the user "cooked and ate their food," but the cooking itself is the user's.</w:t>
             </w:r>
           </w:p>
         </w:tc>
@@ -846,7 +922,7 @@
               <w:rPr>
                 <w:sz w:val="18"/>
               </w:rPr>
-              <w:t xml:space="preserve"> Drinks the recommended water. The PRD outputs a water figure, but the story (20) audit doesn't mention water.</w:t>
+              <w:t xml:space="preserve"> Drinks the recommended water. The PRD outputs a water figure, but the story (21) audit doesn't mention water.</w:t>
             </w:r>
           </w:p>
         </w:tc>
@@ -1158,7 +1234,7 @@
         <w:pStyle w:val="Heading2"/>
       </w:pPr>
       <w:r>
-        <w:t xml:space="preserve">Feature 4: "App has other features listed in the core user story (#10 to #20) so the longevity eater can have a functional app that allows them to eat out at restaurants (or fast food), or track workouts, or receive motivation, or access a longevity doctor, or have end of day daily confirmation audit, and the user sees confirmation message to confirm their final choice for each of these features."</w:t>
+        <w:t xml:space="preserve">Feature 4: "App has other features listed in the core user story (#10 to #21) so the longevity eater can have a functional app that allows them to eat out at restaurants (or fast food), or track workouts, or receive motivation, or access a longevity doctor, or have end of day daily confirmation audit, and the user sees confirmation message to confirm their final choice for each of these features."</w:t>
       </w:r>
     </w:p>
     <w:tbl>
@@ -1251,7 +1327,70 @@
               <w:rPr>
                 <w:sz w:val="18"/>
               </w:rPr>
-              <w:t xml:space="preserve">(10) Restaurant eating</w:t>
+              <w:t xml:space="preserve">(10) When to eat</w:t>
+            </w:r>
+          </w:p>
+        </w:tc>
+        <w:tc>
+          <w:tcPr>
+            <w:tcW w:w="3360" w:type="dxa"/>
+          </w:tcPr>
+          <w:p>
+            <w:pPr>
+              <w:spacing w:before="40" w:after="40"/>
+            </w:pPr>
+            <w:r>
+              <w:rPr>
+                <w:sz w:val="18"/>
+              </w:rPr>
+              <w:t xml:space="preserve">"the app will let the user know when to eat the appropriate food amounts throughout the day according to the recipes selected by the user"</w:t>
+            </w:r>
+          </w:p>
+        </w:tc>
+        <w:tc>
+          <w:tcPr>
+            <w:tcW w:w="3360" w:type="dxa"/>
+          </w:tcPr>
+          <w:p>
+            <w:pPr>
+              <w:spacing w:before="40" w:after="40"/>
+            </w:pPr>
+            <w:r>
+              <w:rPr>
+                <w:sz w:val="18"/>
+              </w:rPr>
+              <w:t xml:space="preserve">Eats at those times. </w:t>
+            </w:r>
+            <w:r>
+              <w:rPr>
+                <w:b/>
+                <w:sz w:val="18"/>
+              </w:rPr>
+              <w:t xml:space="preserve">[INFERRED]</w:t>
+            </w:r>
+            <w:r>
+              <w:rPr>
+                <w:sz w:val="18"/>
+              </w:rPr>
+              <w:t xml:space="preserve"> The PRD doesn't say how the user is told (an alert, or a screen they check).</w:t>
+            </w:r>
+          </w:p>
+        </w:tc>
+      </w:tr>
+      <w:tr>
+        <w:tc>
+          <w:tcPr>
+            <w:tcW w:w="3360" w:type="dxa"/>
+          </w:tcPr>
+          <w:p>
+            <w:pPr>
+              <w:spacing w:before="40" w:after="40"/>
+            </w:pPr>
+            <w:r>
+              <w:rPr>
+                <w:sz w:val="18"/>
+              </w:rPr>
+              <w:t xml:space="preserve">(11) Restaurant eating</w:t>
             </w:r>
           </w:p>
         </w:tc>
@@ -1308,7 +1447,7 @@
               <w:rPr>
                 <w:sz w:val="18"/>
               </w:rPr>
-              <w:t xml:space="preserve">(11) Healthier restaurant choices</w:t>
+              <w:t xml:space="preserve">(12) Healthier restaurant choices</w:t>
             </w:r>
           </w:p>
         </w:tc>
@@ -1347,25 +1486,25 @@
               <w:rPr>
                 <w:sz w:val="18"/>
               </w:rPr>
-              <w:t xml:space="preserve"> Same as (10), plus picks one of the three.</w:t>
-            </w:r>
-          </w:p>
-        </w:tc>
-      </w:tr>
-      <w:tr>
-        <w:tc>
-          <w:tcPr>
-            <w:tcW w:w="3360" w:type="dxa"/>
-          </w:tcPr>
-          <w:p>
-            <w:pPr>
-              <w:spacing w:before="40" w:after="40"/>
-            </w:pPr>
-            <w:r>
-              <w:rPr>
-                <w:sz w:val="18"/>
-              </w:rPr>
-              <w:t xml:space="preserve">(12) Grocery consumption learning</w:t>
+              <w:t xml:space="preserve"> Same as (11), plus picks one of the three.</w:t>
+            </w:r>
+          </w:p>
+        </w:tc>
+      </w:tr>
+      <w:tr>
+        <w:tc>
+          <w:tcPr>
+            <w:tcW w:w="3360" w:type="dxa"/>
+          </w:tcPr>
+          <w:p>
+            <w:pPr>
+              <w:spacing w:before="40" w:after="40"/>
+            </w:pPr>
+            <w:r>
+              <w:rPr>
+                <w:sz w:val="18"/>
+              </w:rPr>
+              <w:t xml:space="preserve">(13) Grocery consumption learning</w:t>
             </w:r>
           </w:p>
         </w:tc>
@@ -1397,25 +1536,25 @@
               <w:rPr>
                 <w:sz w:val="18"/>
               </w:rPr>
-              <w:t xml:space="preserve">Confirms or corrects what they ate through the story (20) audit.</w:t>
-            </w:r>
-          </w:p>
-        </w:tc>
-      </w:tr>
-      <w:tr>
-        <w:tc>
-          <w:tcPr>
-            <w:tcW w:w="3360" w:type="dxa"/>
-          </w:tcPr>
-          <w:p>
-            <w:pPr>
-              <w:spacing w:before="40" w:after="40"/>
-            </w:pPr>
-            <w:r>
-              <w:rPr>
-                <w:sz w:val="18"/>
-              </w:rPr>
-              <w:t xml:space="preserve">(13) Restaurant consumption learning</w:t>
+              <w:t xml:space="preserve">Confirms or corrects what they ate through the story (21) audit.</w:t>
+            </w:r>
+          </w:p>
+        </w:tc>
+      </w:tr>
+      <w:tr>
+        <w:tc>
+          <w:tcPr>
+            <w:tcW w:w="3360" w:type="dxa"/>
+          </w:tcPr>
+          <w:p>
+            <w:pPr>
+              <w:spacing w:before="40" w:after="40"/>
+            </w:pPr>
+            <w:r>
+              <w:rPr>
+                <w:sz w:val="18"/>
+              </w:rPr>
+              <w:t xml:space="preserve">(14) Restaurant consumption learning</w:t>
             </w:r>
           </w:p>
         </w:tc>
@@ -1447,25 +1586,25 @@
               <w:rPr>
                 <w:sz w:val="18"/>
               </w:rPr>
-              <w:t xml:space="preserve">Confirms or corrects restaurant meals through the story (20) audit.</w:t>
-            </w:r>
-          </w:p>
-        </w:tc>
-      </w:tr>
-      <w:tr>
-        <w:tc>
-          <w:tcPr>
-            <w:tcW w:w="3360" w:type="dxa"/>
-          </w:tcPr>
-          <w:p>
-            <w:pPr>
-              <w:spacing w:before="40" w:after="40"/>
-            </w:pPr>
-            <w:r>
-              <w:rPr>
-                <w:sz w:val="18"/>
-              </w:rPr>
-              <w:t xml:space="preserve">(14) Workout education</w:t>
+              <w:t xml:space="preserve">Confirms or corrects restaurant meals through the story (21) audit.</w:t>
+            </w:r>
+          </w:p>
+        </w:tc>
+      </w:tr>
+      <w:tr>
+        <w:tc>
+          <w:tcPr>
+            <w:tcW w:w="3360" w:type="dxa"/>
+          </w:tcPr>
+          <w:p>
+            <w:pPr>
+              <w:spacing w:before="40" w:after="40"/>
+            </w:pPr>
+            <w:r>
+              <w:rPr>
+                <w:sz w:val="18"/>
+              </w:rPr>
+              <w:t xml:space="preserve">(15) Workout education</w:t>
             </w:r>
           </w:p>
         </w:tc>
@@ -1515,39 +1654,39 @@
               <w:rPr>
                 <w:sz w:val="18"/>
               </w:rPr>
-              <w:t xml:space="preserve">(15) Workout tracking and motivation</w:t>
-            </w:r>
-          </w:p>
-        </w:tc>
-        <w:tc>
-          <w:tcPr>
-            <w:tcW w:w="3360" w:type="dxa"/>
-          </w:tcPr>
-          <w:p>
-            <w:pPr>
-              <w:spacing w:before="40" w:after="40"/>
-            </w:pPr>
-            <w:r>
-              <w:rPr>
-                <w:sz w:val="18"/>
-              </w:rPr>
-              <w:t xml:space="preserve">"app tracks a users daily workouts and motivation via user confirming what they current plan to do each day, and then at end of day, there is an End of Day Daily Confirmation - #20 below." The app has "inputs for the user to select whether they did some form of cardiovascular work (e.g., walked, ran, sprinted, biked, ... yoga, pilates, danced, tai chi), or worked out using free weights. Each of these workouts track the period of time and calories burned for that period of time based on the users health statistics, and what the user inputted as part of their daily workout plan."</w:t>
-            </w:r>
-          </w:p>
-        </w:tc>
-        <w:tc>
-          <w:tcPr>
-            <w:tcW w:w="3360" w:type="dxa"/>
-          </w:tcPr>
-          <w:p>
-            <w:pPr>
-              <w:spacing w:before="40" w:after="40"/>
-            </w:pPr>
-            <w:r>
-              <w:rPr>
-                <w:sz w:val="18"/>
-              </w:rPr>
-              <w:t xml:space="preserve">Confirms each day what they plan to do, does the workout, selects the workout type, then confirms at day's end through the story (20) audit. </w:t>
+              <w:t xml:space="preserve">(16) Workout tracking and motivation</w:t>
+            </w:r>
+          </w:p>
+        </w:tc>
+        <w:tc>
+          <w:tcPr>
+            <w:tcW w:w="3360" w:type="dxa"/>
+          </w:tcPr>
+          <w:p>
+            <w:pPr>
+              <w:spacing w:before="40" w:after="40"/>
+            </w:pPr>
+            <w:r>
+              <w:rPr>
+                <w:sz w:val="18"/>
+              </w:rPr>
+              <w:t xml:space="preserve">"app tracks a users daily workouts and motivation via user confirming what they current plan to do each day, and then at end of day, there is an End of Day Daily Confirmation - #21 below." The app has "inputs for the user to select whether they did some form of cardiovascular work (e.g., walked, ran, sprinted, biked, ... yoga, pilates, danced, tai chi), or worked out using free weights. Each of these workouts track the period of time and calories burned for that period of time based on the users health statistics, and what the user inputted as part of their daily workout plan."</w:t>
+            </w:r>
+          </w:p>
+        </w:tc>
+        <w:tc>
+          <w:tcPr>
+            <w:tcW w:w="3360" w:type="dxa"/>
+          </w:tcPr>
+          <w:p>
+            <w:pPr>
+              <w:spacing w:before="40" w:after="40"/>
+            </w:pPr>
+            <w:r>
+              <w:rPr>
+                <w:sz w:val="18"/>
+              </w:rPr>
+              <w:t xml:space="preserve">Confirms each day what they plan to do, does the workout, selects the workout type, then confirms at day's end through the story (21) audit. </w:t>
             </w:r>
             <w:r>
               <w:rPr>
@@ -1578,7 +1717,7 @@
               <w:rPr>
                 <w:sz w:val="18"/>
               </w:rPr>
-              <w:t xml:space="preserve">(16) Workout plan</w:t>
+              <w:t xml:space="preserve">(17) Workout plan</w:t>
             </w:r>
           </w:p>
         </w:tc>
@@ -1628,7 +1767,7 @@
               <w:rPr>
                 <w:sz w:val="18"/>
               </w:rPr>
-              <w:t xml:space="preserve">(17) Gamification</w:t>
+              <w:t xml:space="preserve">(18) Gamification</w:t>
             </w:r>
           </w:p>
         </w:tc>
@@ -1678,7 +1817,7 @@
               <w:rPr>
                 <w:sz w:val="18"/>
               </w:rPr>
-              <w:t xml:space="preserve">(18) Daily motivation</w:t>
+              <w:t xml:space="preserve">(19) Daily motivation</w:t>
             </w:r>
           </w:p>
         </w:tc>
@@ -1728,7 +1867,7 @@
               <w:rPr>
                 <w:sz w:val="18"/>
               </w:rPr>
-              <w:t xml:space="preserve">(19) Access to a longevity doctor</w:t>
+              <w:t xml:space="preserve">(20) Access to a longevity doctor</w:t>
             </w:r>
           </w:p>
         </w:tc>
@@ -1785,7 +1924,7 @@
               <w:rPr>
                 <w:sz w:val="18"/>
               </w:rPr>
-              <w:t xml:space="preserve">(20) End of Day Daily Confirmation Audit</w:t>
+              <w:t xml:space="preserve">(21) End of Day Daily Confirmation Audit</w:t>
             </w:r>
           </w:p>
         </w:tc>
@@ -1833,12 +1972,12 @@
         <w:pStyle w:val="Heading2"/>
       </w:pPr>
       <w:r>
-        <w:t xml:space="preserve">Feature 5: "App provides recommendations to all users based on their history of using the app (as well as the history of the top 10% of users using the app that confirm their grocery orders and workouts during the End of Day Daily Confirmation Audit for the attributes listed above in #1 to #18), which the user can see a confirmation message the next morning via the app that confirms who the Top 10% of users avatar names are and their choices, and the app provides recommendations that are delivered to both daily per-user recommendation, the weekly all-user ones, and the user can use the recommendation to make choices in #1 to #18 in the CORE STORY."</w:t>
-      </w:r>
-    </w:p>
-    <w:p>
-      <w:r>
-        <w:t xml:space="preserve">This feature repeats story (21). </w:t>
+        <w:t xml:space="preserve">Feature 5: "App provides recommendations to all users based on their history of using the app (as well as the history of the top 10% of users using the app that confirm their grocery orders and workouts during the End of Day Daily Confirmation Audit for the attributes listed above in #1 to #19), which the user can see a confirmation message the next morning via the app that confirms who the Top 10% of users avatar names are and their choices, and the app provides recommendations that are delivered to both daily per-user recommendation, the weekly all-user ones, and the user can use the recommendation to make choices in #1 to #19 in the CORE STORY."</w:t>
+      </w:r>
+    </w:p>
+    <w:p>
+      <w:r>
+        <w:t xml:space="preserve">This feature repeats story (22). </w:t>
       </w:r>
       <w:r>
         <w:rPr>
@@ -1847,7 +1986,7 @@
         <w:t xml:space="preserve">[INFERRED]</w:t>
       </w:r>
       <w:r>
-        <w:t xml:space="preserve"> "#1 to #18" refers to the core user story items, which in this version run from diet goals (1) to daily motivation (18), including the pantry (6) and workout plan (16).</w:t>
+        <w:t xml:space="preserve"> "#1 to #19" refers to the core user story items, which in this version run from diet goals (1) to daily motivation (19). That range includes the pantry (6) and the new "When to eat" (10).</w:t>
       </w:r>
     </w:p>
     <w:tbl>
@@ -1921,7 +2060,7 @@
               <w:rPr>
                 <w:sz w:val="18"/>
               </w:rPr>
-              <w:t xml:space="preserve">Makes recommendations for story items (1)–(18) based on the user's own "history of using the app."</w:t>
+              <w:t xml:space="preserve">Makes recommendations for story items (1)–(19) based on the user's own "history of using the app."</w:t>
             </w:r>
           </w:p>
         </w:tc>
@@ -1978,7 +2117,7 @@
               <w:rPr>
                 <w:sz w:val="18"/>
               </w:rPr>
-              <w:t xml:space="preserve"> Keeps up the daily audit (story 20), which is where the history comes from.</w:t>
+              <w:t xml:space="preserve"> Keeps up the daily audit (story 21), which is where the history comes from.</w:t>
             </w:r>
           </w:p>
         </w:tc>
@@ -2012,7 +2151,7 @@
               <w:rPr>
                 <w:sz w:val="18"/>
               </w:rPr>
-              <w:t xml:space="preserve">Decides whether to act on a recommendation: "the user can use the recommendation to make choices in #1 to #18 in the CORE STORY."</w:t>
+              <w:t xml:space="preserve">Decides whether to act on a recommendation: "the user can use the recommendation to make choices in #1 to #19 in the CORE STORY."</w:t>
             </w:r>
           </w:p>
         </w:tc>
@@ -2038,7 +2177,7 @@
     </w:p>
     <w:p>
       <w:r>
-        <w:t xml:space="preserve">This feature matches story (22): the report "will contain all the health metrics of the patient, specifically, the health statistical information inputted into the app by the user (height, weight, BMI, BMR, muscle mass, visceral fat, GLP-1 dosage, or Inbody Scan Statistical information) and items #1 to #7, and #10 to #11, #14 to #16, and #20."</w:t>
+        <w:t xml:space="preserve">This feature matches story (23): the report "will contain all the health metrics of the patient, specifically, the health statistical information inputted into the app by the user (height, weight, BMI, BMR, muscle mass, visceral fat, GLP-1 dosage, or Inbody Scan Statistical information) and items #1 to #7, and #10 to #12, #15 to #17, and #21."</w:t>
       </w:r>
     </w:p>
     <w:tbl>
@@ -2146,7 +2285,7 @@
               <w:rPr>
                 <w:sz w:val="18"/>
               </w:rPr>
-              <w:t xml:space="preserve">Includes the health statistics plus diet goal (1), diet choice (2), nutritional requirements (3), preferred foods (4), excluded foods (5), pantry (6), recipes (7), restaurant choices (10, 11), workout education, tracking and plan (14, 15, 16) and the daily audit (20).</w:t>
+              <w:t xml:space="preserve">Includes the health statistics plus diet goal (1), diet choice (2), nutritional requirements (3), preferred foods (4), excluded foods (5), pantry (6), recipes (7), when to eat (10), restaurant choices (11, 12), workout education, tracking and plan (15, 16, 17) and the daily audit (21).</w:t>
             </w:r>
           </w:p>
         </w:tc>
@@ -2216,30 +2355,20 @@
     </w:p>
     <w:p>
       <w:r>
-        <w:t xml:space="preserve">Story (22) calls the contents "all the health metrics of the patient," while Feature 6 calls it a report "on their activity using the app."</w:t>
-      </w:r>
-    </w:p>
-    <w:p>
-      <w:pPr>
-        <w:pBdr>
-          <w:bottom w:val="single" w:sz="6" w:space="6" w:color="C9CCD1"/>
-        </w:pBdr>
-      </w:pPr>
-    </w:p>
-    <w:p>
-      <w:pPr>
-        <w:pStyle w:val="Heading1"/>
-      </w:pPr>
-      <w:r>
-        <w:t xml:space="preserve">3. WHAT WE HOLD</w:t>
-      </w:r>
-    </w:p>
-    <w:p>
-      <w:r>
-        <w:rPr>
-          <w:b/>
-        </w:rPr>
-        <w:t xml:space="preserve">What prd-1.md says:</w:t>
+        <w:t xml:space="preserve">Story (23) calls the contents "all the health metrics of the patient," while Feature 6 calls it a report "on their activity using the app." The report's item list doesn't include the Daily Health Score.</w:t>
+      </w:r>
+    </w:p>
+    <w:p>
+      <w:pPr>
+        <w:pStyle w:val="Heading2"/>
+      </w:pPr>
+      <w:r>
+        <w:t xml:space="preserve">Feature 7: "App provides the ability for a user to track their Daily Health Score daily, weekly, monthly, where the user can share that data with other users that are part of their family group and/or friend group. The user sees a confirmation message showing the user their Daily Health Score, which the app aggregates the data daily, weekly, and monthly."</w:t>
+      </w:r>
+    </w:p>
+    <w:p>
+      <w:r>
+        <w:t xml:space="preserve">The PRD describes the score in a separate paragraph:</w:t>
       </w:r>
     </w:p>
     <w:p>
@@ -2250,12 +2379,247 @@
         </w:pBdr>
       </w:pPr>
       <w:r>
-        <w:t xml:space="preserve">DATA WE STORE: The user will be providing health statistics about themselves listed in the CORE STORY. Those statistics must be kept on the app and may be updated periodically by the user in connection with their longevity doctor. Combine data across users regarding popular choices for CORE STORY items #1 to #18 but do so in a deidentified way where only an avatar name is used. Avatar names for the Top 10% of users can be seen by other users, and their choices are visible, except their excluded foods and allergies, and their pantry use. Top 10% of Users cannot opt out of having their choices shown. Users can see other avatar names. Other users should not be able to link back avatar names to any user. Make sure to protect the data and avatar names consistent with United States (State and Federal) data privacy laws. We do not store payment and address data. We do retain data for the user to export as a User Health Report to provide to their doctor. All data about a user is maintained for the user until the user terminates services with the app. The user can delete their data from the app upon termination. Users cannot delete app data before ending services. Payment and address data will be taken by the AI agent that this app connects to via an API. Please maintain all data consistent with United States (State and Federal) data privacy laws.</w:t>
-      </w:r>
-    </w:p>
-    <w:p>
-      <w:r>
-        <w:t xml:space="preserve">Elsewhere in the PRD:</w:t>
+        <w:t xml:space="preserve">The app will also provide a user a Daily Health Score, that will be aggregated on the app based on their End of Daily Confirmation Audit. The Daily Health Score contains several metrics to average the users health score according: (1) the amount of food eaten compared to daily recipes chosen (#7 in CORE USER Story), and (2) the amount of workout time actually worked out compared to the daily workout plan chosen (#16 in CORE USER Story). ... The app will give a user a Daily Health Score everyday after the End of Day Audit. The user can then compare that score with other users of the app, either against the Top 10% of users, or family and/or friends also using the app who the user shares the data with in a family and/or friend group.</w:t>
+      </w:r>
+    </w:p>
+    <w:p>
+      <w:r>
+        <w:t xml:space="preserve">Story (24): "the app allow the user to create a family group and/or friend group for accountability, where the user can share their Daily Health Score."</w:t>
+      </w:r>
+    </w:p>
+    <w:tbl>
+      <w:tblPr>
+        <w:tblW w:w="10080" w:type="dxa"/>
+        <w:tblBorders>
+          <w:top w:val="single" w:sz="4" w:space="0" w:color="C9CCD1"/>
+          <w:left w:val="single" w:sz="4" w:space="0" w:color="C9CCD1"/>
+          <w:bottom w:val="single" w:sz="4" w:space="0" w:color="C9CCD1"/>
+          <w:right w:val="single" w:sz="4" w:space="0" w:color="C9CCD1"/>
+          <w:insideH w:val="single" w:sz="4" w:space="0" w:color="C9CCD1"/>
+          <w:insideV w:val="single" w:sz="4" w:space="0" w:color="C9CCD1"/>
+        </w:tblBorders>
+        <w:tblLayout w:type="fixed"/>
+      </w:tblPr>
+      <w:tblGrid>
+        <w:gridCol w:w="5040"/>
+        <w:gridCol w:w="5040"/>
+      </w:tblGrid>
+      <w:tr>
+        <w:trPr>
+          <w:tblHeader/>
+        </w:trPr>
+        <w:tc>
+          <w:tcPr>
+            <w:tcW w:w="5040" w:type="dxa"/>
+            <w:shd w:val="clear" w:color="auto" w:fill="EFF1F3"/>
+          </w:tcPr>
+          <w:p>
+            <w:pPr>
+              <w:spacing w:before="40" w:after="40"/>
+            </w:pPr>
+            <w:r>
+              <w:rPr>
+                <w:b/>
+                <w:sz w:val="18"/>
+              </w:rPr>
+              <w:t xml:space="preserve">The product does</w:t>
+            </w:r>
+          </w:p>
+        </w:tc>
+        <w:tc>
+          <w:tcPr>
+            <w:tcW w:w="5040" w:type="dxa"/>
+            <w:shd w:val="clear" w:color="auto" w:fill="EFF1F3"/>
+          </w:tcPr>
+          <w:p>
+            <w:pPr>
+              <w:spacing w:before="40" w:after="40"/>
+            </w:pPr>
+            <w:r>
+              <w:rPr>
+                <w:b/>
+                <w:sz w:val="18"/>
+              </w:rPr>
+              <w:t xml:space="preserve">The user still does, by hand or elsewhere</w:t>
+            </w:r>
+          </w:p>
+        </w:tc>
+      </w:tr>
+      <w:tr>
+        <w:tc>
+          <w:tcPr>
+            <w:tcW w:w="5040" w:type="dxa"/>
+          </w:tcPr>
+          <w:p>
+            <w:pPr>
+              <w:spacing w:before="40" w:after="40"/>
+            </w:pPr>
+            <w:r>
+              <w:rPr>
+                <w:sz w:val="18"/>
+              </w:rPr>
+              <w:t xml:space="preserve">Works out a Daily Health Score after each daily audit from "(1) the amount of food eaten compared to daily recipes chosen" and "(2) the amount of workout time actually worked out compared to the daily workout plan chosen."</w:t>
+            </w:r>
+          </w:p>
+        </w:tc>
+        <w:tc>
+          <w:tcPr>
+            <w:tcW w:w="5040" w:type="dxa"/>
+          </w:tcPr>
+          <w:p>
+            <w:pPr>
+              <w:spacing w:before="40" w:after="40"/>
+            </w:pPr>
+            <w:r>
+              <w:rPr>
+                <w:sz w:val="18"/>
+              </w:rPr>
+              <w:t xml:space="preserve">Completes the story (21) daily audit, which the score is "based on."</w:t>
+            </w:r>
+          </w:p>
+        </w:tc>
+      </w:tr>
+      <w:tr>
+        <w:tc>
+          <w:tcPr>
+            <w:tcW w:w="5040" w:type="dxa"/>
+          </w:tcPr>
+          <w:p>
+            <w:pPr>
+              <w:spacing w:before="40" w:after="40"/>
+            </w:pPr>
+            <w:r>
+              <w:rPr>
+                <w:sz w:val="18"/>
+              </w:rPr>
+              <w:t xml:space="preserve">Rolls the score up "daily, weekly, and monthly" so the user can "track daily, weekly, monthly goals."</w:t>
+            </w:r>
+          </w:p>
+        </w:tc>
+        <w:tc>
+          <w:tcPr>
+            <w:tcW w:w="5040" w:type="dxa"/>
+          </w:tcPr>
+          <w:p>
+            <w:pPr>
+              <w:spacing w:before="40" w:after="40"/>
+            </w:pPr>
+            <w:r>
+              <w:rPr>
+                <w:sz w:val="18"/>
+              </w:rPr>
+              <w:t xml:space="preserve">Creates a family group and/or friend group (story 24). </w:t>
+            </w:r>
+            <w:r>
+              <w:rPr>
+                <w:b/>
+                <w:sz w:val="18"/>
+              </w:rPr>
+              <w:t xml:space="preserve">[INFERRED]</w:t>
+            </w:r>
+            <w:r>
+              <w:rPr>
+                <w:sz w:val="18"/>
+              </w:rPr>
+              <w:t xml:space="preserve"> Gets family or friends to join the app and the group; the PRD doesn't say how.</w:t>
+            </w:r>
+          </w:p>
+        </w:tc>
+      </w:tr>
+      <w:tr>
+        <w:tc>
+          <w:tcPr>
+            <w:tcW w:w="5040" w:type="dxa"/>
+          </w:tcPr>
+          <w:p>
+            <w:pPr>
+              <w:spacing w:before="40" w:after="40"/>
+            </w:pPr>
+            <w:r>
+              <w:rPr>
+                <w:sz w:val="18"/>
+              </w:rPr>
+              <w:t xml:space="preserve">Lets the user compare their score "against the Top 10% of users, or family and/or friends."</w:t>
+            </w:r>
+          </w:p>
+        </w:tc>
+        <w:tc>
+          <w:tcPr>
+            <w:tcW w:w="5040" w:type="dxa"/>
+          </w:tcPr>
+          <w:p>
+            <w:pPr>
+              <w:spacing w:before="40" w:after="40"/>
+            </w:pPr>
+            <w:r>
+              <w:rPr>
+                <w:sz w:val="18"/>
+              </w:rPr>
+              <w:t xml:space="preserve">Chooses to share their score with the group ("the user can share that data").</w:t>
+            </w:r>
+          </w:p>
+        </w:tc>
+      </w:tr>
+      <w:tr>
+        <w:tc>
+          <w:tcPr>
+            <w:tcW w:w="5040" w:type="dxa"/>
+          </w:tcPr>
+          <w:p>
+            <w:pPr>
+              <w:spacing w:before="40" w:after="40"/>
+            </w:pPr>
+            <w:r>
+              <w:rPr>
+                <w:sz w:val="18"/>
+              </w:rPr>
+              <w:t xml:space="preserve">Shows "a confirmation message showing the user their Daily Health Score."</w:t>
+            </w:r>
+          </w:p>
+        </w:tc>
+        <w:tc>
+          <w:tcPr>
+            <w:tcW w:w="5040" w:type="dxa"/>
+          </w:tcPr>
+          <w:p>
+            <w:pPr>
+              <w:spacing w:before="40" w:after="40"/>
+            </w:pPr>
+          </w:p>
+        </w:tc>
+      </w:tr>
+    </w:tbl>
+    <w:p>
+      <w:pPr>
+        <w:spacing w:after="0"/>
+      </w:pPr>
+    </w:p>
+    <w:p>
+      <w:r>
+        <w:t xml:space="preserve">The score paragraph cites the workout plan as "#16 in CORE USER Story." In this version (16) is "Workout tracking and motivation" and the workout plan is (17).</w:t>
+      </w:r>
+    </w:p>
+    <w:p>
+      <w:pPr>
+        <w:pBdr>
+          <w:bottom w:val="single" w:sz="6" w:space="6" w:color="C9CCD1"/>
+        </w:pBdr>
+      </w:pPr>
+    </w:p>
+    <w:p>
+      <w:pPr>
+        <w:pStyle w:val="Heading1"/>
+      </w:pPr>
+      <w:r>
+        <w:t xml:space="preserve">3. WHAT WE HOLD</w:t>
+      </w:r>
+    </w:p>
+    <w:p>
+      <w:r>
+        <w:rPr>
+          <w:b/>
+        </w:rPr>
+        <w:t xml:space="preserve">What prd-2.md says:</w:t>
       </w:r>
     </w:p>
     <w:p>
@@ -2266,7 +2630,12 @@
         </w:pBdr>
       </w:pPr>
       <w:r>
-        <w:t xml:space="preserve">As for the User Health Report, material outside the User Health Report is kept by the app (orders, menu photos, rewards, recommendations).</w:t>
+        <w:t xml:space="preserve">DATA WE STORE: The user will be providing health statistics about themselves listed in the CORE STORY. Those statistics must be kept on the app and may be updated periodically by the user in connection with their longevity doctor. Combine data across users regarding popular choices for CORE STORY items #1 to #19 but do so in a deidentified way where only an avatar name is used. Avatar names for the Top 10% of users can be seen by other users, and their choices are visible, except their excluded foods and allergies, and their pantry use. Top 10% of Users cannot opt out of having their choices shown. Users can see other avatar names. Other users should not be able to link back avatar names to any user. Make sure to protect the data and avatar names consistent with United States (State and Federal) data privacy laws. We do not store payment and address data. We do retain data for the user to export as a User Health Report to provide to their doctor. All data about a user is maintained for the user until the user terminates services with the app. The user can delete their data from the app upon termination. Users cannot delete app data before ending services. Payment and address data will be taken by the AI agent that this app connects to via an API. Please maintain all data consistent with United States (State and Federal) data privacy laws.</w:t>
+      </w:r>
+    </w:p>
+    <w:p>
+      <w:r>
+        <w:t xml:space="preserve">Elsewhere in the PRD:</w:t>
       </w:r>
     </w:p>
     <w:p>
@@ -2277,7 +2646,7 @@
         </w:pBdr>
       </w:pPr>
       <w:r>
-        <w:t xml:space="preserve">As for Avatar Names, the user is provided a random avatar name when using the app. The user has the ability to change their avatar name but the user cannot make their avatar name there actual name, or any name that would identify them as a user while using the app. The app will prevent a user from using an avatar name that matches their first or last name, or truncated words of their first or last name, or other identifying names that connect back to the users first name or last name with 2 letters in sequential order matching the first name, the last name, or the first and last name.</w:t>
+        <w:t xml:space="preserve">As for the User Health Report, material outside the User Health Report is kept by the app (orders, menu photos, rewards, recommendations).</w:t>
       </w:r>
     </w:p>
     <w:p>
@@ -2288,224 +2657,7 @@
         </w:pBdr>
       </w:pPr>
       <w:r>
-        <w:t xml:space="preserve">United States state and federal data privacy laws related to the collection of consumer and health information collected by a third-party app apply to this app. All 50 state laws, and all federal laws related to the collection of data for this type of app apply.</w:t>
-      </w:r>
-    </w:p>
-    <w:p>
-      <w:r>
-        <w:rPr>
-          <w:b/>
-        </w:rPr>
-        <w:t xml:space="preserve">Kept inside the product:</w:t>
-      </w:r>
-    </w:p>
-    <w:p>
-      <w:pPr>
-        <w:numPr>
-          <w:ilvl w:val="0"/>
-          <w:numId w:val="1"/>
-        </w:numPr>
-      </w:pPr>
-      <w:r>
-        <w:rPr>
-          <w:b/>
-        </w:rPr>
-        <w:t xml:space="preserve">Each user's health statistics</w:t>
-      </w:r>
-      <w:r>
-        <w:t xml:space="preserve"> "listed in the CORE STORY" ("must be kept on the app"): height, weight, BMI, BMR, muscle mass, visceral fat, GLP-1 dosage, and "Inbody Scan Statistical information."</w:t>
-      </w:r>
-    </w:p>
-    <w:p>
-      <w:pPr>
-        <w:numPr>
-          <w:ilvl w:val="0"/>
-          <w:numId w:val="1"/>
-        </w:numPr>
-      </w:pPr>
-      <w:r>
-        <w:rPr>
-          <w:b/>
-        </w:rPr>
-        <w:t xml:space="preserve">Data for the User Health Report:</w:t>
-      </w:r>
-      <w:r>
-        <w:t xml:space="preserve"> "We do retain data for the user to export as a User Health Report." Per story (22), that's the health statistics plus diet goal and choice, nutritional requirements, preferred and excluded foods, pantry, recipes, restaurant choices, workout education, tracking and plan (type, planned time, "period of time and calories burned") and the daily audit.</w:t>
-      </w:r>
-    </w:p>
-    <w:p>
-      <w:pPr>
-        <w:numPr>
-          <w:ilvl w:val="0"/>
-          <w:numId w:val="1"/>
-        </w:numPr>
-      </w:pPr>
-      <w:r>
-        <w:rPr>
-          <w:b/>
-        </w:rPr>
-        <w:t xml:space="preserve">Material outside the report:</w:t>
-      </w:r>
-      <w:r>
-        <w:t xml:space="preserve"> "orders, menu photos, rewards, recommendations."</w:t>
-      </w:r>
-    </w:p>
-    <w:p>
-      <w:pPr>
-        <w:numPr>
-          <w:ilvl w:val="0"/>
-          <w:numId w:val="1"/>
-        </w:numPr>
-      </w:pPr>
-      <w:r>
-        <w:rPr>
-          <w:b/>
-        </w:rPr>
-        <w:t xml:space="preserve">Avatar names:</w:t>
-      </w:r>
-      <w:r>
-        <w:t xml:space="preserve"> a "random avatar name" the user can change, but not to "their actual name, or any name that would identify them." The app blocks names matching "their first or last name, or truncated words of their first or last name, or other identifying names that connect back to the users first name or last name with 2 letters in sequential order matching the first name, the last name, or the first and last name." </w:t>
-      </w:r>
-      <w:r>
-        <w:rPr>
-          <w:b/>
-        </w:rPr>
-        <w:t xml:space="preserve">[INFERRED]</w:t>
-      </w:r>
-      <w:r>
-        <w:t xml:space="preserve"> To run that check, the app holds the user's first and last name. Read literally, any avatar name sharing any two consecutive letters with the user's first or last name is blocked.</w:t>
-      </w:r>
-    </w:p>
-    <w:p>
-      <w:pPr>
-        <w:numPr>
-          <w:ilvl w:val="0"/>
-          <w:numId w:val="1"/>
-        </w:numPr>
-      </w:pPr>
-      <w:r>
-        <w:rPr>
-          <w:b/>
-        </w:rPr>
-        <w:t xml:space="preserve">Combined data across users:</w:t>
-      </w:r>
-      <w:r>
-        <w:t xml:space="preserve"> "data across users regarding popular choices for CORE STORY items #1 to #18," combined "in a deidentified way where only an avatar name is used." A popular choice is "what the top 10% of users average choices are using the app based on their End of Day Daily Confirmation Audit." Top-10% avatar names "can be seen by other users, and their choices are visible, except their excluded foods and allergies, and their pantry use," and "Top 10% of Users cannot opt out of having their choices shown." Also: "Users can see other avatar names" and "Other users should not be able to link back avatar names to any user."</w:t>
-      </w:r>
-    </w:p>
-    <w:p>
-      <w:pPr>
-        <w:numPr>
-          <w:ilvl w:val="0"/>
-          <w:numId w:val="1"/>
-        </w:numPr>
-      </w:pPr>
-      <w:r>
-        <w:rPr>
-          <w:b/>
-        </w:rPr>
-        <w:t xml:space="preserve">How long:</w:t>
-      </w:r>
-      <w:r>
-        <w:t xml:space="preserve"> "All data about a user is maintained for the user until the user terminates services with the app. The user can delete their data from the app upon termination. Users cannot delete app data before ending services."</w:t>
-      </w:r>
-    </w:p>
-    <w:p>
-      <w:pPr>
-        <w:numPr>
-          <w:ilvl w:val="0"/>
-          <w:numId w:val="1"/>
-        </w:numPr>
-      </w:pPr>
-      <w:r>
-        <w:rPr>
-          <w:b/>
-        </w:rPr>
-        <w:t xml:space="preserve">[INFERRED]</w:t>
-      </w:r>
-      <w:r>
-        <w:t xml:space="preserve"> Also kept, though not named in the passages above: the grocery list and recipe list "on the app" (Feature 3).</w:t>
-      </w:r>
-    </w:p>
-    <w:p>
-      <w:r>
-        <w:rPr>
-          <w:b/>
-        </w:rPr>
-        <w:t xml:space="preserve">Passed through without keeping:</w:t>
-      </w:r>
-    </w:p>
-    <w:p>
-      <w:pPr>
-        <w:numPr>
-          <w:ilvl w:val="0"/>
-          <w:numId w:val="1"/>
-        </w:numPr>
-      </w:pPr>
-      <w:r>
-        <w:t xml:space="preserve">"We do not store payment and address data." "Payment and address data will be taken by the AI agent that this app connects to via an API."</w:t>
-      </w:r>
-    </w:p>
-    <w:p>
-      <w:pPr>
-        <w:numPr>
-          <w:ilvl w:val="0"/>
-          <w:numId w:val="1"/>
-        </w:numPr>
-      </w:pPr>
-      <w:r>
-        <w:t xml:space="preserve">Nothing goes from the app to the doctor: "the app only gives contact information of the doctor and not any data," and "The doctor will not have access to any information on the app." The user carries their data to the doctor themselves, as an exported report or by "showing the doctor their app."</w:t>
-      </w:r>
-    </w:p>
-    <w:p>
-      <w:pPr>
-        <w:numPr>
-          <w:ilvl w:val="0"/>
-          <w:numId w:val="1"/>
-        </w:numPr>
-      </w:pPr>
-      <w:r>
-        <w:rPr>
-          <w:b/>
-        </w:rPr>
-        <w:t xml:space="preserve">[INFERRED]</w:t>
-      </w:r>
-      <w:r>
-        <w:t xml:space="preserve"> Grocery orders go out to stores through "agnostic AI agents," but the app keeps its own record ("orders" are kept). Menu photos are sent to be read, and the app keeps them too.</w:t>
-      </w:r>
-    </w:p>
-    <w:p>
-      <w:r>
-        <w:rPr>
-          <w:b/>
-        </w:rPr>
-        <w:t xml:space="preserve">Laws:</w:t>
-      </w:r>
-      <w:r>
-        <w:t xml:space="preserve"> "United States state and federal data privacy laws related to the collection of consumer and health information collected by a third-party app apply to this app. All 50 state laws, and all federal laws related to the collection of data for this type of app apply." The PRD names no individual law.</w:t>
-      </w:r>
-    </w:p>
-    <w:p>
-      <w:pPr>
-        <w:pBdr>
-          <w:bottom w:val="single" w:sz="6" w:space="6" w:color="C9CCD1"/>
-        </w:pBdr>
-      </w:pPr>
-    </w:p>
-    <w:p>
-      <w:pPr>
-        <w:pStyle w:val="Heading1"/>
-      </w:pPr>
-      <w:r>
-        <w:t xml:space="preserve">4. DOES IT GET BETTER WITH USE</w:t>
-      </w:r>
-    </w:p>
-    <w:p>
-      <w:r>
-        <w:rPr>
-          <w:b/>
-        </w:rPr>
-        <w:t xml:space="preserve">What prd-1.md says:</w:t>
+        <w:t xml:space="preserve">As for Avatar Names, the user is provided a random avatar name when using the app. The user has the ability to change their avatar name but the user cannot make their avatar name there actual name, or any name that would identify them as a user while using the app. The app will prevent a user from using an avatar name that matches their first or last name, or truncated words of their first or last name, or other identifying names that connect back to the users first name or last name with 2 letters in sequential order matching the first name, the last name, or the first and last name.</w:t>
       </w:r>
     </w:p>
     <w:p>
@@ -2516,89 +2668,83 @@
         </w:pBdr>
       </w:pPr>
       <w:r>
-        <w:t xml:space="preserve">The app improves over time, and for the user over time. The app improves over time by aggregating the days data from day to day for each user, providing daily recommendations. As more people join, the app will improve by providing updates regarding popular choices for top 10% of users on the app, providing weekly recommendations to all users. A popular choice is what the top 10% of users average choices are using the app based on their End of Day Daily Confirmation Audit. For average choices of the Top 10% of users, that are not numbers, the average would be the amount of times that option was chosen by the Top 10% of users. Top 10% users are ranked by how often they confirm results for all items in the End of Day Daily Confirmation Audit for the entire week by answering “yes”. Users who skip the End of Day Daily Confirmation Audit one (or more times) throughout the week do not count for the Top 10% users for the week. If Top 10% users are tied, then the users avatar name will break the tie by ranking in alphabetical order. If fewer than 10% of users confirm during the week, then continue to rank the remaining users based on how often they confirm results for all items in the End of Day Daily Confirmation Audit for the entire week by answering “yes”. If fewer than 10% of users skip the End of Day Daily Confirmation Audit one (or more times) throughout the week do not count for the fewer than Top 10% users for the week. If the fewer than Top 10% users are tied, then the users avatar name will break the tie by ranking in alphabetical order. If a user answers “no” and enter changes to the End of Day Daily Confirmation Audit, they can still be considered a Top 10% user, or fewer than Top 10% user, as long as they complete the End of Day Daily Confirmation Audit everyday for the week. If a user answers “no” and enters changes to the End of Day Daily Confirmation Audit, they are scored in a similar manner as the Top 10% of users, or the fewer than Top 10% user, and a corrected day counts less than a “yes” day by 25% less.</w:t>
-      </w:r>
-    </w:p>
-    <w:p>
-      <w:r>
-        <w:t xml:space="preserve">The PRD claims </w:t>
-      </w:r>
-      <w:r>
-        <w:rPr>
-          <w:b/>
-        </w:rPr>
-        <w:t xml:space="preserve">both</w:t>
-      </w:r>
-      <w:r>
-        <w:t xml:space="preserve">, each with its own mechanism and timing.</w:t>
-      </w:r>
-    </w:p>
-    <w:p>
-      <w:pPr>
-        <w:numPr>
-          <w:ilvl w:val="0"/>
-          <w:numId w:val="1"/>
-        </w:numPr>
-      </w:pPr>
-      <w:r>
-        <w:rPr>
-          <w:b/>
-        </w:rPr>
-        <w:t xml:space="preserve">For one user over time:</w:t>
-      </w:r>
-      <w:r>
-        <w:t xml:space="preserve"> "aggregating the days data from day to day for each user, providing daily recommendations," and "As for daily learning, it uses the daily confirmations." Feature 5 bases recommendations on "their history of using the app." Story (12) and (13) say "over time the app learns what the user eats." Story (20) supplies the input: a "yes/no answer" each day plus changed foods, restaurant meals, amounts and workout details. Story (15) and (16) add the daily workout plan, with workout type, time and calories burned.</w:t>
-      </w:r>
-    </w:p>
-    <w:p>
-      <w:pPr>
-        <w:numPr>
-          <w:ilvl w:val="0"/>
-          <w:numId w:val="1"/>
-        </w:numPr>
-      </w:pPr>
-      <w:r>
-        <w:rPr>
-          <w:b/>
-        </w:rPr>
-        <w:t xml:space="preserve">For everyone as more people join:</w:t>
-      </w:r>
-      <w:r>
-        <w:t xml:space="preserve"> "providing updates regarding popular choices for top 10% of users on the app, providing weekly recommendations to all users." A popular choice is what the top 10% "average choices are ... based on their End of Day Daily Confirmation Audit," and for choices that aren't numbers it's "the amount of times that option was chosen by the Top 10% of users."</w:t>
-      </w:r>
-    </w:p>
-    <w:p>
-      <w:pPr>
-        <w:numPr>
-          <w:ilvl w:val="0"/>
-          <w:numId w:val="1"/>
-        </w:numPr>
-      </w:pPr>
-      <w:r>
-        <w:rPr>
-          <w:b/>
-        </w:rPr>
-        <w:t xml:space="preserve">Ranking:</w:t>
-      </w:r>
-      <w:r>
-        <w:t xml:space="preserve"> by "yes" answers on all audit items for the week. Users who skip a day "do not count." Ties are broken alphabetically by avatar name. If fewer than 10% qualify, the remaining users are ranked the same way.</w:t>
-      </w:r>
-    </w:p>
-    <w:p>
-      <w:pPr>
-        <w:numPr>
-          <w:ilvl w:val="0"/>
-          <w:numId w:val="1"/>
-        </w:numPr>
-      </w:pPr>
-      <w:r>
-        <w:rPr>
-          <w:b/>
-        </w:rPr>
-        <w:t xml:space="preserve">Corrected days:</w:t>
-      </w:r>
-      <w:r>
-        <w:t xml:space="preserve"> a day where the user answers "no" and enters changes still qualifies, but "counts less than a “yes” day by 25% less." </w:t>
+        <w:t xml:space="preserve">United States state and federal data privacy laws related to the collection of consumer and health information collected by a third-party app apply to this app. All 50 state laws, and all federal laws related to the collection of data for this type of app apply.</w:t>
+      </w:r>
+    </w:p>
+    <w:p>
+      <w:r>
+        <w:rPr>
+          <w:b/>
+        </w:rPr>
+        <w:t xml:space="preserve">Kept inside the product:</w:t>
+      </w:r>
+    </w:p>
+    <w:p>
+      <w:pPr>
+        <w:numPr>
+          <w:ilvl w:val="0"/>
+          <w:numId w:val="1"/>
+        </w:numPr>
+      </w:pPr>
+      <w:r>
+        <w:rPr>
+          <w:b/>
+        </w:rPr>
+        <w:t xml:space="preserve">Each user's health statistics</w:t>
+      </w:r>
+      <w:r>
+        <w:t xml:space="preserve"> "listed in the CORE STORY" ("must be kept on the app"): height, weight, BMI, BMR, muscle mass, visceral fat, GLP-1 dosage, and "Inbody Scan Statistical information."</w:t>
+      </w:r>
+    </w:p>
+    <w:p>
+      <w:pPr>
+        <w:numPr>
+          <w:ilvl w:val="0"/>
+          <w:numId w:val="1"/>
+        </w:numPr>
+      </w:pPr>
+      <w:r>
+        <w:rPr>
+          <w:b/>
+        </w:rPr>
+        <w:t xml:space="preserve">Data for the User Health Report:</w:t>
+      </w:r>
+      <w:r>
+        <w:t xml:space="preserve"> "We do retain data for the user to export as a User Health Report." Per story (23), that's the health statistics plus diet goal and choice, nutritional requirements, preferred and excluded foods, pantry, recipes, when to eat, restaurant choices, workout education, tracking and plan (type, planned time, "period of time and calories burned") and the daily audit.</w:t>
+      </w:r>
+    </w:p>
+    <w:p>
+      <w:pPr>
+        <w:numPr>
+          <w:ilvl w:val="0"/>
+          <w:numId w:val="1"/>
+        </w:numPr>
+      </w:pPr>
+      <w:r>
+        <w:rPr>
+          <w:b/>
+        </w:rPr>
+        <w:t xml:space="preserve">Material outside the report:</w:t>
+      </w:r>
+      <w:r>
+        <w:t xml:space="preserve"> "orders, menu photos, rewards, recommendations."</w:t>
+      </w:r>
+    </w:p>
+    <w:p>
+      <w:pPr>
+        <w:numPr>
+          <w:ilvl w:val="0"/>
+          <w:numId w:val="1"/>
+        </w:numPr>
+      </w:pPr>
+      <w:r>
+        <w:rPr>
+          <w:b/>
+        </w:rPr>
+        <w:t xml:space="preserve">Avatar names:</w:t>
+      </w:r>
+      <w:r>
+        <w:t xml:space="preserve"> a "random avatar name" the user can change, but not to "their actual name, or any name that would identify them." The app blocks names matching "their first or last name, or truncated words of their first or last name, or other identifying names that connect back to the users first name or last name with 2 letters in sequential order matching the first name, the last name, or the first and last name." </w:t>
       </w:r>
       <w:r>
         <w:rPr>
@@ -2607,7 +2753,41 @@
         <w:t xml:space="preserve">[INFERRED]</w:t>
       </w:r>
       <w:r>
-        <w:t xml:space="preserve"> That makes a corrected day worth 0.75 of a "yes" day.</w:t>
+        <w:t xml:space="preserve"> To run that check, the app holds the user's first and last name. Read literally, any avatar name sharing any two consecutive letters with the user's first or last name is blocked.</w:t>
+      </w:r>
+    </w:p>
+    <w:p>
+      <w:pPr>
+        <w:numPr>
+          <w:ilvl w:val="0"/>
+          <w:numId w:val="1"/>
+        </w:numPr>
+      </w:pPr>
+      <w:r>
+        <w:rPr>
+          <w:b/>
+        </w:rPr>
+        <w:t xml:space="preserve">Combined data across users:</w:t>
+      </w:r>
+      <w:r>
+        <w:t xml:space="preserve"> "data across users regarding popular choices for CORE STORY items #1 to #19," combined "in a deidentified way where only an avatar name is used." A popular choice is "what the top 10% of users average choices are using the app based on their End of Day Daily Confirmation Audit." Top-10% avatar names "can be seen by other users, and their choices are visible, except their excluded foods and allergies, and their pantry use," and "Top 10% of Users cannot opt out of having their choices shown." Also: "Users can see other avatar names" and "Other users should not be able to link back avatar names to any user."</w:t>
+      </w:r>
+    </w:p>
+    <w:p>
+      <w:pPr>
+        <w:numPr>
+          <w:ilvl w:val="0"/>
+          <w:numId w:val="1"/>
+        </w:numPr>
+      </w:pPr>
+      <w:r>
+        <w:rPr>
+          <w:b/>
+        </w:rPr>
+        <w:t xml:space="preserve">How long:</w:t>
+      </w:r>
+      <w:r>
+        <w:t xml:space="preserve"> "All data about a user is maintained for the user until the user terminates services with the app. The user can delete their data from the app upon termination. Users cannot delete app data before ending services."</w:t>
       </w:r>
     </w:p>
     <w:p>
@@ -2624,7 +2804,112 @@
         <w:t xml:space="preserve">[INFERRED]</w:t>
       </w:r>
       <w:r>
-        <w:t xml:space="preserve"> Users who answered "yes" to everything every day tie, and the alphabet orders them. Users with corrected days rank below them. Avatar names start random and users can change them, so a user's alphabetical position can change when they rename.</w:t>
+        <w:t xml:space="preserve"> Also kept, under "All data about a user is maintained," though not named in DATA WE STORE: the Daily Health Score history (daily, weekly, monthly), family and friend group memberships, the grocery list and recipe list "on the app" (Feature 3), and the "When to eat" schedule (story 10).</w:t>
+      </w:r>
+    </w:p>
+    <w:p>
+      <w:r>
+        <w:rPr>
+          <w:b/>
+        </w:rPr>
+        <w:t xml:space="preserve">Shared with other users inside the product:</w:t>
+      </w:r>
+    </w:p>
+    <w:p>
+      <w:pPr>
+        <w:numPr>
+          <w:ilvl w:val="0"/>
+          <w:numId w:val="1"/>
+        </w:numPr>
+      </w:pPr>
+      <w:r>
+        <w:t xml:space="preserve">Top-10% avatar names and their choices, except excluded foods, allergies and pantry use (DATA WE STORE).</w:t>
+      </w:r>
+    </w:p>
+    <w:p>
+      <w:pPr>
+        <w:numPr>
+          <w:ilvl w:val="0"/>
+          <w:numId w:val="1"/>
+        </w:numPr>
+      </w:pPr>
+      <w:r>
+        <w:t xml:space="preserve">A user's Daily Health Score, with members of their family and/or friend group, when the user chooses to share it (Feature 7, story 24).</w:t>
+      </w:r>
+    </w:p>
+    <w:p>
+      <w:pPr>
+        <w:numPr>
+          <w:ilvl w:val="0"/>
+          <w:numId w:val="1"/>
+        </w:numPr>
+      </w:pPr>
+      <w:r>
+        <w:rPr>
+          <w:b/>
+        </w:rPr>
+        <w:t xml:space="preserve">[INFERRED]</w:t>
+      </w:r>
+      <w:r>
+        <w:t xml:space="preserve"> Top-10% users' Daily Health Scores, since users can compare their score "against the Top 10% of users." DATA WE STORE doesn't list the score among what's visible.</w:t>
+      </w:r>
+    </w:p>
+    <w:p>
+      <w:r>
+        <w:rPr>
+          <w:b/>
+        </w:rPr>
+        <w:t xml:space="preserve">Passed through without keeping:</w:t>
+      </w:r>
+    </w:p>
+    <w:p>
+      <w:pPr>
+        <w:numPr>
+          <w:ilvl w:val="0"/>
+          <w:numId w:val="1"/>
+        </w:numPr>
+      </w:pPr>
+      <w:r>
+        <w:t xml:space="preserve">"We do not store payment and address data." "Payment and address data will be taken by the AI agent that this app connects to via an API."</w:t>
+      </w:r>
+    </w:p>
+    <w:p>
+      <w:pPr>
+        <w:numPr>
+          <w:ilvl w:val="0"/>
+          <w:numId w:val="1"/>
+        </w:numPr>
+      </w:pPr>
+      <w:r>
+        <w:t xml:space="preserve">Nothing goes from the app to the doctor: "the app only gives contact information of the doctor and not any data," and "The doctor will not have access to any information on the app." The user carries their data to the doctor themselves, as an exported report or by "showing the doctor their app."</w:t>
+      </w:r>
+    </w:p>
+    <w:p>
+      <w:pPr>
+        <w:numPr>
+          <w:ilvl w:val="0"/>
+          <w:numId w:val="1"/>
+        </w:numPr>
+      </w:pPr>
+      <w:r>
+        <w:rPr>
+          <w:b/>
+        </w:rPr>
+        <w:t xml:space="preserve">[INFERRED]</w:t>
+      </w:r>
+      <w:r>
+        <w:t xml:space="preserve"> Grocery orders go out to stores through "agnostic AI agents," but the app keeps its own record ("orders" are kept). Menu photos are sent to be read, and the app keeps them too.</w:t>
+      </w:r>
+    </w:p>
+    <w:p>
+      <w:r>
+        <w:rPr>
+          <w:b/>
+        </w:rPr>
+        <w:t xml:space="preserve">Laws:</w:t>
+      </w:r>
+      <w:r>
+        <w:t xml:space="preserve"> "All 50 state laws, and all federal laws related to the collection of data for this type of app apply." The PRD names no individual law.</w:t>
       </w:r>
     </w:p>
     <w:p>
@@ -2639,12 +2924,180 @@
         <w:pStyle w:val="Heading1"/>
       </w:pPr>
       <w:r>
+        <w:t xml:space="preserve">4. DOES IT GET BETTER WITH USE</w:t>
+      </w:r>
+    </w:p>
+    <w:p>
+      <w:r>
+        <w:rPr>
+          <w:b/>
+        </w:rPr>
+        <w:t xml:space="preserve">What prd-2.md says:</w:t>
+      </w:r>
+    </w:p>
+    <w:p>
+      <w:pPr>
+        <w:ind w:left="360"/>
+        <w:pBdr>
+          <w:left w:val="single" w:sz="18" w:space="8" w:color="9AA0A6"/>
+        </w:pBdr>
+      </w:pPr>
+      <w:r>
+        <w:t xml:space="preserve">The app improves over time, and for the user over time. The app improves over time by aggregating the days data from day to day for each user, providing daily recommendations. As more people join, the app will improve by providing updates regarding popular choices for top 10% of users on the app, providing weekly recommendations to all users. A popular choice is what the top 10% of users average choices are using the app based on their End of Day Daily Confirmation Audit. For average choices of the Top 10% of users, that are not numbers, the average would be the amount of times that option was chosen by the Top 10% of users. Top 10% users are ranked by how often they confirm results for all items in the End of Day Daily Confirmation Audit for the entire week by answering “yes”. Users who skip the End of Day Daily Confirmation Audit one (or more times) throughout the week do not count for the Top 10% users for the week. If Top 10% users are tied, then the users avatar name will break the tie by ranking in alphabetical order. If fewer than 10% of users confirm during the week, then continue to rank the remaining users based on how often they confirm results for all items in the End of Day Daily Confirmation Audit for the entire week by answering “yes”. If fewer than 10% of users skip the End of Day Daily Confirmation Audit one (or more times) throughout the week do not count for the fewer than Top 10% users for the week. If the fewer than Top 10% users are tied, then the users avatar name will break the tie by ranking in alphabetical order. If a user answers “no” and enter changes to the End of Day Daily Confirmation Audit, they can still be considered a Top 10% user, or fewer than Top 10% user, as long as they complete the End of Day Daily Confirmation Audit everyday for the week. If a user answers “no” and enters changes to the End of Day Daily Confirmation Audit, they are scored in a similar manner as the Top 10% of users, or the fewer than Top 10% user, and a corrected day counts less than a “yes” day by 25% less.</w:t>
+      </w:r>
+    </w:p>
+    <w:p>
+      <w:r>
+        <w:t xml:space="preserve">The PRD claims </w:t>
+      </w:r>
+      <w:r>
+        <w:rPr>
+          <w:b/>
+        </w:rPr>
+        <w:t xml:space="preserve">both</w:t>
+      </w:r>
+      <w:r>
+        <w:t xml:space="preserve">, and this version adds a second way the product improves as people join.</w:t>
+      </w:r>
+    </w:p>
+    <w:p>
+      <w:pPr>
+        <w:numPr>
+          <w:ilvl w:val="0"/>
+          <w:numId w:val="1"/>
+        </w:numPr>
+      </w:pPr>
+      <w:r>
+        <w:rPr>
+          <w:b/>
+        </w:rPr>
+        <w:t xml:space="preserve">For one user over time:</w:t>
+      </w:r>
+      <w:r>
+        <w:t xml:space="preserve"> "aggregating the days data from day to day for each user, providing daily recommendations," and "As for daily learning, it uses the daily confirmations." Feature 5 bases recommendations on "their history of using the app." Story (13) and (14) say "over time the app learns what the user eats." Story (21) supplies the input: a "yes/no answer" each day plus changed foods, restaurant meals, amounts and workout details. Story (16) and (17) add the daily workout plan, with workout type, time and calories burned. The Daily Health Score rolls the user's own record up "daily, weekly, and monthly."</w:t>
+      </w:r>
+    </w:p>
+    <w:p>
+      <w:pPr>
+        <w:numPr>
+          <w:ilvl w:val="0"/>
+          <w:numId w:val="1"/>
+        </w:numPr>
+      </w:pPr>
+      <w:r>
+        <w:rPr>
+          <w:b/>
+        </w:rPr>
+        <w:t xml:space="preserve">For everyone as more people join, through popular choices:</w:t>
+      </w:r>
+      <w:r>
+        <w:t xml:space="preserve"> "providing updates regarding popular choices for top 10% of users on the app, providing weekly recommendations to all users." A popular choice is what the top 10% "average choices are ... based on their End of Day Daily Confirmation Audit," and for choices that aren't numbers it's "the amount of times that option was chosen by the Top 10% of users."</w:t>
+      </w:r>
+    </w:p>
+    <w:p>
+      <w:pPr>
+        <w:numPr>
+          <w:ilvl w:val="0"/>
+          <w:numId w:val="1"/>
+        </w:numPr>
+      </w:pPr>
+      <w:r>
+        <w:rPr>
+          <w:b/>
+        </w:rPr>
+        <w:t xml:space="preserve">Ranking:</w:t>
+      </w:r>
+      <w:r>
+        <w:t xml:space="preserve"> by "yes" answers on all audit items for the week. Users who skip a day "do not count." Ties are broken alphabetically by avatar name. If fewer than 10% qualify, the remaining users are ranked the same way.</w:t>
+      </w:r>
+    </w:p>
+    <w:p>
+      <w:pPr>
+        <w:numPr>
+          <w:ilvl w:val="0"/>
+          <w:numId w:val="1"/>
+        </w:numPr>
+      </w:pPr>
+      <w:r>
+        <w:rPr>
+          <w:b/>
+        </w:rPr>
+        <w:t xml:space="preserve">Corrected days:</w:t>
+      </w:r>
+      <w:r>
+        <w:t xml:space="preserve"> a day where the user answers "no" and enters changes still qualifies, but "counts less than a “yes” day by 25% less." </w:t>
+      </w:r>
+      <w:r>
+        <w:rPr>
+          <w:b/>
+        </w:rPr>
+        <w:t xml:space="preserve">[INFERRED]</w:t>
+      </w:r>
+      <w:r>
+        <w:t xml:space="preserve"> That makes a corrected day worth 0.75 of a "yes" day.</w:t>
+      </w:r>
+    </w:p>
+    <w:p>
+      <w:pPr>
+        <w:numPr>
+          <w:ilvl w:val="0"/>
+          <w:numId w:val="1"/>
+        </w:numPr>
+      </w:pPr>
+      <w:r>
+        <w:rPr>
+          <w:b/>
+        </w:rPr>
+        <w:t xml:space="preserve">[INFERRED]</w:t>
+      </w:r>
+      <w:r>
+        <w:t xml:space="preserve"> Users who answered "yes" to everything every day tie, and the alphabet orders them. Users with corrected days rank below them. Avatar names start random and users can change them, so a user's alphabetical position can change when they rename.</w:t>
+      </w:r>
+    </w:p>
+    <w:p>
+      <w:pPr>
+        <w:numPr>
+          <w:ilvl w:val="0"/>
+          <w:numId w:val="1"/>
+        </w:numPr>
+      </w:pPr>
+      <w:r>
+        <w:rPr>
+          <w:b/>
+        </w:rPr>
+        <w:t xml:space="preserve">For a user as their own family or friends join (new):</w:t>
+      </w:r>
+      <w:r>
+        <w:t xml:space="preserve"> story (24) groups exist "for accountability, where the user can share their Daily Health Score," and the user can compare that score with "family and/or friends also using the app." </w:t>
+      </w:r>
+      <w:r>
+        <w:rPr>
+          <w:b/>
+        </w:rPr>
+        <w:t xml:space="preserve">[INFERRED]</w:t>
+      </w:r>
+      <w:r>
+        <w:t xml:space="preserve"> This feature only works once people the user knows are on the app, so it becomes more useful to each user as their own contacts join.</w:t>
+      </w:r>
+    </w:p>
+    <w:p>
+      <w:pPr>
+        <w:pBdr>
+          <w:bottom w:val="single" w:sz="6" w:space="6" w:color="C9CCD1"/>
+        </w:pBdr>
+      </w:pPr>
+    </w:p>
+    <w:p>
+      <w:pPr>
+        <w:pStyle w:val="Heading1"/>
+      </w:pPr>
+      <w:r>
         <w:t xml:space="preserve">5. WHO WE DEPEND ON</w:t>
       </w:r>
     </w:p>
     <w:p>
       <w:r>
-        <w:t xml:space="preserve">The PRD describes grocery stores and AI agents as "agnostic." It names one outside company, CheapFoodMap, "a third-party app." The list below is what the PRD's features need in order to work. "Could a competitor buy it?" draws on competitors.md wherever it has evidence.</w:t>
+        <w:t xml:space="preserve">The PRD describes grocery stores and AI agents as "agnostic." It names one outside company, CheapFoodMap, "a third-party app." The list below is what the PRD's features need in order to work. "Could a competitor buy it?" draws on competitors.md wherever it has evidence. prd-2.md adds no new outside provider. Story (10) "When to eat" and Feature 7's score sharing rely on the app platform, already listed below.</w:t>
       </w:r>
     </w:p>
     <w:tbl>
@@ -2701,7 +3154,7 @@
                 <w:b/>
                 <w:sz w:val="18"/>
               </w:rPr>
-              <w:t xml:space="preserve">Where prd-1.md implies it</w:t>
+              <w:t xml:space="preserve">Where prd-2.md implies it</w:t>
             </w:r>
           </w:p>
         </w:tc>
@@ -2926,7 +3379,7 @@
               <w:rPr>
                 <w:sz w:val="18"/>
               </w:rPr>
-              <w:t xml:space="preserve">USER line "curated for them by the app via recipes which they choose"; Feature 3 "The app then curates those recipe choices"</w:t>
+              <w:t xml:space="preserve">USER line "an app that will curate healthy eating choices via recipes which they choose"; Feature 3 "The app then curates those recipe choices"</w:t>
             </w:r>
           </w:p>
         </w:tc>
@@ -3003,7 +3456,7 @@
               <w:rPr>
                 <w:sz w:val="18"/>
               </w:rPr>
-              <w:t xml:space="preserve">Story (10), (11): "reads a menu (online or from a photo)"</w:t>
+              <w:t xml:space="preserve">Story (11), (12): "reads a menu (online or from a photo)"</w:t>
             </w:r>
           </w:p>
         </w:tc>
@@ -3067,7 +3520,7 @@
               <w:rPr>
                 <w:sz w:val="18"/>
               </w:rPr>
-              <w:t xml:space="preserve">Story (10), (11), (13)</w:t>
+              <w:t xml:space="preserve">Story (11), (12), (14)</w:t>
             </w:r>
           </w:p>
         </w:tc>
@@ -3124,7 +3577,7 @@
               <w:rPr>
                 <w:sz w:val="18"/>
               </w:rPr>
-              <w:t xml:space="preserve">Story (13) "(via CheapFoodMap app)"; "the AI agent will read that CheapFoodMap recommendation of food under $10"</w:t>
+              <w:t xml:space="preserve">Story (14) "(via CheapFoodMap app)"; "the AI agent will read that CheapFoodMap recommendation of food under $10"</w:t>
             </w:r>
           </w:p>
         </w:tc>
@@ -3201,7 +3654,7 @@
               <w:rPr>
                 <w:sz w:val="18"/>
               </w:rPr>
-              <w:t xml:space="preserve">Story (12): "recommends ... grocery sales, discounts and promos"</w:t>
+              <w:t xml:space="preserve">Story (13): "recommends ... grocery sales, discounts and promos"</w:t>
             </w:r>
           </w:p>
         </w:tc>
@@ -3470,7 +3923,7 @@
               <w:rPr>
                 <w:sz w:val="18"/>
               </w:rPr>
-              <w:t xml:space="preserve">Story (19) "by providing contact information"; "contact information will be listed on the app (the contact information will be provided later)"; bookable "Monday through Friday, 8:00 to 5:00 PM, Central Time"</w:t>
+              <w:t xml:space="preserve">Story (20) "by providing contact information"; "contact information will be listed on the app (the contact information will be provided later)"; bookable "Monday through Friday, 8:00 to 5:00 PM, Central Time"</w:t>
             </w:r>
           </w:p>
         </w:tc>
@@ -3534,7 +3987,7 @@
               <w:rPr>
                 <w:sz w:val="18"/>
               </w:rPr>
-              <w:t xml:space="preserve">Story (14): "educates the user on how to work out"</w:t>
+              <w:t xml:space="preserve">Story (15): "educates the user on how to work out"</w:t>
             </w:r>
           </w:p>
         </w:tc>
@@ -3598,7 +4051,7 @@
               <w:rPr>
                 <w:sz w:val="18"/>
               </w:rPr>
-              <w:t xml:space="preserve">Story (18): "positive quotes"</w:t>
+              <w:t xml:space="preserve">Story (19): "positive quotes"</w:t>
             </w:r>
           </w:p>
         </w:tc>
@@ -3662,7 +4115,7 @@
               <w:rPr>
                 <w:sz w:val="18"/>
               </w:rPr>
-              <w:t xml:space="preserve">"Inbody Scan Statistical information"</w:t>
+              <w:t xml:space="preserve">"Inbody Scan Statistical information" (optional)</w:t>
             </w:r>
           </w:p>
         </w:tc>
@@ -3739,23 +4192,36 @@
               <w:rPr>
                 <w:sz w:val="18"/>
               </w:rPr>
-              <w:t xml:space="preserve">"the app" throughout</w:t>
-            </w:r>
-          </w:p>
-        </w:tc>
-        <w:tc>
-          <w:tcPr>
-            <w:tcW w:w="3360" w:type="dxa"/>
-          </w:tcPr>
-          <w:p>
-            <w:pPr>
-              <w:spacing w:before="40" w:after="40"/>
-            </w:pPr>
-            <w:r>
-              <w:rPr>
-                <w:sz w:val="18"/>
-              </w:rPr>
-              <w:t xml:space="preserve">Which platforms is not stated. Yes, others can use them: all nine apps in competitors.md are on the App Store.</w:t>
+              <w:t xml:space="preserve">"the app" throughout; story (10) letting "the user know when to eat"; Feature 7 sharing scores between users</w:t>
+            </w:r>
+          </w:p>
+        </w:tc>
+        <w:tc>
+          <w:tcPr>
+            <w:tcW w:w="3360" w:type="dxa"/>
+          </w:tcPr>
+          <w:p>
+            <w:pPr>
+              <w:spacing w:before="40" w:after="40"/>
+            </w:pPr>
+            <w:r>
+              <w:rPr>
+                <w:sz w:val="18"/>
+              </w:rPr>
+              <w:t xml:space="preserve">Which platforms is not stated. </w:t>
+            </w:r>
+            <w:r>
+              <w:rPr>
+                <w:b/>
+                <w:sz w:val="18"/>
+              </w:rPr>
+              <w:t xml:space="preserve">[INFERRED]</w:t>
+            </w:r>
+            <w:r>
+              <w:rPr>
+                <w:sz w:val="18"/>
+              </w:rPr>
+              <w:t xml:space="preserve"> Any reminders for story (10) would use the platform's own notification service, which any app can use. All nine apps in competitors.md are on the App Store.</w:t>
             </w:r>
           </w:p>
         </w:tc>
@@ -3903,7 +4369,7 @@
     </w:p>
     <w:p>
       <w:r>
-        <w:t xml:space="preserve">The data behind daily and weekly recommendations comes from HushPlate's own users (Feature 5, DATA WE STORE), so it isn't an outside dependency. </w:t>
+        <w:t xml:space="preserve">The data behind daily and weekly recommendations, the Daily Health Score and family and friend groups comes from HushPlate's own users, so it isn't an outside dependency. </w:t>
       </w:r>
       <w:r>
         <w:rPr>
@@ -3912,7 +4378,7 @@
         <w:t xml:space="preserve">[INFERRED]</w:t>
       </w:r>
       <w:r>
-        <w:t xml:space="preserve"> A competitor can't buy HushPlate's own user history, but can build its own from its own users.</w:t>
+        <w:t xml:space="preserve"> A competitor can't buy HushPlate's own user history or its users' family and friend groups, but can build its own from its own users.</w:t>
       </w:r>
     </w:p>
     <w:p>
@@ -3935,7 +4401,7 @@
         <w:rPr>
           <w:b/>
         </w:rPr>
-        <w:t xml:space="preserve">What prd-1.md says:</w:t>
+        <w:t xml:space="preserve">What prd-2.md says:</w:t>
       </w:r>
     </w:p>
     <w:p>
@@ -3956,23 +4422,234 @@
           <w:left w:val="single" w:sz="18" w:space="8" w:color="9AA0A6"/>
         </w:pBdr>
       </w:pPr>
-      <w:r>
-        <w:t xml:space="preserve">[Everything else you are tempted by. Write it down so you can stop thinking about it.]</w:t>
-      </w:r>
-    </w:p>
-    <w:p>
-      <w:r>
-        <w:t xml:space="preserve">The section holds the template's placeholder text again. The seven parked items in the 13:00–13:10 versions have been removed. </w:t>
-      </w:r>
-      <w:r>
-        <w:rPr>
-          <w:b/>
-        </w:rPr>
-        <w:t xml:space="preserve">Nothing has been ruled out.</w:t>
-      </w:r>
-      <w:r>
-        <w:t xml:space="preserve"> There are no items, so there is nothing the product is barred from doing because of this list.</w:t>
-      </w:r>
+    </w:p>
+    <w:p>
+      <w:pPr>
+        <w:ind w:left="360"/>
+        <w:pBdr>
+          <w:left w:val="single" w:sz="18" w:space="8" w:color="9AA0A6"/>
+        </w:pBdr>
+      </w:pPr>
+      <w:r>
+        <w:t xml:space="preserve">Permanently out of scope items: Inventory (we do not keep any inventory).</w:t>
+      </w:r>
+    </w:p>
+    <w:p>
+      <w:pPr>
+        <w:ind w:left="360"/>
+        <w:pBdr>
+          <w:left w:val="single" w:sz="18" w:space="8" w:color="9AA0A6"/>
+        </w:pBdr>
+      </w:pPr>
+    </w:p>
+    <w:p>
+      <w:pPr>
+        <w:ind w:left="360"/>
+        <w:pBdr>
+          <w:left w:val="single" w:sz="18" w:space="8" w:color="9AA0A6"/>
+        </w:pBdr>
+      </w:pPr>
+      <w:r>
+        <w:t xml:space="preserve">Temporarily out of scope: [May fill this in later]</w:t>
+      </w:r>
+    </w:p>
+    <w:tbl>
+      <w:tblPr>
+        <w:tblW w:w="10080" w:type="dxa"/>
+        <w:tblBorders>
+          <w:top w:val="single" w:sz="4" w:space="0" w:color="C9CCD1"/>
+          <w:left w:val="single" w:sz="4" w:space="0" w:color="C9CCD1"/>
+          <w:bottom w:val="single" w:sz="4" w:space="0" w:color="C9CCD1"/>
+          <w:right w:val="single" w:sz="4" w:space="0" w:color="C9CCD1"/>
+          <w:insideH w:val="single" w:sz="4" w:space="0" w:color="C9CCD1"/>
+          <w:insideV w:val="single" w:sz="4" w:space="0" w:color="C9CCD1"/>
+        </w:tblBorders>
+        <w:tblLayout w:type="fixed"/>
+      </w:tblPr>
+      <w:tblGrid>
+        <w:gridCol w:w="3360"/>
+        <w:gridCol w:w="3360"/>
+        <w:gridCol w:w="3360"/>
+      </w:tblGrid>
+      <w:tr>
+        <w:trPr>
+          <w:tblHeader/>
+        </w:trPr>
+        <w:tc>
+          <w:tcPr>
+            <w:tcW w:w="3360" w:type="dxa"/>
+            <w:shd w:val="clear" w:color="auto" w:fill="EFF1F3"/>
+          </w:tcPr>
+          <w:p>
+            <w:pPr>
+              <w:spacing w:before="40" w:after="40"/>
+            </w:pPr>
+            <w:r>
+              <w:rPr>
+                <w:b/>
+                <w:sz w:val="18"/>
+              </w:rPr>
+              <w:t xml:space="preserve">Item</w:t>
+            </w:r>
+          </w:p>
+        </w:tc>
+        <w:tc>
+          <w:tcPr>
+            <w:tcW w:w="3360" w:type="dxa"/>
+            <w:shd w:val="clear" w:color="auto" w:fill="EFF1F3"/>
+          </w:tcPr>
+          <w:p>
+            <w:pPr>
+              <w:spacing w:before="40" w:after="40"/>
+            </w:pPr>
+            <w:r>
+              <w:rPr>
+                <w:b/>
+                <w:sz w:val="18"/>
+              </w:rPr>
+              <w:t xml:space="preserve">Status</w:t>
+            </w:r>
+          </w:p>
+        </w:tc>
+        <w:tc>
+          <w:tcPr>
+            <w:tcW w:w="3360" w:type="dxa"/>
+            <w:shd w:val="clear" w:color="auto" w:fill="EFF1F3"/>
+          </w:tcPr>
+          <w:p>
+            <w:pPr>
+              <w:spacing w:before="40" w:after="40"/>
+            </w:pPr>
+            <w:r>
+              <w:rPr>
+                <w:b/>
+                <w:sz w:val="18"/>
+              </w:rPr>
+              <w:t xml:space="preserve">What the product can't do while it stays out</w:t>
+            </w:r>
+          </w:p>
+        </w:tc>
+      </w:tr>
+      <w:tr>
+        <w:tc>
+          <w:tcPr>
+            <w:tcW w:w="3360" w:type="dxa"/>
+          </w:tcPr>
+          <w:p>
+            <w:pPr>
+              <w:spacing w:before="40" w:after="40"/>
+            </w:pPr>
+            <w:r>
+              <w:rPr>
+                <w:b/>
+                <w:sz w:val="18"/>
+              </w:rPr>
+              <w:t xml:space="preserve">Inventory</w:t>
+            </w:r>
+            <w:r>
+              <w:rPr>
+                <w:sz w:val="18"/>
+              </w:rPr>
+              <w:t xml:space="preserve"> ("we do not keep any inventory")</w:t>
+            </w:r>
+          </w:p>
+        </w:tc>
+        <w:tc>
+          <w:tcPr>
+            <w:tcW w:w="3360" w:type="dxa"/>
+          </w:tcPr>
+          <w:p>
+            <w:pPr>
+              <w:spacing w:before="40" w:after="40"/>
+            </w:pPr>
+            <w:r>
+              <w:rPr>
+                <w:sz w:val="18"/>
+              </w:rPr>
+              <w:t xml:space="preserve">Permanent</w:t>
+            </w:r>
+          </w:p>
+        </w:tc>
+        <w:tc>
+          <w:tcPr>
+            <w:tcW w:w="3360" w:type="dxa"/>
+          </w:tcPr>
+          <w:p>
+            <w:pPr>
+              <w:spacing w:before="40" w:after="40"/>
+            </w:pPr>
+            <w:r>
+              <w:rPr>
+                <w:b/>
+                <w:sz w:val="18"/>
+              </w:rPr>
+              <w:t xml:space="preserve">[INFERRED]</w:t>
+            </w:r>
+            <w:r>
+              <w:rPr>
+                <w:sz w:val="18"/>
+              </w:rPr>
+              <w:t xml:space="preserve"> Hold or sell food stock of its own. Every grocery item reaches the user from a grocery store, either through the AI agent (Feature 3 options 2 and 3) or by the user shopping (option 1). The product can't fill an order itself if no store or agent can. This doesn't affect the user's own pantry list (story 6), which is the user's food, not the company's.</w:t>
+            </w:r>
+          </w:p>
+        </w:tc>
+      </w:tr>
+      <w:tr>
+        <w:tc>
+          <w:tcPr>
+            <w:tcW w:w="3360" w:type="dxa"/>
+          </w:tcPr>
+          <w:p>
+            <w:pPr>
+              <w:spacing w:before="40" w:after="40"/>
+            </w:pPr>
+            <w:r>
+              <w:rPr>
+                <w:b/>
+                <w:sz w:val="18"/>
+              </w:rPr>
+              <w:t xml:space="preserve">Temporarily out of scope</w:t>
+            </w:r>
+          </w:p>
+        </w:tc>
+        <w:tc>
+          <w:tcPr>
+            <w:tcW w:w="3360" w:type="dxa"/>
+          </w:tcPr>
+          <w:p>
+            <w:pPr>
+              <w:spacing w:before="40" w:after="40"/>
+            </w:pPr>
+            <w:r>
+              <w:rPr>
+                <w:sz w:val="18"/>
+              </w:rPr>
+              <w:t xml:space="preserve">Placeholder: "[May fill this in later]"</w:t>
+            </w:r>
+          </w:p>
+        </w:tc>
+        <w:tc>
+          <w:tcPr>
+            <w:tcW w:w="3360" w:type="dxa"/>
+          </w:tcPr>
+          <w:p>
+            <w:pPr>
+              <w:spacing w:before="40" w:after="40"/>
+            </w:pPr>
+            <w:r>
+              <w:rPr>
+                <w:sz w:val="18"/>
+              </w:rPr>
+              <w:t xml:space="preserve">Nothing. There are no items.</w:t>
+            </w:r>
+          </w:p>
+        </w:tc>
+      </w:tr>
+    </w:tbl>
+    <w:p>
+      <w:pPr>
+        <w:spacing w:after="0"/>
+      </w:pPr>
     </w:p>
     <w:p>
       <w:r>
@@ -3982,7 +4659,7 @@
         <w:t xml:space="preserve">[INFERRED]</w:t>
       </w:r>
       <w:r>
-        <w:t xml:space="preserve"> Features 1–3 cover story (1) through (9). Feature 1 also collects the workout plan (16). Feature 4 names "(#10 to #20)," Feature 5 repeats story (21), and Feature 6 matches story (22). As written, every story item is in scope.</w:t>
+        <w:t xml:space="preserve"> Features 1–3 cover story (1) through (9). Feature 1 also collects the workout plan (17). Feature 4 names "(#10 to #21)," Feature 5 repeats story (22), Feature 6 matches story (23), and Feature 7 covers story (24) and the Daily Health Score. As written, every story item is in scope.</w:t>
       </w:r>
     </w:p>
     <w:p>
@@ -3993,7 +4670,7 @@
         <w:t xml:space="preserve">[INFERRED]</w:t>
       </w:r>
       <w:r>
-        <w:t xml:space="preserve"> One item is put off in the PRD text, not in the list: the doctor's contact information ("will be provided later"). Until it's provided, story (19) has no doctor to contact.</w:t>
+        <w:t xml:space="preserve"> One item is put off in the PRD text, not in the list: the doctor's contact information ("will be provided later"). Until it's provided, story (20) has no doctor to contact.</w:t>
       </w:r>
     </w:p>
     <w:p>
@@ -4013,7 +4690,7 @@
     </w:p>
     <w:p>
       <w:r>
-        <w:t xml:space="preserve">These are the places where prd-1.md does not answer the six questions above. None of them is filled in here.</w:t>
+        <w:t xml:space="preserve">These are the places where prd-2.md does not answer the six questions above. None of them is filled in here.</w:t>
       </w:r>
     </w:p>
     <w:p>
@@ -4062,6 +4739,119 @@
         </w:numPr>
       </w:pPr>
       <w:r>
+        <w:t xml:space="preserve">How the app decides when the user should eat (story 10), and how it tells them: an alert, or a screen they check.</w:t>
+      </w:r>
+    </w:p>
+    <w:p>
+      <w:pPr>
+        <w:numPr>
+          <w:ilvl w:val="0"/>
+          <w:numId w:val="1"/>
+        </w:numPr>
+      </w:pPr>
+      <w:r>
+        <w:t xml:space="preserve">What other metrics go into the Daily Health Score. The PRD says it "contains several metrics" but lists two.</w:t>
+      </w:r>
+    </w:p>
+    <w:p>
+      <w:pPr>
+        <w:numPr>
+          <w:ilvl w:val="0"/>
+          <w:numId w:val="1"/>
+        </w:numPr>
+      </w:pPr>
+      <w:r>
+        <w:t xml:space="preserve">How the two metrics are combined into one score: equal weight or otherwise.</w:t>
+      </w:r>
+    </w:p>
+    <w:p>
+      <w:pPr>
+        <w:numPr>
+          <w:ilvl w:val="0"/>
+          <w:numId w:val="1"/>
+        </w:numPr>
+      </w:pPr>
+      <w:r>
+        <w:t xml:space="preserve">How the Daily Health Score's food metric, "the amount of food eaten compared to daily recipes chosen," works on days the user eats at a restaurant instead of cooking.</w:t>
+      </w:r>
+    </w:p>
+    <w:p>
+      <w:pPr>
+        <w:numPr>
+          <w:ilvl w:val="0"/>
+          <w:numId w:val="1"/>
+        </w:numPr>
+      </w:pPr>
+      <w:r>
+        <w:t xml:space="preserve">Which story item the score's workout metric means. It cites "#16 in CORE USER Story," which is workout tracking; the workout plan is (17).</w:t>
+      </w:r>
+    </w:p>
+    <w:p>
+      <w:pPr>
+        <w:numPr>
+          <w:ilvl w:val="0"/>
+          <w:numId w:val="1"/>
+        </w:numPr>
+      </w:pPr>
+      <w:r>
+        <w:t xml:space="preserve">How family and friend groups are formed: how a user invites or adds someone, and whether a user can belong to more than one group.</w:t>
+      </w:r>
+    </w:p>
+    <w:p>
+      <w:r>
+        <w:rPr>
+          <w:b/>
+        </w:rPr>
+        <w:t xml:space="preserve">What we hold (3)</w:t>
+      </w:r>
+    </w:p>
+    <w:p>
+      <w:pPr>
+        <w:numPr>
+          <w:ilvl w:val="0"/>
+          <w:numId w:val="1"/>
+        </w:numPr>
+      </w:pPr>
+      <w:r>
+        <w:t xml:space="preserve">Whether top-10% users' Daily Health Scores are visible to all users. Users can compare "against the Top 10% of users," but DATA WE STORE lists only top-10% "choices" as visible.</w:t>
+      </w:r>
+    </w:p>
+    <w:p>
+      <w:pPr>
+        <w:numPr>
+          <w:ilvl w:val="0"/>
+          <w:numId w:val="1"/>
+        </w:numPr>
+      </w:pPr>
+      <w:r>
+        <w:t xml:space="preserve">How family and friend groups fit with "Other users should not be able to link back avatar names to any user." </w:t>
+      </w:r>
+      <w:r>
+        <w:rPr>
+          <w:b/>
+        </w:rPr>
+        <w:t xml:space="preserve">[INFERRED]</w:t>
+      </w:r>
+      <w:r>
+        <w:t xml:space="preserve"> Members of a family or friend group would usually know who each other are.</w:t>
+      </w:r>
+    </w:p>
+    <w:p>
+      <w:r>
+        <w:rPr>
+          <w:b/>
+        </w:rPr>
+        <w:t xml:space="preserve">Does it get better with use (4)</w:t>
+      </w:r>
+    </w:p>
+    <w:p>
+      <w:pPr>
+        <w:numPr>
+          <w:ilvl w:val="0"/>
+          <w:numId w:val="1"/>
+        </w:numPr>
+      </w:pPr>
+      <w:r>
         <w:t xml:space="preserve">None found in this version.</w:t>
       </w:r>
     </w:p>
@@ -4070,44 +4860,6 @@
         <w:rPr>
           <w:b/>
         </w:rPr>
-        <w:t xml:space="preserve">What we hold (3)</w:t>
-      </w:r>
-    </w:p>
-    <w:p>
-      <w:pPr>
-        <w:numPr>
-          <w:ilvl w:val="0"/>
-          <w:numId w:val="1"/>
-        </w:numPr>
-      </w:pPr>
-      <w:r>
-        <w:t xml:space="preserve">None found in this version.</w:t>
-      </w:r>
-    </w:p>
-    <w:p>
-      <w:r>
-        <w:rPr>
-          <w:b/>
-        </w:rPr>
-        <w:t xml:space="preserve">Does it get better with use (4)</w:t>
-      </w:r>
-    </w:p>
-    <w:p>
-      <w:pPr>
-        <w:numPr>
-          <w:ilvl w:val="0"/>
-          <w:numId w:val="1"/>
-        </w:numPr>
-      </w:pPr>
-      <w:r>
-        <w:t xml:space="preserve">None found in this version. Daily learning "uses the daily confirmations."</w:t>
-      </w:r>
-    </w:p>
-    <w:p>
-      <w:r>
-        <w:rPr>
-          <w:b/>
-        </w:rPr>
         <w:t xml:space="preserve">Who we depend on (5)</w:t>
       </w:r>
     </w:p>
@@ -4215,7 +4967,18 @@
         </w:numPr>
       </w:pPr>
       <w:r>
-        <w:t xml:space="preserve">The entire out-of-scope list. It is template text again.</w:t>
+        <w:t xml:space="preserve">What "Inventory" covers beyond "we do not keep any inventory."</w:t>
+      </w:r>
+    </w:p>
+    <w:p>
+      <w:pPr>
+        <w:numPr>
+          <w:ilvl w:val="0"/>
+          <w:numId w:val="1"/>
+        </w:numPr>
+      </w:pPr>
+      <w:r>
+        <w:t xml:space="preserve">The temporarily out-of-scope list. It says only "[May fill this in later]."</w:t>
       </w:r>
     </w:p>
     <w:sectPr>

</xml_diff>

<commit_message>
Update prd-2.md audit to the 16:17 version
Covers meal timing (6 meals, 3 hours apart, last meal 3 hours before
bed), the three-part Daily Health Score (50/30/20), how family and
friend groups are formed, and group visibility of avatar names.

Co-Authored-By: Claude Opus 5.5 <noreply@anthropic.com>
</commit_message>
<xml_diff>
--- a/07_DietGroceryApp/strategy/spec-audit-UPDATED.docx
+++ b/07_DietGroceryApp/strategy/spec-audit-UPDATED.docx
@@ -18,7 +18,7 @@
         <w:t xml:space="preserve">Prepared:</w:t>
       </w:r>
       <w:r>
-        <w:t xml:space="preserve"> October 20, 2026 (written against the 15:39 version of prd-2.md)</w:t>
+        <w:t xml:space="preserve"> October 20, 2026 (written against the 16:17 version of prd-2.md)</w:t>
       </w:r>
     </w:p>
     <w:p>
@@ -694,6 +694,41 @@
                 <w:sz w:val="18"/>
               </w:rPr>
               <w:t xml:space="preserve">Enters a workout plan. Story (17): "input their daily workouts that they plan to do each day, when inputting their health statistics." The user sets "the number of time they plan to spend on that activity as part of the initial survey," and the app "will ask the length of time for the cardiovascular work, and the free weight work."</w:t>
+            </w:r>
+          </w:p>
+        </w:tc>
+      </w:tr>
+      <w:tr>
+        <w:tc>
+          <w:tcPr>
+            <w:tcW w:w="5040" w:type="dxa"/>
+          </w:tcPr>
+          <w:p>
+            <w:pPr>
+              <w:spacing w:before="40" w:after="40"/>
+            </w:pPr>
+          </w:p>
+        </w:tc>
+        <w:tc>
+          <w:tcPr>
+            <w:tcW w:w="5040" w:type="dxa"/>
+          </w:tcPr>
+          <w:p>
+            <w:pPr>
+              <w:spacing w:before="40" w:after="40"/>
+            </w:pPr>
+            <w:r>
+              <w:rPr>
+                <w:b/>
+                <w:sz w:val="18"/>
+              </w:rPr>
+              <w:t xml:space="preserve">[INFERRED]</w:t>
+            </w:r>
+            <w:r>
+              <w:rPr>
+                <w:sz w:val="18"/>
+              </w:rPr>
+              <w:t xml:space="preserve"> Adds family and friends to a group during onboarding if they know their avatar names (see Feature 7).</w:t>
             </w:r>
           </w:p>
         </w:tc>
@@ -1343,23 +1378,23 @@
               <w:rPr>
                 <w:sz w:val="18"/>
               </w:rPr>
-              <w:t xml:space="preserve">"the app will let the user know when to eat the appropriate food amounts throughout the day according to the recipes selected by the user"</w:t>
-            </w:r>
-          </w:p>
-        </w:tc>
-        <w:tc>
-          <w:tcPr>
-            <w:tcW w:w="3360" w:type="dxa"/>
-          </w:tcPr>
-          <w:p>
-            <w:pPr>
-              <w:spacing w:before="40" w:after="40"/>
-            </w:pPr>
-            <w:r>
-              <w:rPr>
-                <w:sz w:val="18"/>
-              </w:rPr>
-              <w:t xml:space="preserve">Eats at those times. </w:t>
+              <w:t xml:space="preserve">"the app will let the user know when to eat the appropriate food amounts throughout the day according to the recipes selected by the user, with the last meal of the day eaten 3 hours before bed." Elsewhere: "When to eat, the app tells the user when to eat based on spaced eating habits, with meals spaced at intervals of a meal every 3 hours, for 6 total meals a day for the users daily nutritional requirements. The user must have their last meal 3 hours before bedtime for the Daily Health Score."</w:t>
+            </w:r>
+          </w:p>
+        </w:tc>
+        <w:tc>
+          <w:tcPr>
+            <w:tcW w:w="3360" w:type="dxa"/>
+          </w:tcPr>
+          <w:p>
+            <w:pPr>
+              <w:spacing w:before="40" w:after="40"/>
+            </w:pPr>
+            <w:r>
+              <w:rPr>
+                <w:sz w:val="18"/>
+              </w:rPr>
+              <w:t xml:space="preserve">Eats at those times, with the last meal 3 hours before bed. </w:t>
             </w:r>
             <w:r>
               <w:rPr>
@@ -1372,7 +1407,7 @@
               <w:rPr>
                 <w:sz w:val="18"/>
               </w:rPr>
-              <w:t xml:space="preserve"> The PRD doesn't say how the user is told (an alert, or a screen they check).</w:t>
+              <w:t xml:space="preserve"> The PRD doesn't say how the user is told (an alert, or a screen they check), or how the app learns the user's bedtime.</w:t>
             </w:r>
           </w:p>
         </w:tc>
@@ -2379,7 +2414,7 @@
         </w:pBdr>
       </w:pPr>
       <w:r>
-        <w:t xml:space="preserve">The app will also provide a user a Daily Health Score, that will be aggregated on the app based on their End of Daily Confirmation Audit. The Daily Health Score contains several metrics to average the users health score according: (1) the amount of food eaten compared to daily recipes chosen (#7 in CORE USER Story), and (2) the amount of workout time actually worked out compared to the daily workout plan chosen (#16 in CORE USER Story). ... The app will give a user a Daily Health Score everyday after the End of Day Audit. The user can then compare that score with other users of the app, either against the Top 10% of users, or family and/or friends also using the app who the user shares the data with in a family and/or friend group.</w:t>
+        <w:t xml:space="preserve">The app will also provide a user a Daily Health Score, that will be aggregated on the app based on their End of Daily Confirmation Audit. The Daily Health Score contains several metrics to average the users health score according: (1) the amount of food eaten compared to daily recipe meal chosen, or restaurant meal chosen (#7 or #11 in CORE USER Story) (scored out of 50), (2) the amount of workout time actually worked out compared to the daily workout plan chosen (#17 in CORE USER Story) (scored out of 30), and (3) whether a user ate their last meal 3 hours before bed time (#10 in CORE USER Story) (scored out of 20). The health score can be used by the user to track daily, weekly, monthly goals based how well the user has been able to stick to using the app. The app will give a user a Daily Health Score everyday after the End of Day Audit. The user can then compare that score with other users of the app, either against the Top 10% of users, or family and/or friends also using the app who the user shares the data with in a family and/or friend group. The Daily Health Score aggregates the data on a daily, weekly, and monthly basis.</w:t>
       </w:r>
     </w:p>
     <w:p>
@@ -2458,7 +2493,20 @@
               <w:rPr>
                 <w:sz w:val="18"/>
               </w:rPr>
-              <w:t xml:space="preserve">Works out a Daily Health Score after each daily audit from "(1) the amount of food eaten compared to daily recipes chosen" and "(2) the amount of workout time actually worked out compared to the daily workout plan chosen."</w:t>
+              <w:t xml:space="preserve">Works out a Daily Health Score after each daily audit from three parts: "(1) the amount of food eaten compared to daily recipe meal chosen, or restaurant meal chosen (#7 or #11 in CORE USER Story) (scored out of 50)," "(2) the amount of workout time actually worked out compared to the daily workout plan chosen (#17 in CORE USER Story) (scored out of 30)," and "(3) whether a user ate their last meal 3 hours before bed time (#10 in CORE USER Story) (scored out of 20)." </w:t>
+            </w:r>
+            <w:r>
+              <w:rPr>
+                <w:b/>
+                <w:sz w:val="18"/>
+              </w:rPr>
+              <w:t xml:space="preserve">[INFERRED]</w:t>
+            </w:r>
+            <w:r>
+              <w:rPr>
+                <w:sz w:val="18"/>
+              </w:rPr>
+              <w:t xml:space="preserve"> The three parts add up to 100.</w:t>
             </w:r>
           </w:p>
         </w:tc>
@@ -2508,7 +2556,7 @@
               <w:rPr>
                 <w:sz w:val="18"/>
               </w:rPr>
-              <w:t xml:space="preserve">Creates a family group and/or friend group (story 24). </w:t>
+              <w:t xml:space="preserve">Adds family and friends to their group. "the user can include family and/or friends into their group when filing out the onboarding process as long as they know the users avatar name. After the onboarding process, the user can add family and/or friends to their group by sending a request to add the family member and/or friend by sending a friend request." </w:t>
             </w:r>
             <w:r>
               <w:rPr>
@@ -2521,7 +2569,7 @@
               <w:rPr>
                 <w:sz w:val="18"/>
               </w:rPr>
-              <w:t xml:space="preserve"> Gets family or friends to join the app and the group; the PRD doesn't say how.</w:t>
+              <w:t xml:space="preserve"> The user has to get the other person's avatar name from them outside the app.</w:t>
             </w:r>
           </w:p>
         </w:tc>
@@ -2596,7 +2644,7 @@
     </w:p>
     <w:p>
       <w:r>
-        <w:t xml:space="preserve">The score paragraph cites the workout plan as "#16 in CORE USER Story." In this version (16) is "Workout tracking and motivation" and the workout plan is (17).</w:t>
+        <w:t xml:space="preserve">The group paragraph places adding family and friends inside "the onboarding process," but Feature 1's line doesn't list it.</w:t>
       </w:r>
     </w:p>
     <w:p>
@@ -2630,7 +2678,7 @@
         </w:pBdr>
       </w:pPr>
       <w:r>
-        <w:t xml:space="preserve">DATA WE STORE: The user will be providing health statistics about themselves listed in the CORE STORY. Those statistics must be kept on the app and may be updated periodically by the user in connection with their longevity doctor. Combine data across users regarding popular choices for CORE STORY items #1 to #19 but do so in a deidentified way where only an avatar name is used. Avatar names for the Top 10% of users can be seen by other users, and their choices are visible, except their excluded foods and allergies, and their pantry use. Top 10% of Users cannot opt out of having their choices shown. Users can see other avatar names. Other users should not be able to link back avatar names to any user. Make sure to protect the data and avatar names consistent with United States (State and Federal) data privacy laws. We do not store payment and address data. We do retain data for the user to export as a User Health Report to provide to their doctor. All data about a user is maintained for the user until the user terminates services with the app. The user can delete their data from the app upon termination. Users cannot delete app data before ending services. Payment and address data will be taken by the AI agent that this app connects to via an API. Please maintain all data consistent with United States (State and Federal) data privacy laws.</w:t>
+        <w:t xml:space="preserve">DATA WE STORE: The user will be providing health statistics about themselves listed in the CORE STORY. Those statistics must be kept on the app and may be updated periodically by the user in connection with their longevity doctor. Combine data across users regarding popular choices for CORE STORY items #1 to #19 but do so in a deidentified way where only an avatar name is used. Avatar names for the Top 10% of users can be seen by other users, and their choices are visible, except their excluded foods and allergies, and their pantry use. Top 10% of Users cannot opt out of having their choices shown. Users can see other avatar names. Users can compare scores with family groups and/or friend groups, which their user avatar names are visible to family groups and/or friend groups. Other users should not be able to link back avatar names to any user. Make sure to protect the data and avatar names consistent with United States (State and Federal) data privacy laws. We do not store payment and address data. We do retain data for the user to export as a User Health Report to provide to their doctor. All data about a user is maintained for the user until the user terminates services with the app. The user can delete their data from the app upon termination. Users cannot delete app data before ending services. Payment and address data will be taken by the AI agent that this app connects to via an API. Please maintain all data consistent with United States (State and Federal) data privacy laws.</w:t>
       </w:r>
     </w:p>
     <w:p>
@@ -2834,7 +2882,7 @@
         </w:numPr>
       </w:pPr>
       <w:r>
-        <w:t xml:space="preserve">A user's Daily Health Score, with members of their family and/or friend group, when the user chooses to share it (Feature 7, story 24).</w:t>
+        <w:t xml:space="preserve">A user's Daily Health Score and avatar name, with members of their family and/or friend group: "Users can compare scores with family groups and/or friend groups, which their user avatar names are visible to family groups and/or friend groups."</w:t>
       </w:r>
     </w:p>
     <w:p>
@@ -4739,62 +4787,40 @@
         </w:numPr>
       </w:pPr>
       <w:r>
-        <w:t xml:space="preserve">How the app decides when the user should eat (story 10), and how it tells them: an alert, or a screen they check.</w:t>
-      </w:r>
-    </w:p>
-    <w:p>
-      <w:pPr>
-        <w:numPr>
-          <w:ilvl w:val="0"/>
-          <w:numId w:val="1"/>
-        </w:numPr>
-      </w:pPr>
-      <w:r>
-        <w:t xml:space="preserve">What other metrics go into the Daily Health Score. The PRD says it "contains several metrics" but lists two.</w:t>
-      </w:r>
-    </w:p>
-    <w:p>
-      <w:pPr>
-        <w:numPr>
-          <w:ilvl w:val="0"/>
-          <w:numId w:val="1"/>
-        </w:numPr>
-      </w:pPr>
-      <w:r>
-        <w:t xml:space="preserve">How the two metrics are combined into one score: equal weight or otherwise.</w:t>
-      </w:r>
-    </w:p>
-    <w:p>
-      <w:pPr>
-        <w:numPr>
-          <w:ilvl w:val="0"/>
-          <w:numId w:val="1"/>
-        </w:numPr>
-      </w:pPr>
-      <w:r>
-        <w:t xml:space="preserve">How the Daily Health Score's food metric, "the amount of food eaten compared to daily recipes chosen," works on days the user eats at a restaurant instead of cooking.</w:t>
-      </w:r>
-    </w:p>
-    <w:p>
-      <w:pPr>
-        <w:numPr>
-          <w:ilvl w:val="0"/>
-          <w:numId w:val="1"/>
-        </w:numPr>
-      </w:pPr>
-      <w:r>
-        <w:t xml:space="preserve">Which story item the score's workout metric means. It cites "#16 in CORE USER Story," which is workout tracking; the workout plan is (17).</w:t>
-      </w:r>
-    </w:p>
-    <w:p>
-      <w:pPr>
-        <w:numPr>
-          <w:ilvl w:val="0"/>
-          <w:numId w:val="1"/>
-        </w:numPr>
-      </w:pPr>
-      <w:r>
-        <w:t xml:space="preserve">How family and friend groups are formed: how a user invites or adds someone, and whether a user can belong to more than one group.</w:t>
+        <w:t xml:space="preserve">How the app tells the user when to eat (an alert, or a screen they check), and how it learns the user's bedtime, which the "3 hours before bed" rule and score part (3) depend on.</w:t>
+      </w:r>
+    </w:p>
+    <w:p>
+      <w:pPr>
+        <w:numPr>
+          <w:ilvl w:val="0"/>
+          <w:numId w:val="1"/>
+        </w:numPr>
+      </w:pPr>
+      <w:r>
+        <w:t xml:space="preserve">How "a meal every 3 hours, for 6 total meals a day" applies to users who pick the "Intermittent Fasting" or "GLP-1 suppressed appetite" diet choices.</w:t>
+      </w:r>
+    </w:p>
+    <w:p>
+      <w:pPr>
+        <w:numPr>
+          <w:ilvl w:val="0"/>
+          <w:numId w:val="1"/>
+        </w:numPr>
+      </w:pPr>
+      <w:r>
+        <w:t xml:space="preserve">How each score part is graded within its points: for example, whether eating most of a meal earns part of the 50, or whether part (3) is all 20 or nothing.</w:t>
+      </w:r>
+    </w:p>
+    <w:p>
+      <w:pPr>
+        <w:numPr>
+          <w:ilvl w:val="0"/>
+          <w:numId w:val="1"/>
+        </w:numPr>
+      </w:pPr>
+      <w:r>
+        <w:t xml:space="preserve">Whether people added to a group during onboarding have to accept, as a "friend request" after onboarding implies, and whether a user can belong to more than one family or friend group.</w:t>
       </w:r>
     </w:p>
     <w:p>
@@ -4824,7 +4850,7 @@
         </w:numPr>
       </w:pPr>
       <w:r>
-        <w:t xml:space="preserve">How family and friend groups fit with "Other users should not be able to link back avatar names to any user." </w:t>
+        <w:t xml:space="preserve">How family and friend groups fit with "Other users should not be able to link back avatar names to any user." Group members exchange avatar names ("as long as they know the users avatar name"), and DATA WE STORE makes avatar names "visible to family groups and/or friend groups." </w:t>
       </w:r>
       <w:r>
         <w:rPr>
@@ -4833,7 +4859,7 @@
         <w:t xml:space="preserve">[INFERRED]</w:t>
       </w:r>
       <w:r>
-        <w:t xml:space="preserve"> Members of a family or friend group would usually know who each other are.</w:t>
+        <w:t xml:space="preserve"> Group members would usually know each other's real identities.</w:t>
       </w:r>
     </w:p>
     <w:p>

</xml_diff>

<commit_message>
Update prd-2.md audit to the 16:35 version
Partial-credit scoring, 3 meals and 3 snacks, bedtime entered in the
daily audit, group requests must be accepted and multiple groups are
allowed, and top-10% Daily Health Scores are visible with no opt-out.

Co-Authored-By: Claude Opus 5.5 <noreply@anthropic.com>
</commit_message>
<xml_diff>
--- a/07_DietGroceryApp/strategy/spec-audit-UPDATED.docx
+++ b/07_DietGroceryApp/strategy/spec-audit-UPDATED.docx
@@ -18,7 +18,7 @@
         <w:t xml:space="preserve">Prepared:</w:t>
       </w:r>
       <w:r>
-        <w:t xml:space="preserve"> October 20, 2026 (written against the 16:17 version of prd-2.md)</w:t>
+        <w:t xml:space="preserve"> October 20, 2026 (written against the 16:35 version of prd-2.md)</w:t>
       </w:r>
     </w:p>
     <w:p>
@@ -38,7 +38,16 @@
         <w:t xml:space="preserve">prd-2.md</w:t>
       </w:r>
       <w:r>
-        <w:t xml:space="preserve"> and </w:t>
+        <w:t xml:space="preserve"> (its header reads </w:t>
+      </w:r>
+      <w:r>
+        <w:rPr>
+          <w:rFonts w:ascii="Consolas" w:hAnsi="Consolas"/>
+        </w:rPr>
+        <w:t xml:space="preserve">FILE: prd-1.md</w:t>
+      </w:r>
+      <w:r>
+        <w:t xml:space="preserve"> in this version) and </w:t>
       </w:r>
       <w:hyperlink r:id="rHl1">
         <w:r>
@@ -396,7 +405,7 @@
         <w:pStyle w:val="Heading2"/>
       </w:pPr>
       <w:r>
-        <w:t xml:space="preserve">Feature 1: "User submits a health statistic form, diet goals, diet choice selection, preferred foods, excluded foods, workout plan, and foods in their pantry and sees a confirmation message."</w:t>
+        <w:t xml:space="preserve">Feature 1: "User submits a health statistic form, diet goals, diet choice selection, preferred foods, excluded foods, workout plan, and foods in their pantry, and family and/or friends and sees a confirmation message."</w:t>
       </w:r>
     </w:p>
     <w:tbl>
@@ -470,7 +479,7 @@
               <w:rPr>
                 <w:sz w:val="18"/>
               </w:rPr>
-              <w:t xml:space="preserve">Shows a form and accepts health statistics, a diet goal, a diet choice, a preferred-foods list, an excluded-foods list, a workout plan and the foods in the user's pantry. Then shows a confirmation.</w:t>
+              <w:t xml:space="preserve">Shows a form and accepts health statistics, a diet goal, a diet choice, a preferred-foods list, an excluded-foods list, a workout plan, the foods in the user's pantry, and family and/or friends. Then shows a confirmation.</w:t>
             </w:r>
           </w:p>
         </w:tc>
@@ -719,6 +728,12 @@
             </w:pPr>
             <w:r>
               <w:rPr>
+                <w:sz w:val="18"/>
+              </w:rPr>
+              <w:t xml:space="preserve">Adds family and friends to a group by avatar name: "the user can include family and/or friends into their group when filing out the onboarding process as long as they know the users avatar name." Each person "must accept the request to be added." </w:t>
+            </w:r>
+            <w:r>
+              <w:rPr>
                 <w:b/>
                 <w:sz w:val="18"/>
               </w:rPr>
@@ -728,7 +743,7 @@
               <w:rPr>
                 <w:sz w:val="18"/>
               </w:rPr>
-              <w:t xml:space="preserve"> Adds family and friends to a group during onboarding if they know their avatar names (see Feature 7).</w:t>
+              <w:t xml:space="preserve"> The user has to get the other person's avatar name from them outside the app.</w:t>
             </w:r>
           </w:p>
         </w:tc>
@@ -1378,23 +1393,23 @@
               <w:rPr>
                 <w:sz w:val="18"/>
               </w:rPr>
-              <w:t xml:space="preserve">"the app will let the user know when to eat the appropriate food amounts throughout the day according to the recipes selected by the user, with the last meal of the day eaten 3 hours before bed." Elsewhere: "When to eat, the app tells the user when to eat based on spaced eating habits, with meals spaced at intervals of a meal every 3 hours, for 6 total meals a day for the users daily nutritional requirements. The user must have their last meal 3 hours before bedtime for the Daily Health Score."</w:t>
-            </w:r>
-          </w:p>
-        </w:tc>
-        <w:tc>
-          <w:tcPr>
-            <w:tcW w:w="3360" w:type="dxa"/>
-          </w:tcPr>
-          <w:p>
-            <w:pPr>
-              <w:spacing w:before="40" w:after="40"/>
-            </w:pPr>
-            <w:r>
-              <w:rPr>
-                <w:sz w:val="18"/>
-              </w:rPr>
-              <w:t xml:space="preserve">Eats at those times, with the last meal 3 hours before bed. </w:t>
+              <w:t xml:space="preserve">"the app will let the user know when to eat the appropriate food amounts throughout the day according to the recipes selected by the user, with the last meal of the day eaten 3 hours before bed." Elsewhere: "When to eat, the app tells the user when to eat based on spaced eating habits, with meals spaced at intervals of a meal every 3 hours, for 6 total meals a day for the users daily nutritional requirements. The meals are broken down into 3 meals, and 3 snacks per day: meal 1, snack 1, meal 2, snack 2, meal 3, snack 3. The user must have their last meal 3 hours before bedtime for the Daily Health Score. During the End of Day Audit, the user inputs their expected bedtime, and confirms their last meal of the day."</w:t>
+            </w:r>
+          </w:p>
+        </w:tc>
+        <w:tc>
+          <w:tcPr>
+            <w:tcW w:w="3360" w:type="dxa"/>
+          </w:tcPr>
+          <w:p>
+            <w:pPr>
+              <w:spacing w:before="40" w:after="40"/>
+            </w:pPr>
+            <w:r>
+              <w:rPr>
+                <w:sz w:val="18"/>
+              </w:rPr>
+              <w:t xml:space="preserve">Eats at those times, with the last meal 3 hours before bed. Enters their expected bedtime and confirms their last meal in the story (21) audit. </w:t>
             </w:r>
             <w:r>
               <w:rPr>
@@ -1407,7 +1422,7 @@
               <w:rPr>
                 <w:sz w:val="18"/>
               </w:rPr>
-              <w:t xml:space="preserve"> The PRD doesn't say how the user is told (an alert, or a screen they check), or how the app learns the user's bedtime.</w:t>
+              <w:t xml:space="preserve"> The PRD doesn't say how the user is told when to eat (an alert, or a screen they check).</w:t>
             </w:r>
           </w:p>
         </w:tc>
@@ -2414,7 +2429,7 @@
         </w:pBdr>
       </w:pPr>
       <w:r>
-        <w:t xml:space="preserve">The app will also provide a user a Daily Health Score, that will be aggregated on the app based on their End of Daily Confirmation Audit. The Daily Health Score contains several metrics to average the users health score according: (1) the amount of food eaten compared to daily recipe meal chosen, or restaurant meal chosen (#7 or #11 in CORE USER Story) (scored out of 50), (2) the amount of workout time actually worked out compared to the daily workout plan chosen (#17 in CORE USER Story) (scored out of 30), and (3) whether a user ate their last meal 3 hours before bed time (#10 in CORE USER Story) (scored out of 20). The health score can be used by the user to track daily, weekly, monthly goals based how well the user has been able to stick to using the app. The app will give a user a Daily Health Score everyday after the End of Day Audit. The user can then compare that score with other users of the app, either against the Top 10% of users, or family and/or friends also using the app who the user shares the data with in a family and/or friend group. The Daily Health Score aggregates the data on a daily, weekly, and monthly basis.</w:t>
+        <w:t xml:space="preserve">The app will also provide a user a Daily Health Score, that will be aggregated on the app based on their End of Daily Confirmation Audit. The Daily Health Score contains several metrics to average the users health score according: (1) the amount of food eaten compared to daily recipe meal chosen, or restaurant meal chosen (#7 or #11 in CORE USER Story) (scored out of 50), (2) the amount of workout time actually worked out compared to the daily workout plan chosen (#17 in CORE USER Story) (scored out of 30), and (3) whether a user ate their last meal 3 hours before bed time (#10 in CORE USER Story) (scored out of 20). The health score can be used by the user to track daily, weekly, monthly goals based how well the user has been able to stick to using the app. The app will give a user a Daily Health Score everyday after the End of Day Audit. The user can then compare that score with other users of the app, either against the Top 10% of users, or family and/or friends also using the app who the user shares the data with in a family and/or friend group. The Daily Health Score aggregates the data on a daily, weekly, and monthly basis. Scoring for the Daily Health Score, is given by partial credit based on the confirmations by the user saying “yes” if they kept to their daily plan.</w:t>
       </w:r>
     </w:p>
     <w:p>
@@ -2493,7 +2508,7 @@
               <w:rPr>
                 <w:sz w:val="18"/>
               </w:rPr>
-              <w:t xml:space="preserve">Works out a Daily Health Score after each daily audit from three parts: "(1) the amount of food eaten compared to daily recipe meal chosen, or restaurant meal chosen (#7 or #11 in CORE USER Story) (scored out of 50)," "(2) the amount of workout time actually worked out compared to the daily workout plan chosen (#17 in CORE USER Story) (scored out of 30)," and "(3) whether a user ate their last meal 3 hours before bed time (#10 in CORE USER Story) (scored out of 20)." </w:t>
+              <w:t xml:space="preserve">Works out a Daily Health Score after each daily audit from three parts: "(1) the amount of food eaten compared to daily recipe meal chosen, or restaurant meal chosen (#7 or #11 in CORE USER Story) (scored out of 50)," "(2) the amount of workout time actually worked out compared to the daily workout plan chosen (#17 in CORE USER Story) (scored out of 30)," and "(3) whether a user ate their last meal 3 hours before bed time (#10 in CORE USER Story) (scored out of 20)." "Scoring for the Daily Health Score, is given by partial credit based on the confirmations by the user saying “yes” if they kept to their daily plan." </w:t>
             </w:r>
             <w:r>
               <w:rPr>
@@ -2522,7 +2537,7 @@
               <w:rPr>
                 <w:sz w:val="18"/>
               </w:rPr>
-              <w:t xml:space="preserve">Completes the story (21) daily audit, which the score is "based on."</w:t>
+              <w:t xml:space="preserve">Completes the story (21) daily audit, which the score is "based on," including expected bedtime and last meal.</w:t>
             </w:r>
           </w:p>
         </w:tc>
@@ -2556,7 +2571,7 @@
               <w:rPr>
                 <w:sz w:val="18"/>
               </w:rPr>
-              <w:t xml:space="preserve">Adds family and friends to their group. "the user can include family and/or friends into their group when filing out the onboarding process as long as they know the users avatar name. After the onboarding process, the user can add family and/or friends to their group by sending a request to add the family member and/or friend by sending a friend request." </w:t>
+              <w:t xml:space="preserve">Adds family and friends to their groups: at onboarding by avatar name, or later "by sending a friend request." "The family and/or friend must accept the request." "A user can be in more than 1 family and/or friend group." </w:t>
             </w:r>
             <w:r>
               <w:rPr>
@@ -2641,11 +2656,6 @@
       <w:pPr>
         <w:spacing w:after="0"/>
       </w:pPr>
-    </w:p>
-    <w:p>
-      <w:r>
-        <w:t xml:space="preserve">The group paragraph places adding family and friends inside "the onboarding process," but Feature 1's line doesn't list it.</w:t>
-      </w:r>
     </w:p>
     <w:p>
       <w:pPr>
@@ -2678,7 +2688,7 @@
         </w:pBdr>
       </w:pPr>
       <w:r>
-        <w:t xml:space="preserve">DATA WE STORE: The user will be providing health statistics about themselves listed in the CORE STORY. Those statistics must be kept on the app and may be updated periodically by the user in connection with their longevity doctor. Combine data across users regarding popular choices for CORE STORY items #1 to #19 but do so in a deidentified way where only an avatar name is used. Avatar names for the Top 10% of users can be seen by other users, and their choices are visible, except their excluded foods and allergies, and their pantry use. Top 10% of Users cannot opt out of having their choices shown. Users can see other avatar names. Users can compare scores with family groups and/or friend groups, which their user avatar names are visible to family groups and/or friend groups. Other users should not be able to link back avatar names to any user. Make sure to protect the data and avatar names consistent with United States (State and Federal) data privacy laws. We do not store payment and address data. We do retain data for the user to export as a User Health Report to provide to their doctor. All data about a user is maintained for the user until the user terminates services with the app. The user can delete their data from the app upon termination. Users cannot delete app data before ending services. Payment and address data will be taken by the AI agent that this app connects to via an API. Please maintain all data consistent with United States (State and Federal) data privacy laws.</w:t>
+        <w:t xml:space="preserve">DATA WE STORE: The user will be providing health statistics about themselves listed in the CORE STORY. Those statistics must be kept on the app and may be updated periodically by the user in connection with their longevity doctor. Combine data across users regarding popular choices for CORE STORY items #1 to #19 but do so in a deidentified way where only an avatar name is used. Avatar names for the Top 10% of users can be seen by other users, and their choices are visible, except their excluded foods and allergies, and their pantry use. Avatar names for the Top 10% users Daily Health Scores are visible by other users. Top 10% of Users cannot opt out of having their choices shown, or their Daily Health Score. Users can see other avatar names. Users can compare scores with family groups and/or friend groups, which their user avatar names are visible to family groups and/or friend groups. Other users not in a family and/or friend group should not be able to link back avatar names to any user. Make sure to protect the data and avatar names consistent with United States (State and Federal) data privacy laws. We do not store payment and address data. We do retain data for the user to export as a User Health Report to provide to their doctor. All data about a user is maintained for the user until the user terminates services with the app. The user can delete their data from the app upon termination. Users cannot delete app data before ending services. Payment and address data will be taken by the AI agent that this app connects to via an API. Please maintain all data consistent with United States (State and Federal) data privacy laws.</w:t>
       </w:r>
     </w:p>
     <w:p>
@@ -2882,7 +2892,7 @@
         </w:numPr>
       </w:pPr>
       <w:r>
-        <w:t xml:space="preserve">A user's Daily Health Score and avatar name, with members of their family and/or friend group: "Users can compare scores with family groups and/or friend groups, which their user avatar names are visible to family groups and/or friend groups."</w:t>
+        <w:t xml:space="preserve">A user's Daily Health Score and avatar name, with members of their family and/or friend groups: "Users can compare scores with family groups and/or friend groups, which their user avatar names are visible to family groups and/or friend groups." The link-back rule now reads "Other users not in a family and/or friend group should not be able to link back avatar names to any user."</w:t>
       </w:r>
     </w:p>
     <w:p>
@@ -2893,13 +2903,7 @@
         </w:numPr>
       </w:pPr>
       <w:r>
-        <w:rPr>
-          <w:b/>
-        </w:rPr>
-        <w:t xml:space="preserve">[INFERRED]</w:t>
-      </w:r>
-      <w:r>
-        <w:t xml:space="preserve"> Top-10% users' Daily Health Scores, since users can compare their score "against the Top 10% of users." DATA WE STORE doesn't list the score among what's visible.</w:t>
+        <w:t xml:space="preserve">Top-10% users' avatar names and Daily Health Scores, to all users: "Avatar names for the Top 10% users Daily Health Scores are visible by other users." Top-10% users "cannot opt out of having their choices shown, or their Daily Health Score."</w:t>
       </w:r>
     </w:p>
     <w:p>
@@ -4787,7 +4791,7 @@
         </w:numPr>
       </w:pPr>
       <w:r>
-        <w:t xml:space="preserve">How the app tells the user when to eat (an alert, or a screen they check), and how it learns the user's bedtime, which the "3 hours before bed" rule and score part (3) depend on.</w:t>
+        <w:t xml:space="preserve">How the app tells the user when to eat: an alert, or a screen they check.</w:t>
       </w:r>
     </w:p>
     <w:p>
@@ -4798,7 +4802,7 @@
         </w:numPr>
       </w:pPr>
       <w:r>
-        <w:t xml:space="preserve">How "a meal every 3 hours, for 6 total meals a day" applies to users who pick the "Intermittent Fasting" or "GLP-1 suppressed appetite" diet choices.</w:t>
+        <w:t xml:space="preserve">How the day's meal times are set before the user enters that night's expected bedtime, since bedtime is entered "During the End of Day Audit."</w:t>
       </w:r>
     </w:p>
     <w:p>
@@ -4809,7 +4813,7 @@
         </w:numPr>
       </w:pPr>
       <w:r>
-        <w:t xml:space="preserve">How each score part is graded within its points: for example, whether eating most of a meal earns part of the 50, or whether part (3) is all 20 or nothing.</w:t>
+        <w:t xml:space="preserve">How "a meal every 3 hours, for 6 total meals a day" applies to users who pick the "Intermittent Fasting" or "GLP-1 suppressed appetite" diet choices.</w:t>
       </w:r>
     </w:p>
     <w:p>
@@ -4820,7 +4824,7 @@
         </w:numPr>
       </w:pPr>
       <w:r>
-        <w:t xml:space="preserve">Whether people added to a group during onboarding have to accept, as a "friend request" after onboarding implies, and whether a user can belong to more than one family or friend group.</w:t>
+        <w:t xml:space="preserve">How partial credit is counted within each score part. The PRD says it's "based on the confirmations by the user saying “yes,”" but not, for example, whether each of the 6 meals and snacks earns a share of the 50.</w:t>
       </w:r>
     </w:p>
     <w:p>
@@ -4839,27 +4843,7 @@
         </w:numPr>
       </w:pPr>
       <w:r>
-        <w:t xml:space="preserve">Whether top-10% users' Daily Health Scores are visible to all users. Users can compare "against the Top 10% of users," but DATA WE STORE lists only top-10% "choices" as visible.</w:t>
-      </w:r>
-    </w:p>
-    <w:p>
-      <w:pPr>
-        <w:numPr>
-          <w:ilvl w:val="0"/>
-          <w:numId w:val="1"/>
-        </w:numPr>
-      </w:pPr>
-      <w:r>
-        <w:t xml:space="preserve">How family and friend groups fit with "Other users should not be able to link back avatar names to any user." Group members exchange avatar names ("as long as they know the users avatar name"), and DATA WE STORE makes avatar names "visible to family groups and/or friend groups." </w:t>
-      </w:r>
-      <w:r>
-        <w:rPr>
-          <w:b/>
-        </w:rPr>
-        <w:t xml:space="preserve">[INFERRED]</w:t>
-      </w:r>
-      <w:r>
-        <w:t xml:space="preserve"> Group members would usually know each other's real identities.</w:t>
+        <w:t xml:space="preserve">None found in this version.</w:t>
       </w:r>
     </w:p>
     <w:p>

</xml_diff>

<commit_message>
Update prd-2.md audit to the 16:46 version
Per-meal share of the 50 food points, wake and bed times at onboarding,
meal alerts, and GLP-1 / intermittent fasting meal counts (default 3
meals, 0 snacks) with score recalibration.

Co-Authored-By: Claude Opus 5.5 <noreply@anthropic.com>
</commit_message>
<xml_diff>
--- a/07_DietGroceryApp/strategy/spec-audit-UPDATED.docx
+++ b/07_DietGroceryApp/strategy/spec-audit-UPDATED.docx
@@ -18,7 +18,7 @@
         <w:t xml:space="preserve">Prepared:</w:t>
       </w:r>
       <w:r>
-        <w:t xml:space="preserve"> October 20, 2026 (written against the 16:35 version of prd-2.md)</w:t>
+        <w:t xml:space="preserve"> October 20, 2026 (written against the 16:46 version of prd-2.md)</w:t>
       </w:r>
     </w:p>
     <w:p>
@@ -703,6 +703,34 @@
                 <w:sz w:val="18"/>
               </w:rPr>
               <w:t xml:space="preserve">Enters a workout plan. Story (17): "input their daily workouts that they plan to do each day, when inputting their health statistics." The user sets "the number of time they plan to spend on that activity as part of the initial survey," and the app "will ask the length of time for the cardiovascular work, and the free weight work."</w:t>
+            </w:r>
+          </w:p>
+        </w:tc>
+      </w:tr>
+      <w:tr>
+        <w:tc>
+          <w:tcPr>
+            <w:tcW w:w="5040" w:type="dxa"/>
+          </w:tcPr>
+          <w:p>
+            <w:pPr>
+              <w:spacing w:before="40" w:after="40"/>
+            </w:pPr>
+          </w:p>
+        </w:tc>
+        <w:tc>
+          <w:tcPr>
+            <w:tcW w:w="5040" w:type="dxa"/>
+          </w:tcPr>
+          <w:p>
+            <w:pPr>
+              <w:spacing w:before="40" w:after="40"/>
+            </w:pPr>
+            <w:r>
+              <w:rPr>
+                <w:sz w:val="18"/>
+              </w:rPr>
+              <w:t xml:space="preserve">Enters expected daily wake and bed times: "During the onboarding process, the user inputs their expected daily wake times, and bed times." GLP-1 and intermittent fasting users can enter "the amount of meals and snacks the user plans to eat per day" (default "3 meals, and 0 snacks"), and can "change this via the app at any time."</w:t>
             </w:r>
           </w:p>
         </w:tc>
@@ -1393,36 +1421,23 @@
               <w:rPr>
                 <w:sz w:val="18"/>
               </w:rPr>
-              <w:t xml:space="preserve">"the app will let the user know when to eat the appropriate food amounts throughout the day according to the recipes selected by the user, with the last meal of the day eaten 3 hours before bed." Elsewhere: "When to eat, the app tells the user when to eat based on spaced eating habits, with meals spaced at intervals of a meal every 3 hours, for 6 total meals a day for the users daily nutritional requirements. The meals are broken down into 3 meals, and 3 snacks per day: meal 1, snack 1, meal 2, snack 2, meal 3, snack 3. The user must have their last meal 3 hours before bedtime for the Daily Health Score. During the End of Day Audit, the user inputs their expected bedtime, and confirms their last meal of the day."</w:t>
-            </w:r>
-          </w:p>
-        </w:tc>
-        <w:tc>
-          <w:tcPr>
-            <w:tcW w:w="3360" w:type="dxa"/>
-          </w:tcPr>
-          <w:p>
-            <w:pPr>
-              <w:spacing w:before="40" w:after="40"/>
-            </w:pPr>
-            <w:r>
-              <w:rPr>
-                <w:sz w:val="18"/>
-              </w:rPr>
-              <w:t xml:space="preserve">Eats at those times, with the last meal 3 hours before bed. Enters their expected bedtime and confirms their last meal in the story (21) audit. </w:t>
-            </w:r>
-            <w:r>
-              <w:rPr>
-                <w:b/>
-                <w:sz w:val="18"/>
-              </w:rPr>
-              <w:t xml:space="preserve">[INFERRED]</w:t>
-            </w:r>
-            <w:r>
-              <w:rPr>
-                <w:sz w:val="18"/>
-              </w:rPr>
-              <w:t xml:space="preserve"> The PRD doesn't say how the user is told when to eat (an alert, or a screen they check).</w:t>
+              <w:t xml:space="preserve">"the app will let the user know when to eat the appropriate food amounts throughout the day according to the recipes selected by the user, with the last meal of the day eaten 3 hours before bed." Elsewhere: "When to eat, the app tells the user when to eat based on spaced eating habits, with meals spaced at intervals of a meal every 3 hours, for 6 total meals a day for the users daily nutritional requirements. The meals are broken down into 3 meals, and 3 snacks per day: meal 1, snack 1, meal 2, snack 2, meal 3, snack 3. The user must have their last meal 3 hours before bedtime for the Daily Health Score. During the onboarding process, the user inputs their expected daily wake times, and bed times. During the End of Day Audit, the user can change their wake time and bedtime, and confirms their last meal of the day. For a user to know when to eat, the user is told when to eat via an alert." And: "For users that are in GLP-1 user or intermittent fasting user, during onboarding the user can include the amount of meals and snacks the user plans to eat per day. The default amount of meals is 3 meals, and 0 snacks for a GLP-1 user or intermittent fasting user. This type of user can change this via the app at any time to recalibrate the app."</w:t>
+            </w:r>
+          </w:p>
+        </w:tc>
+        <w:tc>
+          <w:tcPr>
+            <w:tcW w:w="3360" w:type="dxa"/>
+          </w:tcPr>
+          <w:p>
+            <w:pPr>
+              <w:spacing w:before="40" w:after="40"/>
+            </w:pPr>
+            <w:r>
+              <w:rPr>
+                <w:sz w:val="18"/>
+              </w:rPr>
+              <w:t xml:space="preserve">Eats at those times after each alert, with the last meal 3 hours before bed. Enters wake and bed times at onboarding, can change them in the story (21) audit, and confirms their last meal there. GLP-1 and intermittent fasting users set their own meal and snack count.</w:t>
             </w:r>
           </w:p>
         </w:tc>
@@ -2429,7 +2444,7 @@
         </w:pBdr>
       </w:pPr>
       <w:r>
-        <w:t xml:space="preserve">The app will also provide a user a Daily Health Score, that will be aggregated on the app based on their End of Daily Confirmation Audit. The Daily Health Score contains several metrics to average the users health score according: (1) the amount of food eaten compared to daily recipe meal chosen, or restaurant meal chosen (#7 or #11 in CORE USER Story) (scored out of 50), (2) the amount of workout time actually worked out compared to the daily workout plan chosen (#17 in CORE USER Story) (scored out of 30), and (3) whether a user ate their last meal 3 hours before bed time (#10 in CORE USER Story) (scored out of 20). The health score can be used by the user to track daily, weekly, monthly goals based how well the user has been able to stick to using the app. The app will give a user a Daily Health Score everyday after the End of Day Audit. The user can then compare that score with other users of the app, either against the Top 10% of users, or family and/or friends also using the app who the user shares the data with in a family and/or friend group. The Daily Health Score aggregates the data on a daily, weekly, and monthly basis. Scoring for the Daily Health Score, is given by partial credit based on the confirmations by the user saying “yes” if they kept to their daily plan.</w:t>
+        <w:t xml:space="preserve">The app will also provide a user a Daily Health Score, that will be aggregated on the app based on their End of Daily Confirmation Audit. The Daily Health Score contains several metrics to average the users health score according: (1) the amount of food eaten compared to daily recipe meal chosen, or restaurant meal chosen (#7 or #11 in CORE USER Story) (scored out of 50), (2) the amount of workout time actually worked out compared to the daily workout plan chosen (#17 in CORE USER Story) (scored out of 30), and (3) whether a user ate their last meal 3 hours before bed time (#10 in CORE USER Story) (scored out of 20). The health score can be used by the user to track daily, weekly, monthly goals based how well the user has been able to stick to using the app. The app will give a user a Daily Health Score everyday after the End of Day Audit. The user can then compare that score with other users of the app, either against the Top 10% of users, or family and/or friends also using the app who the user shares the data with in a family and/or friend group. The Daily Health Score aggregates the data on a daily, weekly, and monthly basis. Scoring for the Daily Health Score, is given by partial credit based on the confirmations by the user saying “yes” if they kept to their daily plan. Each of the 6 meals and snacks earns a share of the 50 points for a normal user. For GLP-1 user or intermittent fasting user, each of the 3 meals and 0 snacks earns a share of the 50 points. A user can recalibrate to more or less meals than the 6 meals (3 meals and 3 snacks), and the scoring will recalibrate based on the total meals (meals and snacks) chosen for the day.</w:t>
       </w:r>
     </w:p>
     <w:p>
@@ -2508,7 +2523,7 @@
               <w:rPr>
                 <w:sz w:val="18"/>
               </w:rPr>
-              <w:t xml:space="preserve">Works out a Daily Health Score after each daily audit from three parts: "(1) the amount of food eaten compared to daily recipe meal chosen, or restaurant meal chosen (#7 or #11 in CORE USER Story) (scored out of 50)," "(2) the amount of workout time actually worked out compared to the daily workout plan chosen (#17 in CORE USER Story) (scored out of 30)," and "(3) whether a user ate their last meal 3 hours before bed time (#10 in CORE USER Story) (scored out of 20)." "Scoring for the Daily Health Score, is given by partial credit based on the confirmations by the user saying “yes” if they kept to their daily plan." </w:t>
+              <w:t xml:space="preserve">Works out a Daily Health Score after each daily audit from three parts: "(1) the amount of food eaten compared to daily recipe meal chosen, or restaurant meal chosen (#7 or #11 in CORE USER Story) (scored out of 50)," "(2) the amount of workout time actually worked out compared to the daily workout plan chosen (#17 in CORE USER Story) (scored out of 30)," and "(3) whether a user ate their last meal 3 hours before bed time (#10 in CORE USER Story) (scored out of 20)." Partial credit comes from "yes" confirmations. For the food part: "Each of the 6 meals and snacks earns a share of the 50 points for a normal user. For GLP-1 user or intermittent fasting user, each of the 3 meals and 0 snacks earns a share of the 50 points." If the user changes their meal count, "the scoring will recalibrate based on the total meals (meals and snacks) chosen for the day." </w:t>
             </w:r>
             <w:r>
               <w:rPr>
@@ -2521,23 +2536,23 @@
               <w:rPr>
                 <w:sz w:val="18"/>
               </w:rPr>
-              <w:t xml:space="preserve"> The three parts add up to 100.</w:t>
-            </w:r>
-          </w:p>
-        </w:tc>
-        <w:tc>
-          <w:tcPr>
-            <w:tcW w:w="5040" w:type="dxa"/>
-          </w:tcPr>
-          <w:p>
-            <w:pPr>
-              <w:spacing w:before="40" w:after="40"/>
-            </w:pPr>
-            <w:r>
-              <w:rPr>
-                <w:sz w:val="18"/>
-              </w:rPr>
-              <w:t xml:space="preserve">Completes the story (21) daily audit, which the score is "based on," including expected bedtime and last meal.</w:t>
+              <w:t xml:space="preserve"> The three parts add up to 100, and with 6 meals each is worth about 8.3 points.</w:t>
+            </w:r>
+          </w:p>
+        </w:tc>
+        <w:tc>
+          <w:tcPr>
+            <w:tcW w:w="5040" w:type="dxa"/>
+          </w:tcPr>
+          <w:p>
+            <w:pPr>
+              <w:spacing w:before="40" w:after="40"/>
+            </w:pPr>
+            <w:r>
+              <w:rPr>
+                <w:sz w:val="18"/>
+              </w:rPr>
+              <w:t xml:space="preserve">Completes the story (21) daily audit, which the score is "based on," including bedtime and last meal.</w:t>
             </w:r>
           </w:p>
         </w:tc>
@@ -2862,7 +2877,7 @@
         <w:t xml:space="preserve">[INFERRED]</w:t>
       </w:r>
       <w:r>
-        <w:t xml:space="preserve"> Also kept, under "All data about a user is maintained," though not named in DATA WE STORE: the Daily Health Score history (daily, weekly, monthly), family and friend group memberships, the grocery list and recipe list "on the app" (Feature 3), and the "When to eat" schedule (story 10).</w:t>
+        <w:t xml:space="preserve"> Also kept, under "All data about a user is maintained," though not named in DATA WE STORE: the Daily Health Score history (daily, weekly, monthly), family and friend group memberships, wake and bed times, the chosen number of meals and snacks, the grocery list and recipe list "on the app" (Feature 3), and the "When to eat" schedule (story 10).</w:t>
       </w:r>
     </w:p>
     <w:p>
@@ -4244,7 +4259,7 @@
               <w:rPr>
                 <w:sz w:val="18"/>
               </w:rPr>
-              <w:t xml:space="preserve">"the app" throughout; story (10) letting "the user know when to eat"; Feature 7 sharing scores between users</w:t>
+              <w:t xml:space="preserve">"the app" throughout; story (10) "the user is told when to eat via an alert"; Feature 7 sharing scores between users</w:t>
             </w:r>
           </w:p>
         </w:tc>
@@ -4273,7 +4288,7 @@
               <w:rPr>
                 <w:sz w:val="18"/>
               </w:rPr>
-              <w:t xml:space="preserve"> Any reminders for story (10) would use the platform's own notification service, which any app can use. All nine apps in competitors.md are on the App Store.</w:t>
+              <w:t xml:space="preserve"> The meal alerts would use the platform's own notification service, which any app can use. All nine apps in competitors.md are on the App Store.</w:t>
             </w:r>
           </w:p>
         </w:tc>
@@ -4791,7 +4806,7 @@
         </w:numPr>
       </w:pPr>
       <w:r>
-        <w:t xml:space="preserve">How the app tells the user when to eat: an alert, or a screen they check.</w:t>
+        <w:t xml:space="preserve">How meals are spaced when a user eats fewer or more than 6 a day, for example the GLP-1 and intermittent fasting default of "3 meals, and 0 snacks." The spacing rule is stated only as "a meal every 3 hours, for 6 total meals a day."</w:t>
       </w:r>
     </w:p>
     <w:p>
@@ -4802,7 +4817,7 @@
         </w:numPr>
       </w:pPr>
       <w:r>
-        <w:t xml:space="preserve">How the day's meal times are set before the user enters that night's expected bedtime, since bedtime is entered "During the End of Day Audit."</w:t>
+        <w:t xml:space="preserve">How partial credit works for score parts (2) and (3). The PRD splits the food part's 50 points by meal, but doesn't say how the 30 workout points or the 20 bedtime points are split.</w:t>
       </w:r>
     </w:p>
     <w:p>
@@ -4813,18 +4828,7 @@
         </w:numPr>
       </w:pPr>
       <w:r>
-        <w:t xml:space="preserve">How "a meal every 3 hours, for 6 total meals a day" applies to users who pick the "Intermittent Fasting" or "GLP-1 suppressed appetite" diet choices.</w:t>
-      </w:r>
-    </w:p>
-    <w:p>
-      <w:pPr>
-        <w:numPr>
-          <w:ilvl w:val="0"/>
-          <w:numId w:val="1"/>
-        </w:numPr>
-      </w:pPr>
-      <w:r>
-        <w:t xml:space="preserve">How partial credit is counted within each score part. The PRD says it's "based on the confirmations by the user saying “yes,”" but not, for example, whether each of the 6 meals and snacks earns a share of the 50.</w:t>
+        <w:t xml:space="preserve">Wake time, bed time and meal count are collected "during onboarding," but Feature 1's line doesn't list them.</w:t>
       </w:r>
     </w:p>
     <w:p>

</xml_diff>

<commit_message>
Update prd-2.md audit to the 16:54 version
Workout points split by session, full 20 bedtime points for eating 3
hours before bed, even meal spacing for other meal counts, and Feature 1
now lists wake time, bed time and meal counts.

Co-Authored-By: Claude Opus 5.5 <noreply@anthropic.com>
</commit_message>
<xml_diff>
--- a/07_DietGroceryApp/strategy/spec-audit-UPDATED.docx
+++ b/07_DietGroceryApp/strategy/spec-audit-UPDATED.docx
@@ -18,7 +18,7 @@
         <w:t xml:space="preserve">Prepared:</w:t>
       </w:r>
       <w:r>
-        <w:t xml:space="preserve"> October 20, 2026 (written against the 16:46 version of prd-2.md)</w:t>
+        <w:t xml:space="preserve"> October 20, 2026 (written against the 16:54 version of prd-2.md)</w:t>
       </w:r>
     </w:p>
     <w:p>
@@ -405,7 +405,7 @@
         <w:pStyle w:val="Heading2"/>
       </w:pPr>
       <w:r>
-        <w:t xml:space="preserve">Feature 1: "User submits a health statistic form, diet goals, diet choice selection, preferred foods, excluded foods, workout plan, and foods in their pantry, and family and/or friends and sees a confirmation message."</w:t>
+        <w:t xml:space="preserve">Feature 1: "User submits a health statistic form, diet goals, diet choice selection, preferred foods, excluded foods, workout plan, foods in their pantry, wake time, bed time, meal counts, and family and/or friends and sees a confirmation message."</w:t>
       </w:r>
     </w:p>
     <w:tbl>
@@ -479,7 +479,7 @@
               <w:rPr>
                 <w:sz w:val="18"/>
               </w:rPr>
-              <w:t xml:space="preserve">Shows a form and accepts health statistics, a diet goal, a diet choice, a preferred-foods list, an excluded-foods list, a workout plan, the foods in the user's pantry, and family and/or friends. Then shows a confirmation.</w:t>
+              <w:t xml:space="preserve">Shows a form and accepts health statistics, a diet goal, a diet choice, a preferred-foods list, an excluded-foods list, a workout plan, the foods in the user's pantry, wake time, bed time, meal counts, and family and/or friends. Then shows a confirmation.</w:t>
             </w:r>
           </w:p>
         </w:tc>
@@ -1421,7 +1421,7 @@
               <w:rPr>
                 <w:sz w:val="18"/>
               </w:rPr>
-              <w:t xml:space="preserve">"the app will let the user know when to eat the appropriate food amounts throughout the day according to the recipes selected by the user, with the last meal of the day eaten 3 hours before bed." Elsewhere: "When to eat, the app tells the user when to eat based on spaced eating habits, with meals spaced at intervals of a meal every 3 hours, for 6 total meals a day for the users daily nutritional requirements. The meals are broken down into 3 meals, and 3 snacks per day: meal 1, snack 1, meal 2, snack 2, meal 3, snack 3. The user must have their last meal 3 hours before bedtime for the Daily Health Score. During the onboarding process, the user inputs their expected daily wake times, and bed times. During the End of Day Audit, the user can change their wake time and bedtime, and confirms their last meal of the day. For a user to know when to eat, the user is told when to eat via an alert." And: "For users that are in GLP-1 user or intermittent fasting user, during onboarding the user can include the amount of meals and snacks the user plans to eat per day. The default amount of meals is 3 meals, and 0 snacks for a GLP-1 user or intermittent fasting user. This type of user can change this via the app at any time to recalibrate the app."</w:t>
+              <w:t xml:space="preserve">"the app will let the user know when to eat the appropriate food amounts throughout the day according to the recipes selected by the user, with the last meal of the day eaten 3 hours before bed." Elsewhere: "When to eat, the app tells the user when to eat based on spaced eating habits, with meals spaced at intervals of a meal every 3 hours, for 6 total meals a day for the users daily nutritional requirements. The meals are broken down into 3 meals, and 3 snacks per day: meal 1, snack 1, meal 2, snack 2, meal 3, snack 3. The user must have their last meal 3 hours before bedtime for the Daily Health Score. During the onboarding process, the user inputs their expected daily wake times, and bed times. During the End of Day Audit, the user can change their wake time and bedtime, and confirms their last meal of the day. For a user to know when to eat, the user is told when to eat via an alert. For those users, who choose to eat more meals than 6 meals per day (3 meals and 3 snacks), their meals are to be spaced evenly throughout the day based on their choice. For those users, who choose to eat less than 6 meals per day (3 meals and 3 snacks) their meals are to be spaced evenly throughout the day." And: "For users that are in GLP-1 user or intermittent fasting user, during onboarding the user can include the amount of meals and snacks the user plans to eat per day. The default amount of meals is 3 meals, and 0 snacks for a GLP-1 user or intermittent fasting user. This type of user can change this via the app at any time to recalibrate the app."</w:t>
             </w:r>
           </w:p>
         </w:tc>
@@ -2444,7 +2444,7 @@
         </w:pBdr>
       </w:pPr>
       <w:r>
-        <w:t xml:space="preserve">The app will also provide a user a Daily Health Score, that will be aggregated on the app based on their End of Daily Confirmation Audit. The Daily Health Score contains several metrics to average the users health score according: (1) the amount of food eaten compared to daily recipe meal chosen, or restaurant meal chosen (#7 or #11 in CORE USER Story) (scored out of 50), (2) the amount of workout time actually worked out compared to the daily workout plan chosen (#17 in CORE USER Story) (scored out of 30), and (3) whether a user ate their last meal 3 hours before bed time (#10 in CORE USER Story) (scored out of 20). The health score can be used by the user to track daily, weekly, monthly goals based how well the user has been able to stick to using the app. The app will give a user a Daily Health Score everyday after the End of Day Audit. The user can then compare that score with other users of the app, either against the Top 10% of users, or family and/or friends also using the app who the user shares the data with in a family and/or friend group. The Daily Health Score aggregates the data on a daily, weekly, and monthly basis. Scoring for the Daily Health Score, is given by partial credit based on the confirmations by the user saying “yes” if they kept to their daily plan. Each of the 6 meals and snacks earns a share of the 50 points for a normal user. For GLP-1 user or intermittent fasting user, each of the 3 meals and 0 snacks earns a share of the 50 points. A user can recalibrate to more or less meals than the 6 meals (3 meals and 3 snacks), and the scoring will recalibrate based on the total meals (meals and snacks) chosen for the day.</w:t>
+        <w:t xml:space="preserve">The app will also provide a user a Daily Health Score, that will be aggregated on the app based on their End of Daily Confirmation Audit. The Daily Health Score contains several metrics to average the users health score according: (1) the amount of food eaten compared to daily recipe meal chosen, or restaurant meal chosen (#7 or #11 in CORE USER Story) (scored out of 50), (2) the amount of workout time actually worked out compared to the daily workout plan chosen (#17 in CORE USER Story) (scored out of 30), and (3) whether a user ate their last meal 3 hours before bed time (#10 in CORE USER Story) (scored out of 20). The health score can be used by the user to track daily, weekly, monthly goals based how well the user has been able to stick to using the app. The app will give a user a Daily Health Score everyday after the End of Day Audit. The user can then compare that score with other users of the app, either against the Top 10% of users, or family and/or friends also using the app who the user shares the data with in a family and/or friend group. The Daily Health Score aggregates the data on a daily, weekly, and monthly basis. Scoring for the Daily Health Score, is given by partial credit based on the confirmations by the user saying “yes” if they kept to their daily plan. Each of the 6 meals and snacks earns a share of the 50 points for a normal user. For GLP-1 user or intermittent fasting user, each of the 3 meals and 0 snacks earns a share of the 50 points. A user can recalibrate to more or less meals than the 6 meals (3 meals and 3 snacks), and the scoring will recalibrate based on the total meals (meals and snacks) chosen for the day. For scoring the workout points, each cardio session, and workout session earns a share of the 30 points. For scoring the eating the last meal 3 hours before bed time, if the user eats 3 hours before bed time they earn all 20 points.</w:t>
       </w:r>
     </w:p>
     <w:p>
@@ -2523,7 +2523,46 @@
               <w:rPr>
                 <w:sz w:val="18"/>
               </w:rPr>
-              <w:t xml:space="preserve">Works out a Daily Health Score after each daily audit from three parts: "(1) the amount of food eaten compared to daily recipe meal chosen, or restaurant meal chosen (#7 or #11 in CORE USER Story) (scored out of 50)," "(2) the amount of workout time actually worked out compared to the daily workout plan chosen (#17 in CORE USER Story) (scored out of 30)," and "(3) whether a user ate their last meal 3 hours before bed time (#10 in CORE USER Story) (scored out of 20)." Partial credit comes from "yes" confirmations. For the food part: "Each of the 6 meals and snacks earns a share of the 50 points for a normal user. For GLP-1 user or intermittent fasting user, each of the 3 meals and 0 snacks earns a share of the 50 points." If the user changes their meal count, "the scoring will recalibrate based on the total meals (meals and snacks) chosen for the day." </w:t>
+              <w:t xml:space="preserve">Works out a Daily Health Score after each daily audit from three parts: "(1) the amount of food eaten compared to daily recipe meal chosen, or restaurant meal chosen (#7 or #11 in CORE USER Story) (scored out of 50)," "(2) the amount of workout time actually worked out compared to the daily workout plan chosen (#17 in CORE USER Story) (scored out of 30)," and "(3) whether a user ate their last meal 3 hours before bed time (#10 in CORE USER Story) (scored out of 20)." Partial credit comes from "yes" confirmations. </w:t>
+            </w:r>
+            <w:r>
+              <w:rPr>
+                <w:b/>
+                <w:sz w:val="18"/>
+              </w:rPr>
+              <w:t xml:space="preserve">Food:</w:t>
+            </w:r>
+            <w:r>
+              <w:rPr>
+                <w:sz w:val="18"/>
+              </w:rPr>
+              <w:t xml:space="preserve"> "Each of the 6 meals and snacks earns a share of the 50 points for a normal user. For GLP-1 user or intermittent fasting user, each of the 3 meals and 0 snacks earns a share of the 50 points," and the share recalibrates if the meal count changes. </w:t>
+            </w:r>
+            <w:r>
+              <w:rPr>
+                <w:b/>
+                <w:sz w:val="18"/>
+              </w:rPr>
+              <w:t xml:space="preserve">Workouts:</w:t>
+            </w:r>
+            <w:r>
+              <w:rPr>
+                <w:sz w:val="18"/>
+              </w:rPr>
+              <w:t xml:space="preserve"> "each cardio session, and workout session earns a share of the 30 points." </w:t>
+            </w:r>
+            <w:r>
+              <w:rPr>
+                <w:b/>
+                <w:sz w:val="18"/>
+              </w:rPr>
+              <w:t xml:space="preserve">Bedtime:</w:t>
+            </w:r>
+            <w:r>
+              <w:rPr>
+                <w:sz w:val="18"/>
+              </w:rPr>
+              <w:t xml:space="preserve"> "if the user eats 3 hours before bed time they earn all 20 points." </w:t>
             </w:r>
             <w:r>
               <w:rPr>
@@ -4806,29 +4845,7 @@
         </w:numPr>
       </w:pPr>
       <w:r>
-        <w:t xml:space="preserve">How meals are spaced when a user eats fewer or more than 6 a day, for example the GLP-1 and intermittent fasting default of "3 meals, and 0 snacks." The spacing rule is stated only as "a meal every 3 hours, for 6 total meals a day."</w:t>
-      </w:r>
-    </w:p>
-    <w:p>
-      <w:pPr>
-        <w:numPr>
-          <w:ilvl w:val="0"/>
-          <w:numId w:val="1"/>
-        </w:numPr>
-      </w:pPr>
-      <w:r>
-        <w:t xml:space="preserve">How partial credit works for score parts (2) and (3). The PRD splits the food part's 50 points by meal, but doesn't say how the 30 workout points or the 20 bedtime points are split.</w:t>
-      </w:r>
-    </w:p>
-    <w:p>
-      <w:pPr>
-        <w:numPr>
-          <w:ilvl w:val="0"/>
-          <w:numId w:val="1"/>
-        </w:numPr>
-      </w:pPr>
-      <w:r>
-        <w:t xml:space="preserve">Wake time, bed time and meal count are collected "during onboarding," but Feature 1's line doesn't list them.</w:t>
+        <w:t xml:space="preserve">What a user scores on part (3) if their last meal is later than 3 hours before bed. The PRD states only the full-credit case: "if the user eats 3 hours before bed time they earn all 20 points."</w:t>
       </w:r>
     </w:p>
     <w:p>

</xml_diff>

<commit_message>
Update prd-2.md audit to the 16:59 version (bedtime point tiers)
Co-Authored-By: Claude Opus 5.5 <noreply@anthropic.com>
</commit_message>
<xml_diff>
--- a/07_DietGroceryApp/strategy/spec-audit-UPDATED.docx
+++ b/07_DietGroceryApp/strategy/spec-audit-UPDATED.docx
@@ -18,7 +18,7 @@
         <w:t xml:space="preserve">Prepared:</w:t>
       </w:r>
       <w:r>
-        <w:t xml:space="preserve"> October 20, 2026 (written against the 16:54 version of prd-2.md)</w:t>
+        <w:t xml:space="preserve"> October 20, 2026 (written against the 16:59 version of prd-2.md)</w:t>
       </w:r>
     </w:p>
     <w:p>
@@ -2444,7 +2444,7 @@
         </w:pBdr>
       </w:pPr>
       <w:r>
-        <w:t xml:space="preserve">The app will also provide a user a Daily Health Score, that will be aggregated on the app based on their End of Daily Confirmation Audit. The Daily Health Score contains several metrics to average the users health score according: (1) the amount of food eaten compared to daily recipe meal chosen, or restaurant meal chosen (#7 or #11 in CORE USER Story) (scored out of 50), (2) the amount of workout time actually worked out compared to the daily workout plan chosen (#17 in CORE USER Story) (scored out of 30), and (3) whether a user ate their last meal 3 hours before bed time (#10 in CORE USER Story) (scored out of 20). The health score can be used by the user to track daily, weekly, monthly goals based how well the user has been able to stick to using the app. The app will give a user a Daily Health Score everyday after the End of Day Audit. The user can then compare that score with other users of the app, either against the Top 10% of users, or family and/or friends also using the app who the user shares the data with in a family and/or friend group. The Daily Health Score aggregates the data on a daily, weekly, and monthly basis. Scoring for the Daily Health Score, is given by partial credit based on the confirmations by the user saying “yes” if they kept to their daily plan. Each of the 6 meals and snacks earns a share of the 50 points for a normal user. For GLP-1 user or intermittent fasting user, each of the 3 meals and 0 snacks earns a share of the 50 points. A user can recalibrate to more or less meals than the 6 meals (3 meals and 3 snacks), and the scoring will recalibrate based on the total meals (meals and snacks) chosen for the day. For scoring the workout points, each cardio session, and workout session earns a share of the 30 points. For scoring the eating the last meal 3 hours before bed time, if the user eats 3 hours before bed time they earn all 20 points.</w:t>
+        <w:t xml:space="preserve">The app will also provide a user a Daily Health Score, that will be aggregated on the app based on their End of Daily Confirmation Audit. The Daily Health Score contains several metrics to average the users health score according: (1) the amount of food eaten compared to daily recipe meal chosen, or restaurant meal chosen (#7 or #11 in CORE USER Story) (scored out of 50), (2) the amount of workout time actually worked out compared to the daily workout plan chosen (#17 in CORE USER Story) (scored out of 30), and (3) whether a user ate their last meal 3 hours before bed time (#10 in CORE USER Story) (scored out of 20). The health score can be used by the user to track daily, weekly, monthly goals based how well the user has been able to stick to using the app. The app will give a user a Daily Health Score everyday after the End of Day Audit. The user can then compare that score with other users of the app, either against the Top 10% of users, or family and/or friends also using the app who the user shares the data with in a family and/or friend group. The Daily Health Score aggregates the data on a daily, weekly, and monthly basis. Scoring for the Daily Health Score, is given by partial credit based on the confirmations by the user saying “yes” if they kept to their daily plan. Each of the 6 meals and snacks earns a share of the 50 points for a normal user. For GLP-1 user or intermittent fasting user, each of the 3 meals and 0 snacks earns a share of the 50 points. A user can recalibrate to more or less meals than the 6 meals (3 meals and 3 snacks), and the scoring will recalibrate based on the total meals (meals and snacks) chosen for the day. For scoring the workout points, each cardio session, and workout session earns a share of the 30 points. For scoring the eating the last meal 3 hours before bed time, if the user eats 3 hours before bed time they earn all 20 points, if the user eats 2 hours before bed time they earn 10 points, if they user eats 1 hour before bed time they earn 5 points, and if the user eats less than 1 hour before bed time they earn 0 points.</w:t>
       </w:r>
     </w:p>
     <w:p>
@@ -2562,7 +2562,7 @@
               <w:rPr>
                 <w:sz w:val="18"/>
               </w:rPr>
-              <w:t xml:space="preserve"> "if the user eats 3 hours before bed time they earn all 20 points." </w:t>
+              <w:t xml:space="preserve"> "if the user eats 3 hours before bed time they earn all 20 points, if the user eats 2 hours before bed time they earn 10 points, if they user eats 1 hour before bed time they earn 5 points, and if the user eats less than 1 hour before bed time they earn 0 points." </w:t>
             </w:r>
             <w:r>
               <w:rPr>
@@ -4845,7 +4845,7 @@
         </w:numPr>
       </w:pPr>
       <w:r>
-        <w:t xml:space="preserve">What a user scores on part (3) if their last meal is later than 3 hours before bed. The PRD states only the full-credit case: "if the user eats 3 hours before bed time they earn all 20 points."</w:t>
+        <w:t xml:space="preserve">What a user scores on part (3) when their last meal falls between the stated marks, for example 2½ hours before bed. The PRD gives points only at 3 hours (20), 2 hours (10), 1 hour (5) and "less than 1 hour" (0).</w:t>
       </w:r>
     </w:p>
     <w:p>

</xml_diff>

<commit_message>
Update prd-2.md audit to the 17:50 version (half-hour bedtime tiers)
Records the new half-hour bedtime scoring and flags the leftover
fragment that gives 1 hour a different score and ends mid-sentence.

Co-Authored-By: Claude Opus 5.5 <noreply@anthropic.com>
</commit_message>
<xml_diff>
--- a/07_DietGroceryApp/strategy/spec-audit-UPDATED.docx
+++ b/07_DietGroceryApp/strategy/spec-audit-UPDATED.docx
@@ -18,7 +18,7 @@
         <w:t xml:space="preserve">Prepared:</w:t>
       </w:r>
       <w:r>
-        <w:t xml:space="preserve"> October 20, 2026 (written against the 16:59 version of prd-2.md)</w:t>
+        <w:t xml:space="preserve"> October 20, 2026 (written against the 17:50 version of prd-2.md)</w:t>
       </w:r>
     </w:p>
     <w:p>
@@ -2444,7 +2444,45 @@
         </w:pBdr>
       </w:pPr>
       <w:r>
-        <w:t xml:space="preserve">The app will also provide a user a Daily Health Score, that will be aggregated on the app based on their End of Daily Confirmation Audit. The Daily Health Score contains several metrics to average the users health score according: (1) the amount of food eaten compared to daily recipe meal chosen, or restaurant meal chosen (#7 or #11 in CORE USER Story) (scored out of 50), (2) the amount of workout time actually worked out compared to the daily workout plan chosen (#17 in CORE USER Story) (scored out of 30), and (3) whether a user ate their last meal 3 hours before bed time (#10 in CORE USER Story) (scored out of 20). The health score can be used by the user to track daily, weekly, monthly goals based how well the user has been able to stick to using the app. The app will give a user a Daily Health Score everyday after the End of Day Audit. The user can then compare that score with other users of the app, either against the Top 10% of users, or family and/or friends also using the app who the user shares the data with in a family and/or friend group. The Daily Health Score aggregates the data on a daily, weekly, and monthly basis. Scoring for the Daily Health Score, is given by partial credit based on the confirmations by the user saying “yes” if they kept to their daily plan. Each of the 6 meals and snacks earns a share of the 50 points for a normal user. For GLP-1 user or intermittent fasting user, each of the 3 meals and 0 snacks earns a share of the 50 points. A user can recalibrate to more or less meals than the 6 meals (3 meals and 3 snacks), and the scoring will recalibrate based on the total meals (meals and snacks) chosen for the day. For scoring the workout points, each cardio session, and workout session earns a share of the 30 points. For scoring the eating the last meal 3 hours before bed time, if the user eats 3 hours before bed time they earn all 20 points, if the user eats 2 hours before bed time they earn 10 points, if they user eats 1 hour before bed time they earn 5 points, and if the user eats less than 1 hour before bed time they earn 0 points.</w:t>
+        <w:t xml:space="preserve">The app will also provide a user a Daily Health Score, that will be aggregated on the app based on their End of Daily Confirmation Audit. The Daily Health Score contains several metrics to average the users health score according: (1) the amount of food eaten compared to daily recipe meal chosen, or restaurant meal chosen (#7 or #11 in CORE USER Story) (scored out of 50), (2) the amount of workout time actually worked out compared to the daily workout plan chosen (#17 in CORE USER Story) (scored out of 30), and (3) whether a user ate their last meal 3 hours before bed time (#10 in CORE USER Story) (scored out of 20). The health score can be used by the user to track daily, weekly, monthly goals based how well the user has been able to stick to using the app. The app will give a user a Daily Health Score everyday after the End of Day Audit. The user can then compare that score with other users of the app, either against the Top 10% of users, or family and/or friends also using the app who the user shares the data with in a family and/or friend group. The Daily Health Score aggregates the data on a daily, weekly, and monthly basis. Scoring for the Daily Health Score, is given by partial credit based on the confirmations by the user saying “yes” if they kept to their daily plan. Each of the 6 meals and snacks earns a share of the 50 points for a normal user. For GLP-1 user or intermittent fasting user, each of the 3 meals and 0 snacks earns a share of the 50 points. A user can recalibrate to more or less meals than the 6 meals (3 meals and 3 snacks), and the scoring will recalibrate based on the total meals (meals and snacks) chosen for the day. For scoring the workout points, each cardio session, and workout session earns a share of the 30 points.</w:t>
+      </w:r>
+    </w:p>
+    <w:p>
+      <w:pPr>
+        <w:ind w:left="360"/>
+        <w:pBdr>
+          <w:left w:val="single" w:sz="18" w:space="8" w:color="9AA0A6"/>
+        </w:pBdr>
+      </w:pPr>
+    </w:p>
+    <w:p>
+      <w:pPr>
+        <w:ind w:left="360"/>
+        <w:pBdr>
+          <w:left w:val="single" w:sz="18" w:space="8" w:color="9AA0A6"/>
+        </w:pBdr>
+      </w:pPr>
+      <w:r>
+        <w:t xml:space="preserve">For scoring the eating the last meal 3 hours before bed time, if the user eats 3 hours before bed time they earn all 20 points, if the user eats 2.5 hours before bed time they earn 15 points, if the user eats 2 hours before bed time they earn 10 points, if the user eats 1.5 hours before bed they earn 5 points, if the user eats 1 hour before bed they earn 0 points, if the user eats 0.5 hours before bed they earn 0 points, and If the user eats 0 hours before bed they earn 0 points.</w:t>
+      </w:r>
+    </w:p>
+    <w:p>
+      <w:pPr>
+        <w:ind w:left="360"/>
+        <w:pBdr>
+          <w:left w:val="single" w:sz="18" w:space="8" w:color="9AA0A6"/>
+        </w:pBdr>
+      </w:pPr>
+    </w:p>
+    <w:p>
+      <w:pPr>
+        <w:ind w:left="360"/>
+        <w:pBdr>
+          <w:left w:val="single" w:sz="18" w:space="8" w:color="9AA0A6"/>
+        </w:pBdr>
+      </w:pPr>
+      <w:r>
+        <w:t xml:space="preserve">1 hour before bed time they earn 5 points, and if the user eats less than 1 hour before bed time they earn 0 points. For bed times that are</w:t>
       </w:r>
     </w:p>
     <w:p>
@@ -2562,7 +2600,7 @@
               <w:rPr>
                 <w:sz w:val="18"/>
               </w:rPr>
-              <w:t xml:space="preserve"> "if the user eats 3 hours before bed time they earn all 20 points, if the user eats 2 hours before bed time they earn 10 points, if they user eats 1 hour before bed time they earn 5 points, and if the user eats less than 1 hour before bed time they earn 0 points." </w:t>
+              <w:t xml:space="preserve"> "For scoring the eating the last meal 3 hours before bed time, if the user eats 3 hours before bed time they earn all 20 points, if the user eats 2.5 hours before bed time they earn 15 points, if the user eats 2 hours before bed time they earn 10 points, if the user eats 1.5 hours before bed they earn 5 points, if the user eats 1 hour before bed they earn 0 points, if the user eats 0.5 hours before bed they earn 0 points, and If the user eats 0 hours before bed they earn 0 points." A separate fragment later in the PRD says "1 hour before bed time they earn 5 points, and if the user eats less than 1 hour before bed time they earn 0 points. For bed times that are" It ends mid-sentence, and its 5 points for 1 hour disagrees with the 0 points above. </w:t>
             </w:r>
             <w:r>
               <w:rPr>
@@ -4845,7 +4883,29 @@
         </w:numPr>
       </w:pPr>
       <w:r>
-        <w:t xml:space="preserve">What a user scores on part (3) when their last meal falls between the stated marks, for example 2½ hours before bed. The PRD gives points only at 3 hours (20), 2 hours (10), 1 hour (5) and "less than 1 hour" (0).</w:t>
+        <w:t xml:space="preserve">What a user scores on part (3) for a last meal exactly 1 hour before bed. One passage says "if the user eats 1 hour before bed they earn 0 points"; a later fragment says "1 hour before bed time they earn 5 points."</w:t>
+      </w:r>
+    </w:p>
+    <w:p>
+      <w:pPr>
+        <w:numPr>
+          <w:ilvl w:val="0"/>
+          <w:numId w:val="1"/>
+        </w:numPr>
+      </w:pPr>
+      <w:r>
+        <w:t xml:space="preserve">What the cut-off sentence "For bed times that are" was going to say.</w:t>
+      </w:r>
+    </w:p>
+    <w:p>
+      <w:pPr>
+        <w:numPr>
+          <w:ilvl w:val="0"/>
+          <w:numId w:val="1"/>
+        </w:numPr>
+      </w:pPr>
+      <w:r>
+        <w:t xml:space="preserve">What a user scores on part (3) for times between the half-hour marks (for example 2¾ hours) or more than 3 hours before bed. The PRD gives points only at 3, 2.5, 2, 1.5, 1, 0.5 and 0 hours.</w:t>
       </w:r>
     </w:p>
     <w:p>

</xml_diff>

<commit_message>
Update prd-2.md audit to the 17:58 version (quarter-hour bedtime tiers)
The leftover bedtime fragment is gone. Flags that 2.75 hours is listed
twice with different points and 1.75 hours is missing.

Co-Authored-By: Claude Opus 5.5 <noreply@anthropic.com>
</commit_message>
<xml_diff>
--- a/07_DietGroceryApp/strategy/spec-audit-UPDATED.docx
+++ b/07_DietGroceryApp/strategy/spec-audit-UPDATED.docx
@@ -18,7 +18,7 @@
         <w:t xml:space="preserve">Prepared:</w:t>
       </w:r>
       <w:r>
-        <w:t xml:space="preserve"> October 20, 2026 (written against the 17:50 version of prd-2.md)</w:t>
+        <w:t xml:space="preserve"> October 20, 2026 (written against the 17:58 version of prd-2.md)</w:t>
       </w:r>
     </w:p>
     <w:p>
@@ -2444,45 +2444,7 @@
         </w:pBdr>
       </w:pPr>
       <w:r>
-        <w:t xml:space="preserve">The app will also provide a user a Daily Health Score, that will be aggregated on the app based on their End of Daily Confirmation Audit. The Daily Health Score contains several metrics to average the users health score according: (1) the amount of food eaten compared to daily recipe meal chosen, or restaurant meal chosen (#7 or #11 in CORE USER Story) (scored out of 50), (2) the amount of workout time actually worked out compared to the daily workout plan chosen (#17 in CORE USER Story) (scored out of 30), and (3) whether a user ate their last meal 3 hours before bed time (#10 in CORE USER Story) (scored out of 20). The health score can be used by the user to track daily, weekly, monthly goals based how well the user has been able to stick to using the app. The app will give a user a Daily Health Score everyday after the End of Day Audit. The user can then compare that score with other users of the app, either against the Top 10% of users, or family and/or friends also using the app who the user shares the data with in a family and/or friend group. The Daily Health Score aggregates the data on a daily, weekly, and monthly basis. Scoring for the Daily Health Score, is given by partial credit based on the confirmations by the user saying “yes” if they kept to their daily plan. Each of the 6 meals and snacks earns a share of the 50 points for a normal user. For GLP-1 user or intermittent fasting user, each of the 3 meals and 0 snacks earns a share of the 50 points. A user can recalibrate to more or less meals than the 6 meals (3 meals and 3 snacks), and the scoring will recalibrate based on the total meals (meals and snacks) chosen for the day. For scoring the workout points, each cardio session, and workout session earns a share of the 30 points.</w:t>
-      </w:r>
-    </w:p>
-    <w:p>
-      <w:pPr>
-        <w:ind w:left="360"/>
-        <w:pBdr>
-          <w:left w:val="single" w:sz="18" w:space="8" w:color="9AA0A6"/>
-        </w:pBdr>
-      </w:pPr>
-    </w:p>
-    <w:p>
-      <w:pPr>
-        <w:ind w:left="360"/>
-        <w:pBdr>
-          <w:left w:val="single" w:sz="18" w:space="8" w:color="9AA0A6"/>
-        </w:pBdr>
-      </w:pPr>
-      <w:r>
-        <w:t xml:space="preserve">For scoring the eating the last meal 3 hours before bed time, if the user eats 3 hours before bed time they earn all 20 points, if the user eats 2.5 hours before bed time they earn 15 points, if the user eats 2 hours before bed time they earn 10 points, if the user eats 1.5 hours before bed they earn 5 points, if the user eats 1 hour before bed they earn 0 points, if the user eats 0.5 hours before bed they earn 0 points, and If the user eats 0 hours before bed they earn 0 points.</w:t>
-      </w:r>
-    </w:p>
-    <w:p>
-      <w:pPr>
-        <w:ind w:left="360"/>
-        <w:pBdr>
-          <w:left w:val="single" w:sz="18" w:space="8" w:color="9AA0A6"/>
-        </w:pBdr>
-      </w:pPr>
-    </w:p>
-    <w:p>
-      <w:pPr>
-        <w:ind w:left="360"/>
-        <w:pBdr>
-          <w:left w:val="single" w:sz="18" w:space="8" w:color="9AA0A6"/>
-        </w:pBdr>
-      </w:pPr>
-      <w:r>
-        <w:t xml:space="preserve">1 hour before bed time they earn 5 points, and if the user eats less than 1 hour before bed time they earn 0 points. For bed times that are</w:t>
+        <w:t xml:space="preserve">The app will also provide a user a Daily Health Score, that will be aggregated on the app based on their End of Daily Confirmation Audit. The Daily Health Score contains several metrics to average the users health score according: (1) the amount of food eaten compared to daily recipe meal chosen, or restaurant meal chosen (#7 or #11 in CORE USER Story) (scored out of 50), (2) the amount of workout time actually worked out compared to the daily workout plan chosen (#17 in CORE USER Story) (scored out of 30), and (3) whether a user ate their last meal 3 hours before bed time (#10 in CORE USER Story) (scored out of 20). The health score can be used by the user to track daily, weekly, monthly goals based how well the user has been able to stick to using the app. The app will give a user a Daily Health Score everyday after the End of Day Audit. The user can then compare that score with other users of the app, either against the Top 10% of users, or family and/or friends also using the app who the user shares the data with in a family and/or friend group. The Daily Health Score aggregates the data on a daily, weekly, and monthly basis. Scoring for the Daily Health Score, is given by partial credit based on the confirmations by the user saying “yes” if they kept to their daily plan. Each of the 6 meals and snacks earns a share of the 50 points for a normal user. For GLP-1 user or intermittent fasting user, each of the 3 meals and 0 snacks earns a share of the 50 points. A user can recalibrate to more or less meals than the 6 meals (3 meals and 3 snacks), and the scoring will recalibrate based on the total meals (meals and snacks) chosen for the day. For scoring the workout points, each cardio session, and workout session earns a share of the 30 points. For scoring the eating the last meal 3 hours before bed time, if the user eats 3 hours before bed time they earn all 20 points, if the user eats 2.75 hours before bed time they earn 17.5 points, if the user eats 2.5 hours before bed time they earn 15 points, if the user eats 2.25 hours before bed time they earn 12.5 points, if the user eats 2 hours before bed time they earn 10 points, if the user eats 2.75 hours before bed time they earn 7.5 points, if the user eats 1.5 hours before bed they earn 5 points, if the user eats 1.25 hours before bed time they earn 2.5 points, if the user eats 1 hour before bed they earn 0 points, if the user eats less than 1 hour before bed they earn 0 points.</w:t>
       </w:r>
     </w:p>
     <w:p>
@@ -2600,7 +2562,7 @@
               <w:rPr>
                 <w:sz w:val="18"/>
               </w:rPr>
-              <w:t xml:space="preserve"> "For scoring the eating the last meal 3 hours before bed time, if the user eats 3 hours before bed time they earn all 20 points, if the user eats 2.5 hours before bed time they earn 15 points, if the user eats 2 hours before bed time they earn 10 points, if the user eats 1.5 hours before bed they earn 5 points, if the user eats 1 hour before bed they earn 0 points, if the user eats 0.5 hours before bed they earn 0 points, and If the user eats 0 hours before bed they earn 0 points." A separate fragment later in the PRD says "1 hour before bed time they earn 5 points, and if the user eats less than 1 hour before bed time they earn 0 points. For bed times that are" It ends mid-sentence, and its 5 points for 1 hour disagrees with the 0 points above. </w:t>
+              <w:t xml:space="preserve"> "For scoring the eating the last meal 3 hours before bed time, if the user eats 3 hours before bed time they earn all 20 points, if the user eats 2.75 hours before bed time they earn 17.5 points, if the user eats 2.5 hours before bed time they earn 15 points, if the user eats 2.25 hours before bed time they earn 12.5 points, if the user eats 2 hours before bed time they earn 10 points, if the user eats 2.75 hours before bed time they earn 7.5 points, if the user eats 1.5 hours before bed they earn 5 points, if the user eats 1.25 hours before bed time they earn 2.5 points, if the user eats 1 hour before bed they earn 0 points, if the user eats less than 1 hour before bed they earn 0 points." The list gives 2.75 hours twice, once at 17.5 points and once at 7.5 points, and doesn't list 1.75 hours. </w:t>
             </w:r>
             <w:r>
               <w:rPr>
@@ -4883,7 +4845,7 @@
         </w:numPr>
       </w:pPr>
       <w:r>
-        <w:t xml:space="preserve">What a user scores on part (3) for a last meal exactly 1 hour before bed. One passage says "if the user eats 1 hour before bed they earn 0 points"; a later fragment says "1 hour before bed time they earn 5 points."</w:t>
+        <w:t xml:space="preserve">What a user scores on part (3) at 2.75 hours before bed: the list gives both "17.5 points" and "7.5 points." It gives no score for 1.75 hours.</w:t>
       </w:r>
     </w:p>
     <w:p>
@@ -4894,18 +4856,7 @@
         </w:numPr>
       </w:pPr>
       <w:r>
-        <w:t xml:space="preserve">What the cut-off sentence "For bed times that are" was going to say.</w:t>
-      </w:r>
-    </w:p>
-    <w:p>
-      <w:pPr>
-        <w:numPr>
-          <w:ilvl w:val="0"/>
-          <w:numId w:val="1"/>
-        </w:numPr>
-      </w:pPr>
-      <w:r>
-        <w:t xml:space="preserve">What a user scores on part (3) for times between the half-hour marks (for example 2¾ hours) or more than 3 hours before bed. The PRD gives points only at 3, 2.5, 2, 1.5, 1, 0.5 and 0 hours.</w:t>
+        <w:t xml:space="preserve">What a user scores on part (3) for times between the quarter-hour marks (for example 2 hours 40 minutes) or more than 3 hours before bed.</w:t>
       </w:r>
     </w:p>
     <w:p>

</xml_diff>

<commit_message>
Update prd-2.md audit to the 18:00 version (1.75-hour fix)
Co-Authored-By: Claude Opus 5.5 <noreply@anthropic.com>
</commit_message>
<xml_diff>
--- a/07_DietGroceryApp/strategy/spec-audit-UPDATED.docx
+++ b/07_DietGroceryApp/strategy/spec-audit-UPDATED.docx
@@ -18,7 +18,7 @@
         <w:t xml:space="preserve">Prepared:</w:t>
       </w:r>
       <w:r>
-        <w:t xml:space="preserve"> October 20, 2026 (written against the 17:58 version of prd-2.md)</w:t>
+        <w:t xml:space="preserve"> October 20, 2026 (written against the 18:00 version of prd-2.md)</w:t>
       </w:r>
     </w:p>
     <w:p>
@@ -2444,7 +2444,7 @@
         </w:pBdr>
       </w:pPr>
       <w:r>
-        <w:t xml:space="preserve">The app will also provide a user a Daily Health Score, that will be aggregated on the app based on their End of Daily Confirmation Audit. The Daily Health Score contains several metrics to average the users health score according: (1) the amount of food eaten compared to daily recipe meal chosen, or restaurant meal chosen (#7 or #11 in CORE USER Story) (scored out of 50), (2) the amount of workout time actually worked out compared to the daily workout plan chosen (#17 in CORE USER Story) (scored out of 30), and (3) whether a user ate their last meal 3 hours before bed time (#10 in CORE USER Story) (scored out of 20). The health score can be used by the user to track daily, weekly, monthly goals based how well the user has been able to stick to using the app. The app will give a user a Daily Health Score everyday after the End of Day Audit. The user can then compare that score with other users of the app, either against the Top 10% of users, or family and/or friends also using the app who the user shares the data with in a family and/or friend group. The Daily Health Score aggregates the data on a daily, weekly, and monthly basis. Scoring for the Daily Health Score, is given by partial credit based on the confirmations by the user saying “yes” if they kept to their daily plan. Each of the 6 meals and snacks earns a share of the 50 points for a normal user. For GLP-1 user or intermittent fasting user, each of the 3 meals and 0 snacks earns a share of the 50 points. A user can recalibrate to more or less meals than the 6 meals (3 meals and 3 snacks), and the scoring will recalibrate based on the total meals (meals and snacks) chosen for the day. For scoring the workout points, each cardio session, and workout session earns a share of the 30 points. For scoring the eating the last meal 3 hours before bed time, if the user eats 3 hours before bed time they earn all 20 points, if the user eats 2.75 hours before bed time they earn 17.5 points, if the user eats 2.5 hours before bed time they earn 15 points, if the user eats 2.25 hours before bed time they earn 12.5 points, if the user eats 2 hours before bed time they earn 10 points, if the user eats 2.75 hours before bed time they earn 7.5 points, if the user eats 1.5 hours before bed they earn 5 points, if the user eats 1.25 hours before bed time they earn 2.5 points, if the user eats 1 hour before bed they earn 0 points, if the user eats less than 1 hour before bed they earn 0 points.</w:t>
+        <w:t xml:space="preserve">The app will also provide a user a Daily Health Score, that will be aggregated on the app based on their End of Daily Confirmation Audit. The Daily Health Score contains several metrics to average the users health score according: (1) the amount of food eaten compared to daily recipe meal chosen, or restaurant meal chosen (#7 or #11 in CORE USER Story) (scored out of 50), (2) the amount of workout time actually worked out compared to the daily workout plan chosen (#17 in CORE USER Story) (scored out of 30), and (3) whether a user ate their last meal 3 hours before bed time (#10 in CORE USER Story) (scored out of 20). The health score can be used by the user to track daily, weekly, monthly goals based how well the user has been able to stick to using the app. The app will give a user a Daily Health Score everyday after the End of Day Audit. The user can then compare that score with other users of the app, either against the Top 10% of users, or family and/or friends also using the app who the user shares the data with in a family and/or friend group. The Daily Health Score aggregates the data on a daily, weekly, and monthly basis. Scoring for the Daily Health Score, is given by partial credit based on the confirmations by the user saying “yes” if they kept to their daily plan. Each of the 6 meals and snacks earns a share of the 50 points for a normal user. For GLP-1 user or intermittent fasting user, each of the 3 meals and 0 snacks earns a share of the 50 points. A user can recalibrate to more or less meals than the 6 meals (3 meals and 3 snacks), and the scoring will recalibrate based on the total meals (meals and snacks) chosen for the day. For scoring the workout points, each cardio session, and workout session earns a share of the 30 points. For scoring the eating the last meal 3 hours before bed time, if the user eats 3 hours before bed time they earn all 20 points, if the user eats 2.75 hours before bed time they earn 17.5 points, if the user eats 2.5 hours before bed time they earn 15 points, if the user eats 2.25 hours before bed time they earn 12.5 points, if the user eats 2 hours before bed time they earn 10 points, if the user eats 1.75 hours before bed time they earn 7.5 points, if the user eats 1.5 hours before bed they earn 5 points, if the user eats 1.25 hours before bed time they earn 2.5 points, if the user eats 1 hour before bed they earn 0 points, if the user eats less than 1 hour before bed they earn 0 points.</w:t>
       </w:r>
     </w:p>
     <w:p>
@@ -2562,7 +2562,20 @@
               <w:rPr>
                 <w:sz w:val="18"/>
               </w:rPr>
-              <w:t xml:space="preserve"> "For scoring the eating the last meal 3 hours before bed time, if the user eats 3 hours before bed time they earn all 20 points, if the user eats 2.75 hours before bed time they earn 17.5 points, if the user eats 2.5 hours before bed time they earn 15 points, if the user eats 2.25 hours before bed time they earn 12.5 points, if the user eats 2 hours before bed time they earn 10 points, if the user eats 2.75 hours before bed time they earn 7.5 points, if the user eats 1.5 hours before bed they earn 5 points, if the user eats 1.25 hours before bed time they earn 2.5 points, if the user eats 1 hour before bed they earn 0 points, if the user eats less than 1 hour before bed they earn 0 points." The list gives 2.75 hours twice, once at 17.5 points and once at 7.5 points, and doesn't list 1.75 hours. </w:t>
+              <w:t xml:space="preserve"> "For scoring the eating the last meal 3 hours before bed time, if the user eats 3 hours before bed time they earn all 20 points, if the user eats 2.75 hours before bed time they earn 17.5 points, if the user eats 2.5 hours before bed time they earn 15 points, if the user eats 2.25 hours before bed time they earn 12.5 points, if the user eats 2 hours before bed time they earn 10 points, if the user eats 1.75 hours before bed time they earn 7.5 points, if the user eats 1.5 hours before bed they earn 5 points, if the user eats 1.25 hours before bed time they earn 2.5 points, if the user eats 1 hour before bed they earn 0 points, if the user eats less than 1 hour before bed they earn 0 points." </w:t>
+            </w:r>
+            <w:r>
+              <w:rPr>
+                <w:b/>
+                <w:sz w:val="18"/>
+              </w:rPr>
+              <w:t xml:space="preserve">[INFERRED]</w:t>
+            </w:r>
+            <w:r>
+              <w:rPr>
+                <w:sz w:val="18"/>
+              </w:rPr>
+              <w:t xml:space="preserve"> That steps down 2.5 points for every quarter hour later than 3 hours before bed. </w:t>
             </w:r>
             <w:r>
               <w:rPr>
@@ -4835,17 +4848,6 @@
           <w:b/>
         </w:rPr>
         <w:t xml:space="preserve">Where the work happens (2)</w:t>
-      </w:r>
-    </w:p>
-    <w:p>
-      <w:pPr>
-        <w:numPr>
-          <w:ilvl w:val="0"/>
-          <w:numId w:val="1"/>
-        </w:numPr>
-      </w:pPr>
-      <w:r>
-        <w:t xml:space="preserve">What a user scores on part (3) at 2.75 hours before bed: the list gives both "17.5 points" and "7.5 points." It gives no score for 1.75 hours.</w:t>
       </w:r>
     </w:p>
     <w:p>

</xml_diff>

<commit_message>
Update prd-2.md audit to the 18:05 version (bedtime ranges)
Flags two overlapping ranges: exactly 3.0 hours and 2.25-2.49 hours.

Co-Authored-By: Claude Opus 5.5 <noreply@anthropic.com>
</commit_message>
<xml_diff>
--- a/07_DietGroceryApp/strategy/spec-audit-UPDATED.docx
+++ b/07_DietGroceryApp/strategy/spec-audit-UPDATED.docx
@@ -18,7 +18,7 @@
         <w:t xml:space="preserve">Prepared:</w:t>
       </w:r>
       <w:r>
-        <w:t xml:space="preserve"> October 20, 2026 (written against the 18:00 version of prd-2.md)</w:t>
+        <w:t xml:space="preserve"> October 20, 2026 (written against the 18:05 version of prd-2.md)</w:t>
       </w:r>
     </w:p>
     <w:p>
@@ -2444,7 +2444,7 @@
         </w:pBdr>
       </w:pPr>
       <w:r>
-        <w:t xml:space="preserve">The app will also provide a user a Daily Health Score, that will be aggregated on the app based on their End of Daily Confirmation Audit. The Daily Health Score contains several metrics to average the users health score according: (1) the amount of food eaten compared to daily recipe meal chosen, or restaurant meal chosen (#7 or #11 in CORE USER Story) (scored out of 50), (2) the amount of workout time actually worked out compared to the daily workout plan chosen (#17 in CORE USER Story) (scored out of 30), and (3) whether a user ate their last meal 3 hours before bed time (#10 in CORE USER Story) (scored out of 20). The health score can be used by the user to track daily, weekly, monthly goals based how well the user has been able to stick to using the app. The app will give a user a Daily Health Score everyday after the End of Day Audit. The user can then compare that score with other users of the app, either against the Top 10% of users, or family and/or friends also using the app who the user shares the data with in a family and/or friend group. The Daily Health Score aggregates the data on a daily, weekly, and monthly basis. Scoring for the Daily Health Score, is given by partial credit based on the confirmations by the user saying “yes” if they kept to their daily plan. Each of the 6 meals and snacks earns a share of the 50 points for a normal user. For GLP-1 user or intermittent fasting user, each of the 3 meals and 0 snacks earns a share of the 50 points. A user can recalibrate to more or less meals than the 6 meals (3 meals and 3 snacks), and the scoring will recalibrate based on the total meals (meals and snacks) chosen for the day. For scoring the workout points, each cardio session, and workout session earns a share of the 30 points. For scoring the eating the last meal 3 hours before bed time, if the user eats 3 hours before bed time they earn all 20 points, if the user eats 2.75 hours before bed time they earn 17.5 points, if the user eats 2.5 hours before bed time they earn 15 points, if the user eats 2.25 hours before bed time they earn 12.5 points, if the user eats 2 hours before bed time they earn 10 points, if the user eats 1.75 hours before bed time they earn 7.5 points, if the user eats 1.5 hours before bed they earn 5 points, if the user eats 1.25 hours before bed time they earn 2.5 points, if the user eats 1 hour before bed they earn 0 points, if the user eats less than 1 hour before bed they earn 0 points.</w:t>
+        <w:t xml:space="preserve">The app will also provide a user a Daily Health Score, that will be aggregated on the app based on their End of Daily Confirmation Audit. The Daily Health Score contains several metrics to average the users health score according: (1) the amount of food eaten compared to daily recipe meal chosen, or restaurant meal chosen (#7 or #11 in CORE USER Story) (scored out of 50), (2) the amount of workout time actually worked out compared to the daily workout plan chosen (#17 in CORE USER Story) (scored out of 30), and (3) whether a user ate their last meal 3 hours before bed time (#10 in CORE USER Story) (scored out of 20). The health score can be used by the user to track daily, weekly, monthly goals based how well the user has been able to stick to using the app. The app will give a user a Daily Health Score everyday after the End of Day Audit. The user can then compare that score with other users of the app, either against the Top 10% of users, or family and/or friends also using the app who the user shares the data with in a family and/or friend group. The Daily Health Score aggregates the data on a daily, weekly, and monthly basis. Scoring for the Daily Health Score, is given by partial credit based on the confirmations by the user saying “yes” if they kept to their daily plan. Each of the 6 meals and snacks earns a share of the 50 points for a normal user. For GLP-1 user or intermittent fasting user, each of the 3 meals and 0 snacks earns a share of the 50 points. A user can recalibrate to more or less meals than the 6 meals (3 meals and 3 snacks), and the scoring will recalibrate based on the total meals (meals and snacks) chosen for the day. For scoring the workout points, each cardio session, and workout session earns a share of the 30 points. For scoring the eating the last meal 3 hours before bed time, if the user eats 3 hours before bed time (or earlier) they earn all 20 points, if the user eats 3.0 to 2.75 hours before bed time they earn 17.5 points, if the user eats 2.74 to 2.5 hours before bed time they earn 15 points, if the user eats 2.49 to 2.25 hours before bed time they earn 12.5 points, if the user eats 2.49 to 2.0 hours before bed time they earn 10 points, if the user eats 1.99 to 1.75 hours before bed time they earn 7.5 points, if the user eats 1.74 to 1.5 hours before bed they earn 5 points, if the user eats 1.49 to 1.25 hours before bed time they earn 2.5 points, if the user eats 1.24 to 1 hour before bed they earn 0 points, if the user eats less than 1 hour before bed they earn 0 points.</w:t>
       </w:r>
     </w:p>
     <w:p>
@@ -2562,20 +2562,7 @@
               <w:rPr>
                 <w:sz w:val="18"/>
               </w:rPr>
-              <w:t xml:space="preserve"> "For scoring the eating the last meal 3 hours before bed time, if the user eats 3 hours before bed time they earn all 20 points, if the user eats 2.75 hours before bed time they earn 17.5 points, if the user eats 2.5 hours before bed time they earn 15 points, if the user eats 2.25 hours before bed time they earn 12.5 points, if the user eats 2 hours before bed time they earn 10 points, if the user eats 1.75 hours before bed time they earn 7.5 points, if the user eats 1.5 hours before bed they earn 5 points, if the user eats 1.25 hours before bed time they earn 2.5 points, if the user eats 1 hour before bed they earn 0 points, if the user eats less than 1 hour before bed they earn 0 points." </w:t>
-            </w:r>
-            <w:r>
-              <w:rPr>
-                <w:b/>
-                <w:sz w:val="18"/>
-              </w:rPr>
-              <w:t xml:space="preserve">[INFERRED]</w:t>
-            </w:r>
-            <w:r>
-              <w:rPr>
-                <w:sz w:val="18"/>
-              </w:rPr>
-              <w:t xml:space="preserve"> That steps down 2.5 points for every quarter hour later than 3 hours before bed. </w:t>
+              <w:t xml:space="preserve"> "For scoring the eating the last meal 3 hours before bed time, if the user eats 3 hours before bed time (or earlier) they earn all 20 points, if the user eats 3.0 to 2.75 hours before bed time they earn 17.5 points, if the user eats 2.74 to 2.5 hours before bed time they earn 15 points, if the user eats 2.49 to 2.25 hours before bed time they earn 12.5 points, if the user eats 2.49 to 2.0 hours before bed time they earn 10 points, if the user eats 1.99 to 1.75 hours before bed time they earn 7.5 points, if the user eats 1.74 to 1.5 hours before bed they earn 5 points, if the user eats 1.49 to 1.25 hours before bed time they earn 2.5 points, if the user eats 1.24 to 1 hour before bed they earn 0 points, if the user eats less than 1 hour before bed they earn 0 points." Two ranges overlap as written: exactly 3.0 hours falls under both "3 hours before bed time (or earlier)" (20 points) and "3.0 to 2.75" (17.5 points), and 2.25 to 2.49 hours falls under both "2.49 to 2.25" (12.5 points) and "2.49 to 2.0" (10 points). </w:t>
             </w:r>
             <w:r>
               <w:rPr>
@@ -4858,7 +4845,18 @@
         </w:numPr>
       </w:pPr>
       <w:r>
-        <w:t xml:space="preserve">What a user scores on part (3) for times between the quarter-hour marks (for example 2 hours 40 minutes) or more than 3 hours before bed.</w:t>
+        <w:t xml:space="preserve">What a user scores on part (3) at exactly 3.0 hours before bed: 20 points ("3 hours before bed time (or earlier)") or 17.5 points ("3.0 to 2.75").</w:t>
+      </w:r>
+    </w:p>
+    <w:p>
+      <w:pPr>
+        <w:numPr>
+          <w:ilvl w:val="0"/>
+          <w:numId w:val="1"/>
+        </w:numPr>
+      </w:pPr>
+      <w:r>
+        <w:t xml:space="preserve">What a user scores on part (3) between 2.25 and 2.49 hours before bed: 12.5 points ("2.49 to 2.25") or 10 points ("2.49 to 2.0").</w:t>
       </w:r>
     </w:p>
     <w:p>

</xml_diff>

<commit_message>
Update prd-2.md audit to the 18:10 version (bedtime ranges fixed)
Overlaps resolved; flags the uncovered 2.9-3.0 hour band.

Co-Authored-By: Claude Opus 5.5 <noreply@anthropic.com>
</commit_message>
<xml_diff>
--- a/07_DietGroceryApp/strategy/spec-audit-UPDATED.docx
+++ b/07_DietGroceryApp/strategy/spec-audit-UPDATED.docx
@@ -18,7 +18,7 @@
         <w:t xml:space="preserve">Prepared:</w:t>
       </w:r>
       <w:r>
-        <w:t xml:space="preserve"> October 20, 2026 (written against the 18:05 version of prd-2.md)</w:t>
+        <w:t xml:space="preserve"> October 20, 2026 (written against the 18:10 version of prd-2.md)</w:t>
       </w:r>
     </w:p>
     <w:p>
@@ -2444,7 +2444,7 @@
         </w:pBdr>
       </w:pPr>
       <w:r>
-        <w:t xml:space="preserve">The app will also provide a user a Daily Health Score, that will be aggregated on the app based on their End of Daily Confirmation Audit. The Daily Health Score contains several metrics to average the users health score according: (1) the amount of food eaten compared to daily recipe meal chosen, or restaurant meal chosen (#7 or #11 in CORE USER Story) (scored out of 50), (2) the amount of workout time actually worked out compared to the daily workout plan chosen (#17 in CORE USER Story) (scored out of 30), and (3) whether a user ate their last meal 3 hours before bed time (#10 in CORE USER Story) (scored out of 20). The health score can be used by the user to track daily, weekly, monthly goals based how well the user has been able to stick to using the app. The app will give a user a Daily Health Score everyday after the End of Day Audit. The user can then compare that score with other users of the app, either against the Top 10% of users, or family and/or friends also using the app who the user shares the data with in a family and/or friend group. The Daily Health Score aggregates the data on a daily, weekly, and monthly basis. Scoring for the Daily Health Score, is given by partial credit based on the confirmations by the user saying “yes” if they kept to their daily plan. Each of the 6 meals and snacks earns a share of the 50 points for a normal user. For GLP-1 user or intermittent fasting user, each of the 3 meals and 0 snacks earns a share of the 50 points. A user can recalibrate to more or less meals than the 6 meals (3 meals and 3 snacks), and the scoring will recalibrate based on the total meals (meals and snacks) chosen for the day. For scoring the workout points, each cardio session, and workout session earns a share of the 30 points. For scoring the eating the last meal 3 hours before bed time, if the user eats 3 hours before bed time (or earlier) they earn all 20 points, if the user eats 3.0 to 2.75 hours before bed time they earn 17.5 points, if the user eats 2.74 to 2.5 hours before bed time they earn 15 points, if the user eats 2.49 to 2.25 hours before bed time they earn 12.5 points, if the user eats 2.49 to 2.0 hours before bed time they earn 10 points, if the user eats 1.99 to 1.75 hours before bed time they earn 7.5 points, if the user eats 1.74 to 1.5 hours before bed they earn 5 points, if the user eats 1.49 to 1.25 hours before bed time they earn 2.5 points, if the user eats 1.24 to 1 hour before bed they earn 0 points, if the user eats less than 1 hour before bed they earn 0 points.</w:t>
+        <w:t xml:space="preserve">The app will also provide a user a Daily Health Score, that will be aggregated on the app based on their End of Daily Confirmation Audit. The Daily Health Score contains several metrics to average the users health score according: (1) the amount of food eaten compared to daily recipe meal chosen, or restaurant meal chosen (#7 or #11 in CORE USER Story) (scored out of 50), (2) the amount of workout time actually worked out compared to the daily workout plan chosen (#17 in CORE USER Story) (scored out of 30), and (3) whether a user ate their last meal 3 hours before bed time (#10 in CORE USER Story) (scored out of 20). The health score can be used by the user to track daily, weekly, monthly goals based how well the user has been able to stick to using the app. The app will give a user a Daily Health Score everyday after the End of Day Audit. The user can then compare that score with other users of the app, either against the Top 10% of users, or family and/or friends also using the app who the user shares the data with in a family and/or friend group. The Daily Health Score aggregates the data on a daily, weekly, and monthly basis. Scoring for the Daily Health Score, is given by partial credit based on the confirmations by the user saying “yes” if they kept to their daily plan. Each of the 6 meals and snacks earns a share of the 50 points for a normal user. For GLP-1 user or intermittent fasting user, each of the 3 meals and 0 snacks earns a share of the 50 points. A user can recalibrate to more or less meals than the 6 meals (3 meals and 3 snacks), and the scoring will recalibrate based on the total meals (meals and snacks) chosen for the day. For scoring the workout points, each cardio session, and workout session earns a share of the 30 points. For scoring the eating the last meal 3 hours before bed time, if the user eats 3 hours before bed time (or earlier) they earn all 20 points, if the user eats 2.9 to 2.75 hours before bed time they earn 17.5 points, if the user eats 2.74 to 2.5 hours before bed time they earn 15 points, if the user eats 2.49 to 2.25 hours before bed time they earn 12.5 points, if the user eats 2.24 to 2.0 hours before bed time they earn 10 points, if the user eats 1.99 to 1.75 hours before bed time they earn 7.5 points, if the user eats 1.74 to 1.5 hours before bed they earn 5 points, if the user eats 1.49 to 1.25 hours before bed time they earn 2.5 points, if the user eats 1.24 to 1 hour before bed they earn 0 points, if the user eats less than 1 hour before bed they earn 0 points.</w:t>
       </w:r>
     </w:p>
     <w:p>
@@ -2562,7 +2562,7 @@
               <w:rPr>
                 <w:sz w:val="18"/>
               </w:rPr>
-              <w:t xml:space="preserve"> "For scoring the eating the last meal 3 hours before bed time, if the user eats 3 hours before bed time (or earlier) they earn all 20 points, if the user eats 3.0 to 2.75 hours before bed time they earn 17.5 points, if the user eats 2.74 to 2.5 hours before bed time they earn 15 points, if the user eats 2.49 to 2.25 hours before bed time they earn 12.5 points, if the user eats 2.49 to 2.0 hours before bed time they earn 10 points, if the user eats 1.99 to 1.75 hours before bed time they earn 7.5 points, if the user eats 1.74 to 1.5 hours before bed they earn 5 points, if the user eats 1.49 to 1.25 hours before bed time they earn 2.5 points, if the user eats 1.24 to 1 hour before bed they earn 0 points, if the user eats less than 1 hour before bed they earn 0 points." Two ranges overlap as written: exactly 3.0 hours falls under both "3 hours before bed time (or earlier)" (20 points) and "3.0 to 2.75" (17.5 points), and 2.25 to 2.49 hours falls under both "2.49 to 2.25" (12.5 points) and "2.49 to 2.0" (10 points). </w:t>
+              <w:t xml:space="preserve"> "For scoring the eating the last meal 3 hours before bed time, if the user eats 3 hours before bed time (or earlier) they earn all 20 points, if the user eats 2.9 to 2.75 hours before bed time they earn 17.5 points, if the user eats 2.74 to 2.5 hours before bed time they earn 15 points, if the user eats 2.49 to 2.25 hours before bed time they earn 12.5 points, if the user eats 2.24 to 2.0 hours before bed time they earn 10 points, if the user eats 1.99 to 1.75 hours before bed time they earn 7.5 points, if the user eats 1.74 to 1.5 hours before bed they earn 5 points, if the user eats 1.49 to 1.25 hours before bed time they earn 2.5 points, if the user eats 1.24 to 1 hour before bed they earn 0 points, if the user eats less than 1 hour before bed they earn 0 points." The ranges no longer overlap. Between "3 hours before bed time (or earlier)" and "2.9 to 2.75," times from 2.9 to 3.0 hours aren't covered. </w:t>
             </w:r>
             <w:r>
               <w:rPr>
@@ -4845,18 +4845,7 @@
         </w:numPr>
       </w:pPr>
       <w:r>
-        <w:t xml:space="preserve">What a user scores on part (3) at exactly 3.0 hours before bed: 20 points ("3 hours before bed time (or earlier)") or 17.5 points ("3.0 to 2.75").</w:t>
-      </w:r>
-    </w:p>
-    <w:p>
-      <w:pPr>
-        <w:numPr>
-          <w:ilvl w:val="0"/>
-          <w:numId w:val="1"/>
-        </w:numPr>
-      </w:pPr>
-      <w:r>
-        <w:t xml:space="preserve">What a user scores on part (3) between 2.25 and 2.49 hours before bed: 12.5 points ("2.49 to 2.25") or 10 points ("2.49 to 2.0").</w:t>
+        <w:t xml:space="preserve">What a user scores on part (3) for a last meal between 2.9 and 3.0 hours before bed (about 2 hours 54 minutes to just under 3 hours). The bands jump from "3 hours before bed time (or earlier)" to "2.9 to 2.75."</w:t>
       </w:r>
     </w:p>
     <w:p>

</xml_diff>

<commit_message>
Update prd-2.md audit to the 18:13 version (bedtime bands complete)
Co-Authored-By: Claude Opus 5.5 <noreply@anthropic.com>
</commit_message>
<xml_diff>
--- a/07_DietGroceryApp/strategy/spec-audit-UPDATED.docx
+++ b/07_DietGroceryApp/strategy/spec-audit-UPDATED.docx
@@ -18,7 +18,7 @@
         <w:t xml:space="preserve">Prepared:</w:t>
       </w:r>
       <w:r>
-        <w:t xml:space="preserve"> October 20, 2026 (written against the 18:10 version of prd-2.md)</w:t>
+        <w:t xml:space="preserve"> October 20, 2026 (written against the 18:13 version of prd-2.md)</w:t>
       </w:r>
     </w:p>
     <w:p>
@@ -2444,7 +2444,26 @@
         </w:pBdr>
       </w:pPr>
       <w:r>
-        <w:t xml:space="preserve">The app will also provide a user a Daily Health Score, that will be aggregated on the app based on their End of Daily Confirmation Audit. The Daily Health Score contains several metrics to average the users health score according: (1) the amount of food eaten compared to daily recipe meal chosen, or restaurant meal chosen (#7 or #11 in CORE USER Story) (scored out of 50), (2) the amount of workout time actually worked out compared to the daily workout plan chosen (#17 in CORE USER Story) (scored out of 30), and (3) whether a user ate their last meal 3 hours before bed time (#10 in CORE USER Story) (scored out of 20). The health score can be used by the user to track daily, weekly, monthly goals based how well the user has been able to stick to using the app. The app will give a user a Daily Health Score everyday after the End of Day Audit. The user can then compare that score with other users of the app, either against the Top 10% of users, or family and/or friends also using the app who the user shares the data with in a family and/or friend group. The Daily Health Score aggregates the data on a daily, weekly, and monthly basis. Scoring for the Daily Health Score, is given by partial credit based on the confirmations by the user saying “yes” if they kept to their daily plan. Each of the 6 meals and snacks earns a share of the 50 points for a normal user. For GLP-1 user or intermittent fasting user, each of the 3 meals and 0 snacks earns a share of the 50 points. A user can recalibrate to more or less meals than the 6 meals (3 meals and 3 snacks), and the scoring will recalibrate based on the total meals (meals and snacks) chosen for the day. For scoring the workout points, each cardio session, and workout session earns a share of the 30 points. For scoring the eating the last meal 3 hours before bed time, if the user eats 3 hours before bed time (or earlier) they earn all 20 points, if the user eats 2.9 to 2.75 hours before bed time they earn 17.5 points, if the user eats 2.74 to 2.5 hours before bed time they earn 15 points, if the user eats 2.49 to 2.25 hours before bed time they earn 12.5 points, if the user eats 2.24 to 2.0 hours before bed time they earn 10 points, if the user eats 1.99 to 1.75 hours before bed time they earn 7.5 points, if the user eats 1.74 to 1.5 hours before bed they earn 5 points, if the user eats 1.49 to 1.25 hours before bed time they earn 2.5 points, if the user eats 1.24 to 1 hour before bed they earn 0 points, if the user eats less than 1 hour before bed they earn 0 points.</w:t>
+        <w:t xml:space="preserve">The app will also provide a user a Daily Health Score, that will be aggregated on the app based on their End of Daily Confirmation Audit. The Daily Health Score contains several metrics to average the users health score according: (1) the amount of food eaten compared to daily recipe meal chosen, or restaurant meal chosen (#7 or #11 in CORE USER Story) (scored out of 50), (2) the amount of workout time actually worked out compared to the daily workout plan chosen (#17 in CORE USER Story) (scored out of 30), and (3) whether a user ate their last meal 3 hours before bed time (#10 in CORE USER Story) (scored out of 20). The health score can be used by the user to track daily, weekly, monthly goals based how well the user has been able to stick to using the app. The app will give a user a Daily Health Score everyday after the End of Day Audit. The user can then compare that score with other users of the app, either against the Top 10% of users, or family and/or friends also using the app who the user shares the data with in a family and/or friend group. The Daily Health Score aggregates the data on a daily, weekly, and monthly basis. Scoring for the Daily Health Score, is given by partial credit based on the confirmations by the user saying “yes” if they kept to their daily plan. Each of the 6 meals and snacks earns a share of the 50 points for a normal user. For GLP-1 user or intermittent fasting user, each of the 3 meals and 0 snacks earns a share of the 50 points. A user can recalibrate to more or less meals than the 6 meals (3 meals and 3 snacks), and the scoring will recalibrate based on the total meals (meals and snacks) chosen for the day. For scoring the workout points, each cardio session, and workout session earns a share of the 30 points.</w:t>
+      </w:r>
+    </w:p>
+    <w:p>
+      <w:pPr>
+        <w:ind w:left="360"/>
+        <w:pBdr>
+          <w:left w:val="single" w:sz="18" w:space="8" w:color="9AA0A6"/>
+        </w:pBdr>
+      </w:pPr>
+    </w:p>
+    <w:p>
+      <w:pPr>
+        <w:ind w:left="360"/>
+        <w:pBdr>
+          <w:left w:val="single" w:sz="18" w:space="8" w:color="9AA0A6"/>
+        </w:pBdr>
+      </w:pPr>
+      <w:r>
+        <w:t xml:space="preserve">For scoring the eating the last meal 3 hours before bed time, if the user eats 3 hours before bed time (or earlier) they earn all 20 points, if the user eats 3 to 2.91 hours before bed time (or earlier) they earn all 20 points, if the user eats 2.9 to 2.75 hours before bed time they earn 17.5 points, if the user eats 2.74 to 2.5 hours before bed time they earn 15 points, if the user eats 2.49 to 2.25 hours before bed time they earn 12.5 points, if the user eats 2.24 to 2.0 hours before bed time they earn 10 points, if the user eats 1.99 to 1.75 hours before bed time they earn 7.5 points, if the user eats 1.74 to 1.5 hours before bed they earn 5 points, if the user eats 1.49 to 1.25 hours before bed time they earn 2.5 points, if the user eats 1.24 to 1 hour before bed they earn 0 points, if the user eats less than 1 hour before bed they earn 0 points.</w:t>
       </w:r>
     </w:p>
     <w:p>
@@ -2562,7 +2581,7 @@
               <w:rPr>
                 <w:sz w:val="18"/>
               </w:rPr>
-              <w:t xml:space="preserve"> "For scoring the eating the last meal 3 hours before bed time, if the user eats 3 hours before bed time (or earlier) they earn all 20 points, if the user eats 2.9 to 2.75 hours before bed time they earn 17.5 points, if the user eats 2.74 to 2.5 hours before bed time they earn 15 points, if the user eats 2.49 to 2.25 hours before bed time they earn 12.5 points, if the user eats 2.24 to 2.0 hours before bed time they earn 10 points, if the user eats 1.99 to 1.75 hours before bed time they earn 7.5 points, if the user eats 1.74 to 1.5 hours before bed they earn 5 points, if the user eats 1.49 to 1.25 hours before bed time they earn 2.5 points, if the user eats 1.24 to 1 hour before bed they earn 0 points, if the user eats less than 1 hour before bed they earn 0 points." The ranges no longer overlap. Between "3 hours before bed time (or earlier)" and "2.9 to 2.75," times from 2.9 to 3.0 hours aren't covered. </w:t>
+              <w:t xml:space="preserve"> "For scoring the eating the last meal 3 hours before bed time, if the user eats 3 hours before bed time (or earlier) they earn all 20 points, if the user eats 3 to 2.91 hours before bed time (or earlier) they earn all 20 points, if the user eats 2.9 to 2.75 hours before bed time they earn 17.5 points, if the user eats 2.74 to 2.5 hours before bed time they earn 15 points, if the user eats 2.49 to 2.25 hours before bed time they earn 12.5 points, if the user eats 2.24 to 2.0 hours before bed time they earn 10 points, if the user eats 1.99 to 1.75 hours before bed time they earn 7.5 points, if the user eats 1.74 to 1.5 hours before bed they earn 5 points, if the user eats 1.49 to 1.25 hours before bed time they earn 2.5 points, if the user eats 1.24 to 1 hour before bed they earn 0 points, if the user eats less than 1 hour before bed they earn 0 points." The bands now run without overlaps or holes from "3 hours before bed time (or earlier)" down to "less than 1 hour." The PRD lists the 20-point band twice: "3 hours before bed time (or earlier)" and "3 to 2.91 hours before bed time (or earlier)." </w:t>
             </w:r>
             <w:r>
               <w:rPr>
@@ -4845,7 +4864,7 @@
         </w:numPr>
       </w:pPr>
       <w:r>
-        <w:t xml:space="preserve">What a user scores on part (3) for a last meal between 2.9 and 3.0 hours before bed (about 2 hours 54 minutes to just under 3 hours). The bands jump from "3 hours before bed time (or earlier)" to "2.9 to 2.75."</w:t>
+        <w:t xml:space="preserve">None found in this version.</w:t>
       </w:r>
     </w:p>
     <w:p>

</xml_diff>